<commit_message>
Improve lab 1 report generation
</commit_message>
<xml_diff>
--- a/reports/lr1/Звіт_ЛР1_Коновалов_ПЗПІ-25-6.docx
+++ b/reports/lr1/Звіт_ЛР1_Коновалов_ПЗПІ-25-6.docx
@@ -457,7 +457,7 @@
     </w:p>
     <w:p>
       <w:pPr>
-        <w:spacing w:after="0" w:line="360" w:lineRule="auto"/>
+        <w:spacing w:after="0" w:before="0" w:line="360" w:lineRule="auto"/>
         <w:ind w:firstLine="709"/>
         <w:jc w:val="both"/>
       </w:pPr>
@@ -488,7 +488,7 @@
     </w:p>
     <w:p>
       <w:pPr>
-        <w:spacing w:after="0" w:line="360" w:lineRule="auto"/>
+        <w:spacing w:after="0" w:before="0" w:line="360" w:lineRule="auto"/>
         <w:ind w:firstLine="709"/>
         <w:jc w:val="both"/>
       </w:pPr>
@@ -536,7 +536,7 @@
     </w:p>
     <w:p>
       <w:pPr>
-        <w:spacing w:after="0" w:line="360" w:lineRule="auto"/>
+        <w:spacing w:after="0" w:before="0" w:line="360" w:lineRule="auto"/>
         <w:ind w:firstLine="709"/>
         <w:jc w:val="both"/>
       </w:pPr>
@@ -547,6 +547,21 @@
           <w:szCs w:val="28"/>
         </w:rPr>
         <w:t xml:space="preserve">Нижче наведено псевдокод трьох алгоритмів пошуку, які порівнюються у цій лабораторній роботі.</w:t>
+      </w:r>
+    </w:p>
+    <w:p>
+      <w:pPr>
+        <w:spacing w:after="0" w:before="0" w:line="360" w:lineRule="auto"/>
+        <w:ind w:firstLine="709"/>
+        <w:jc w:val="both"/>
+      </w:pPr>
+      <w:r>
+        <w:rPr>
+          <w:rFonts w:ascii="Times New Roman" w:cs="Times New Roman" w:eastAsia="Times New Roman" w:hAnsi="Times New Roman"/>
+          <w:sz w:val="28"/>
+          <w:szCs w:val="28"/>
+        </w:rPr>
+        <w:t xml:space="preserve">Двійковий пошук застосовується лише до відсортованого масиву. У програмі вхідний масив формується як послідовність чисел від 0 до n - 1.</w:t>
       </w:r>
     </w:p>
     <w:p>
@@ -870,7 +885,7 @@
     </w:p>
     <w:p>
       <w:pPr>
-        <w:spacing w:after="0" w:line="360" w:lineRule="auto"/>
+        <w:spacing w:after="0" w:before="0" w:line="360" w:lineRule="auto"/>
         <w:ind w:firstLine="709"/>
         <w:jc w:val="both"/>
       </w:pPr>
@@ -885,7 +900,7 @@
     </w:p>
     <w:p>
       <w:pPr>
-        <w:spacing w:after="0" w:line="360" w:lineRule="auto"/>
+        <w:spacing w:after="0" w:before="0" w:line="360" w:lineRule="auto"/>
         <w:ind w:firstLine="709"/>
         <w:jc w:val="both"/>
       </w:pPr>
@@ -934,38 +949,151 @@
           <w:sz w:val="20"/>
           <w:szCs w:val="20"/>
         </w:rPr>
-        <w:t xml:space="preserve">Рядок 3: return -1                — вартість c4, виконується 1 раз</w:t>
-      </w:r>
-    </w:p>
-    <w:p>
-      <w:pPr>
-        <w:spacing w:after="0" w:line="240" w:lineRule="auto"/>
-      </w:pPr>
-      <w:r>
-        <w:rPr>
-          <w:rFonts w:ascii="Courier New" w:cs="Courier New" w:eastAsia="Courier New" w:hAnsi="Courier New"/>
-          <w:sz w:val="20"/>
-          <w:szCs w:val="20"/>
-        </w:rPr>
-        <w:t xml:space="preserve"/>
-      </w:r>
-    </w:p>
-    <w:p>
-      <w:pPr>
-        <w:spacing w:after="0" w:line="240" w:lineRule="auto"/>
-      </w:pPr>
-      <w:r>
-        <w:rPr>
-          <w:rFonts w:ascii="Courier New" w:cs="Courier New" w:eastAsia="Courier New" w:hAnsi="Courier New"/>
-          <w:sz w:val="20"/>
-          <w:szCs w:val="20"/>
-        </w:rPr>
-        <w:t xml:space="preserve">T(n) = c1·n + c2·n + c4 = Θ(n)</w:t>
-      </w:r>
-    </w:p>
-    <w:p>
-      <w:pPr>
-        <w:spacing w:after="0" w:line="360" w:lineRule="auto"/>
+        <w:t xml:space="preserve">Рядок 3: return -1                — вартість c3, виконується 1 раз</w:t>
+      </w:r>
+    </w:p>
+    <w:p>
+      <w:pPr>
+        <w:tabs>
+          <w:tab w:val="center" w:pos="4513"/>
+          <w:tab w:val="right" w:pos="9026"/>
+        </w:tabs>
+        <w:spacing w:after="80" w:before="80" w:line="360" w:lineRule="auto"/>
+      </w:pPr>
+      <w:r>
+        <w:rPr>
+          <w:rFonts w:ascii="Times New Roman" w:cs="Times New Roman" w:eastAsia="Times New Roman" w:hAnsi="Times New Roman"/>
+          <w:sz w:val="28"/>
+          <w:szCs w:val="28"/>
+        </w:rPr>
+        <w:t xml:space="preserve">	</w:t>
+      </w:r>
+      <m:oMath>
+        <m:sSub>
+          <m:sSubPr/>
+          <m:e>
+            <m:r>
+              <m:t>T</m:t>
+            </m:r>
+          </m:e>
+          <m:sub>
+            <m:r>
+              <m:t>л</m:t>
+            </m:r>
+          </m:sub>
+        </m:sSub>
+        <m:r>
+          <m:t>(n) = </m:t>
+        </m:r>
+        <m:sSub>
+          <m:sSubPr/>
+          <m:e>
+            <m:r>
+              <m:t>c</m:t>
+            </m:r>
+          </m:e>
+          <m:sub>
+            <m:r>
+              <m:t>1</m:t>
+            </m:r>
+          </m:sub>
+        </m:sSub>
+        <m:r>
+          <m:t>·n + </m:t>
+        </m:r>
+        <m:sSub>
+          <m:sSubPr/>
+          <m:e>
+            <m:r>
+              <m:t>c</m:t>
+            </m:r>
+          </m:e>
+          <m:sub>
+            <m:r>
+              <m:t>2</m:t>
+            </m:r>
+          </m:sub>
+        </m:sSub>
+        <m:r>
+          <m:t>·n + </m:t>
+        </m:r>
+        <m:sSub>
+          <m:sSubPr/>
+          <m:e>
+            <m:r>
+              <m:t>c</m:t>
+            </m:r>
+          </m:e>
+          <m:sub>
+            <m:r>
+              <m:t>3</m:t>
+            </m:r>
+          </m:sub>
+        </m:sSub>
+        <m:r>
+          <m:t> = (</m:t>
+        </m:r>
+        <m:sSub>
+          <m:sSubPr/>
+          <m:e>
+            <m:r>
+              <m:t>c</m:t>
+            </m:r>
+          </m:e>
+          <m:sub>
+            <m:r>
+              <m:t>1</m:t>
+            </m:r>
+          </m:sub>
+        </m:sSub>
+        <m:r>
+          <m:t> + </m:t>
+        </m:r>
+        <m:sSub>
+          <m:sSubPr/>
+          <m:e>
+            <m:r>
+              <m:t>c</m:t>
+            </m:r>
+          </m:e>
+          <m:sub>
+            <m:r>
+              <m:t>2</m:t>
+            </m:r>
+          </m:sub>
+        </m:sSub>
+        <m:r>
+          <m:t>)·n + </m:t>
+        </m:r>
+        <m:sSub>
+          <m:sSubPr/>
+          <m:e>
+            <m:r>
+              <m:t>c</m:t>
+            </m:r>
+          </m:e>
+          <m:sub>
+            <m:r>
+              <m:t>3</m:t>
+            </m:r>
+          </m:sub>
+        </m:sSub>
+        <m:r>
+          <m:t> = Θ(n)</m:t>
+        </m:r>
+      </m:oMath>
+      <w:r>
+        <w:rPr>
+          <w:rFonts w:ascii="Times New Roman" w:cs="Times New Roman" w:eastAsia="Times New Roman" w:hAnsi="Times New Roman"/>
+          <w:sz w:val="28"/>
+          <w:szCs w:val="28"/>
+        </w:rPr>
+        <w:t xml:space="preserve">	(3.1)</w:t>
+      </w:r>
+    </w:p>
+    <w:p>
+      <w:pPr>
+        <w:spacing w:after="0" w:before="0" w:line="360" w:lineRule="auto"/>
         <w:ind w:firstLine="709"/>
         <w:jc w:val="both"/>
       </w:pPr>
@@ -1001,59 +1129,59 @@
           <w:sz w:val="20"/>
           <w:szCs w:val="20"/>
         </w:rPr>
-        <w:t xml:space="preserve">Рядок 2: while low &lt;= high                — вартість c2, виконується ⌊log₂n⌋+1 разів</w:t>
-      </w:r>
-    </w:p>
-    <w:p>
-      <w:pPr>
-        <w:spacing w:after="0" w:line="240" w:lineRule="auto"/>
-      </w:pPr>
-      <w:r>
-        <w:rPr>
-          <w:rFonts w:ascii="Courier New" w:cs="Courier New" w:eastAsia="Courier New" w:hAnsi="Courier New"/>
-          <w:sz w:val="20"/>
-          <w:szCs w:val="20"/>
-        </w:rPr>
-        <w:t xml:space="preserve">Рядок 3:     mid = floor((low+high)/2)    — вартість c3, виконується ⌊log₂n⌋ разів</w:t>
-      </w:r>
-    </w:p>
-    <w:p>
-      <w:pPr>
-        <w:spacing w:after="0" w:line="240" w:lineRule="auto"/>
-      </w:pPr>
-      <w:r>
-        <w:rPr>
-          <w:rFonts w:ascii="Courier New" w:cs="Courier New" w:eastAsia="Courier New" w:hAnsi="Courier New"/>
-          <w:sz w:val="20"/>
-          <w:szCs w:val="20"/>
-        </w:rPr>
-        <w:t xml:space="preserve">Рядок 4:     if arr[mid] == target         — вартість c4, виконується ⌊log₂n⌋ разів</w:t>
-      </w:r>
-    </w:p>
-    <w:p>
-      <w:pPr>
-        <w:spacing w:after="0" w:line="240" w:lineRule="auto"/>
-      </w:pPr>
-      <w:r>
-        <w:rPr>
-          <w:rFonts w:ascii="Courier New" w:cs="Courier New" w:eastAsia="Courier New" w:hAnsi="Courier New"/>
-          <w:sz w:val="20"/>
-          <w:szCs w:val="20"/>
-        </w:rPr>
-        <w:t xml:space="preserve">Рядок 5:     if arr[mid] &lt; target          — вартість c5, виконується ⌊log₂n⌋ разів</w:t>
-      </w:r>
-    </w:p>
-    <w:p>
-      <w:pPr>
-        <w:spacing w:after="0" w:line="240" w:lineRule="auto"/>
-      </w:pPr>
-      <w:r>
-        <w:rPr>
-          <w:rFonts w:ascii="Courier New" w:cs="Courier New" w:eastAsia="Courier New" w:hAnsi="Courier New"/>
-          <w:sz w:val="20"/>
-          <w:szCs w:val="20"/>
-        </w:rPr>
-        <w:t xml:space="preserve">Рядок 6:         low = mid+1 / high=mid-1  — вартість c6, виконується ⌊log₂n⌋ разів</w:t>
+        <w:t xml:space="preserve">Рядок 2: while low &lt;= high                — вартість c2, виконується k + 1 разів</w:t>
+      </w:r>
+    </w:p>
+    <w:p>
+      <w:pPr>
+        <w:spacing w:after="0" w:line="240" w:lineRule="auto"/>
+      </w:pPr>
+      <w:r>
+        <w:rPr>
+          <w:rFonts w:ascii="Courier New" w:cs="Courier New" w:eastAsia="Courier New" w:hAnsi="Courier New"/>
+          <w:sz w:val="20"/>
+          <w:szCs w:val="20"/>
+        </w:rPr>
+        <w:t xml:space="preserve">Рядок 3:     mid = floor((low+high)/2)    — вартість c3, виконується k разів</w:t>
+      </w:r>
+    </w:p>
+    <w:p>
+      <w:pPr>
+        <w:spacing w:after="0" w:line="240" w:lineRule="auto"/>
+      </w:pPr>
+      <w:r>
+        <w:rPr>
+          <w:rFonts w:ascii="Courier New" w:cs="Courier New" w:eastAsia="Courier New" w:hAnsi="Courier New"/>
+          <w:sz w:val="20"/>
+          <w:szCs w:val="20"/>
+        </w:rPr>
+        <w:t xml:space="preserve">Рядок 4:     if arr[mid] == target         — вартість c4, виконується k разів</w:t>
+      </w:r>
+    </w:p>
+    <w:p>
+      <w:pPr>
+        <w:spacing w:after="0" w:line="240" w:lineRule="auto"/>
+      </w:pPr>
+      <w:r>
+        <w:rPr>
+          <w:rFonts w:ascii="Courier New" w:cs="Courier New" w:eastAsia="Courier New" w:hAnsi="Courier New"/>
+          <w:sz w:val="20"/>
+          <w:szCs w:val="20"/>
+        </w:rPr>
+        <w:t xml:space="preserve">Рядок 5:     if arr[mid] &lt; target          — вартість c5, виконується k разів</w:t>
+      </w:r>
+    </w:p>
+    <w:p>
+      <w:pPr>
+        <w:spacing w:after="0" w:line="240" w:lineRule="auto"/>
+      </w:pPr>
+      <w:r>
+        <w:rPr>
+          <w:rFonts w:ascii="Courier New" w:cs="Courier New" w:eastAsia="Courier New" w:hAnsi="Courier New"/>
+          <w:sz w:val="20"/>
+          <w:szCs w:val="20"/>
+        </w:rPr>
+        <w:t xml:space="preserve">Рядок 6:         low = mid+1 / high=mid-1  — вартість c6, виконується k разів</w:t>
       </w:r>
     </w:p>
     <w:p>
@@ -1071,28 +1199,273 @@
     </w:p>
     <w:p>
       <w:pPr>
-        <w:spacing w:after="0" w:line="240" w:lineRule="auto"/>
-      </w:pPr>
-      <w:r>
-        <w:rPr>
-          <w:rFonts w:ascii="Courier New" w:cs="Courier New" w:eastAsia="Courier New" w:hAnsi="Courier New"/>
-          <w:sz w:val="20"/>
-          <w:szCs w:val="20"/>
-        </w:rPr>
-        <w:t xml:space="preserve"/>
-      </w:r>
-    </w:p>
-    <w:p>
-      <w:pPr>
-        <w:spacing w:after="0" w:line="240" w:lineRule="auto"/>
-      </w:pPr>
-      <w:r>
-        <w:rPr>
-          <w:rFonts w:ascii="Courier New" w:cs="Courier New" w:eastAsia="Courier New" w:hAnsi="Courier New"/>
-          <w:sz w:val="20"/>
-          <w:szCs w:val="20"/>
-        </w:rPr>
-        <w:t xml:space="preserve">T(n) = c1 + (c2+c3+c4+c5+c6)·⌊log₂n⌋ + c7 = Θ(log n)</w:t>
+        <w:spacing w:after="0" w:before="0" w:line="360" w:lineRule="auto"/>
+        <w:ind w:firstLine="709"/>
+        <w:jc w:val="both"/>
+      </w:pPr>
+      <w:r>
+        <w:rPr>
+          <w:rFonts w:ascii="Times New Roman" w:cs="Times New Roman" w:eastAsia="Times New Roman" w:hAnsi="Times New Roman"/>
+          <w:sz w:val="28"/>
+          <w:szCs w:val="28"/>
+        </w:rPr>
+        <w:t xml:space="preserve">Позначимо кількість ітерацій циклу як k. У найгіршому випадку на кожному кроці область пошуку зменшується вдвічі, тому:</w:t>
+      </w:r>
+    </w:p>
+    <w:p>
+      <w:pPr>
+        <w:tabs>
+          <w:tab w:val="center" w:pos="4513"/>
+          <w:tab w:val="right" w:pos="9026"/>
+        </w:tabs>
+        <w:spacing w:after="80" w:before="80" w:line="360" w:lineRule="auto"/>
+      </w:pPr>
+      <w:r>
+        <w:rPr>
+          <w:rFonts w:ascii="Times New Roman" w:cs="Times New Roman" w:eastAsia="Times New Roman" w:hAnsi="Times New Roman"/>
+          <w:sz w:val="28"/>
+          <w:szCs w:val="28"/>
+        </w:rPr>
+        <w:t xml:space="preserve">	</w:t>
+      </w:r>
+      <m:oMath>
+        <m:r>
+          <m:t>k = ⌊</m:t>
+        </m:r>
+        <m:sSub>
+          <m:sSubPr/>
+          <m:e>
+            <m:r>
+              <m:t>log</m:t>
+            </m:r>
+          </m:e>
+          <m:sub>
+            <m:r>
+              <m:t>2</m:t>
+            </m:r>
+          </m:sub>
+        </m:sSub>
+        <m:r>
+          <m:t> n⌋ + 1</m:t>
+        </m:r>
+      </m:oMath>
+      <w:r>
+        <w:rPr>
+          <w:rFonts w:ascii="Times New Roman" w:cs="Times New Roman" w:eastAsia="Times New Roman" w:hAnsi="Times New Roman"/>
+          <w:sz w:val="28"/>
+          <w:szCs w:val="28"/>
+        </w:rPr>
+        <w:t xml:space="preserve">	(3.2)</w:t>
+      </w:r>
+    </w:p>
+    <w:p>
+      <w:pPr>
+        <w:spacing w:after="0" w:before="0" w:line="360" w:lineRule="auto"/>
+        <w:ind w:firstLine="709"/>
+        <w:jc w:val="both"/>
+      </w:pPr>
+      <w:r>
+        <w:rPr>
+          <w:rFonts w:ascii="Times New Roman" w:cs="Times New Roman" w:eastAsia="Times New Roman" w:hAnsi="Times New Roman"/>
+          <w:sz w:val="28"/>
+          <w:szCs w:val="28"/>
+        </w:rPr>
+        <w:t xml:space="preserve">Перевірка умови циклу while виконується k + 1 разів, а тіло циклу — k разів.</w:t>
+      </w:r>
+    </w:p>
+    <w:p>
+      <w:pPr>
+        <w:tabs>
+          <w:tab w:val="center" w:pos="4513"/>
+          <w:tab w:val="right" w:pos="9026"/>
+        </w:tabs>
+        <w:spacing w:after="80" w:before="80" w:line="360" w:lineRule="auto"/>
+      </w:pPr>
+      <w:r>
+        <w:rPr>
+          <w:rFonts w:ascii="Times New Roman" w:cs="Times New Roman" w:eastAsia="Times New Roman" w:hAnsi="Times New Roman"/>
+          <w:sz w:val="28"/>
+          <w:szCs w:val="28"/>
+        </w:rPr>
+        <w:t xml:space="preserve">	</w:t>
+      </w:r>
+      <m:oMath>
+        <m:sSub>
+          <m:sSubPr/>
+          <m:e>
+            <m:r>
+              <m:t>T</m:t>
+            </m:r>
+          </m:e>
+          <m:sub>
+            <m:r>
+              <m:t>і</m:t>
+            </m:r>
+          </m:sub>
+        </m:sSub>
+        <m:r>
+          <m:t>(n) = </m:t>
+        </m:r>
+        <m:sSub>
+          <m:sSubPr/>
+          <m:e>
+            <m:r>
+              <m:t>c</m:t>
+            </m:r>
+          </m:e>
+          <m:sub>
+            <m:r>
+              <m:t>1</m:t>
+            </m:r>
+          </m:sub>
+        </m:sSub>
+        <m:r>
+          <m:t> + </m:t>
+        </m:r>
+        <m:sSub>
+          <m:sSubPr/>
+          <m:e>
+            <m:r>
+              <m:t>c</m:t>
+            </m:r>
+          </m:e>
+          <m:sub>
+            <m:r>
+              <m:t>2</m:t>
+            </m:r>
+          </m:sub>
+        </m:sSub>
+        <m:r>
+          <m:t>·(k + 1) + (</m:t>
+        </m:r>
+        <m:sSub>
+          <m:sSubPr/>
+          <m:e>
+            <m:r>
+              <m:t>c</m:t>
+            </m:r>
+          </m:e>
+          <m:sub>
+            <m:r>
+              <m:t>3</m:t>
+            </m:r>
+          </m:sub>
+        </m:sSub>
+        <m:r>
+          <m:t> + </m:t>
+        </m:r>
+        <m:sSub>
+          <m:sSubPr/>
+          <m:e>
+            <m:r>
+              <m:t>c</m:t>
+            </m:r>
+          </m:e>
+          <m:sub>
+            <m:r>
+              <m:t>4</m:t>
+            </m:r>
+          </m:sub>
+        </m:sSub>
+        <m:r>
+          <m:t> + </m:t>
+        </m:r>
+        <m:sSub>
+          <m:sSubPr/>
+          <m:e>
+            <m:r>
+              <m:t>c</m:t>
+            </m:r>
+          </m:e>
+          <m:sub>
+            <m:r>
+              <m:t>5</m:t>
+            </m:r>
+          </m:sub>
+        </m:sSub>
+        <m:r>
+          <m:t> + </m:t>
+        </m:r>
+        <m:sSub>
+          <m:sSubPr/>
+          <m:e>
+            <m:r>
+              <m:t>c</m:t>
+            </m:r>
+          </m:e>
+          <m:sub>
+            <m:r>
+              <m:t>6</m:t>
+            </m:r>
+          </m:sub>
+        </m:sSub>
+        <m:r>
+          <m:t>)·k + </m:t>
+        </m:r>
+        <m:sSub>
+          <m:sSubPr/>
+          <m:e>
+            <m:r>
+              <m:t>c</m:t>
+            </m:r>
+          </m:e>
+          <m:sub>
+            <m:r>
+              <m:t>7</m:t>
+            </m:r>
+          </m:sub>
+        </m:sSub>
+      </m:oMath>
+      <w:r>
+        <w:rPr>
+          <w:rFonts w:ascii="Times New Roman" w:cs="Times New Roman" w:eastAsia="Times New Roman" w:hAnsi="Times New Roman"/>
+          <w:sz w:val="28"/>
+          <w:szCs w:val="28"/>
+        </w:rPr>
+        <w:t xml:space="preserve">	(3.3)</w:t>
+      </w:r>
+    </w:p>
+    <w:p>
+      <w:pPr>
+        <w:tabs>
+          <w:tab w:val="center" w:pos="4513"/>
+          <w:tab w:val="right" w:pos="9026"/>
+        </w:tabs>
+        <w:spacing w:after="80" w:before="80" w:line="360" w:lineRule="auto"/>
+      </w:pPr>
+      <w:r>
+        <w:rPr>
+          <w:rFonts w:ascii="Times New Roman" w:cs="Times New Roman" w:eastAsia="Times New Roman" w:hAnsi="Times New Roman"/>
+          <w:sz w:val="28"/>
+          <w:szCs w:val="28"/>
+        </w:rPr>
+        <w:t xml:space="preserve">	</w:t>
+      </w:r>
+      <m:oMath>
+        <m:sSub>
+          <m:sSubPr/>
+          <m:e>
+            <m:r>
+              <m:t>T</m:t>
+            </m:r>
+          </m:e>
+          <m:sub>
+            <m:r>
+              <m:t>і</m:t>
+            </m:r>
+          </m:sub>
+        </m:sSub>
+        <m:r>
+          <m:t>(n) = Θ(log n)</m:t>
+        </m:r>
+      </m:oMath>
+      <w:r>
+        <w:rPr>
+          <w:rFonts w:ascii="Times New Roman" w:cs="Times New Roman" w:eastAsia="Times New Roman" w:hAnsi="Times New Roman"/>
+          <w:sz w:val="28"/>
+          <w:szCs w:val="28"/>
+        </w:rPr>
+        <w:t xml:space="preserve">	(3.4)</w:t>
       </w:r>
     </w:p>
     <w:p>
@@ -1114,7 +1487,7 @@
     </w:p>
     <w:p>
       <w:pPr>
-        <w:spacing w:after="0" w:line="360" w:lineRule="auto"/>
+        <w:spacing w:after="0" w:before="0" w:line="360" w:lineRule="auto"/>
         <w:ind w:firstLine="709"/>
         <w:jc w:val="both"/>
       </w:pPr>
@@ -1129,20 +1502,66 @@
     </w:p>
     <w:p>
       <w:pPr>
-        <w:spacing w:after="0" w:line="240" w:lineRule="auto"/>
-      </w:pPr>
-      <w:r>
-        <w:rPr>
-          <w:rFonts w:ascii="Courier New" w:cs="Courier New" w:eastAsia="Courier New" w:hAnsi="Courier New"/>
-          <w:sz w:val="20"/>
-          <w:szCs w:val="20"/>
-        </w:rPr>
-        <w:t xml:space="preserve">T(n) = T(n/2) + Θ(1)</w:t>
-      </w:r>
-    </w:p>
-    <w:p>
-      <w:pPr>
-        <w:spacing w:after="0" w:line="360" w:lineRule="auto"/>
+        <w:tabs>
+          <w:tab w:val="center" w:pos="4513"/>
+          <w:tab w:val="right" w:pos="9026"/>
+        </w:tabs>
+        <w:spacing w:after="80" w:before="80" w:line="360" w:lineRule="auto"/>
+      </w:pPr>
+      <w:r>
+        <w:rPr>
+          <w:rFonts w:ascii="Times New Roman" w:cs="Times New Roman" w:eastAsia="Times New Roman" w:hAnsi="Times New Roman"/>
+          <w:sz w:val="28"/>
+          <w:szCs w:val="28"/>
+        </w:rPr>
+        <w:t xml:space="preserve">	</w:t>
+      </w:r>
+      <m:oMath>
+        <m:sSub>
+          <m:sSubPr/>
+          <m:e>
+            <m:r>
+              <m:t>T</m:t>
+            </m:r>
+          </m:e>
+          <m:sub>
+            <m:r>
+              <m:t>р</m:t>
+            </m:r>
+          </m:sub>
+        </m:sSub>
+        <m:r>
+          <m:t>(n) = </m:t>
+        </m:r>
+        <m:sSub>
+          <m:sSubPr/>
+          <m:e>
+            <m:r>
+              <m:t>T</m:t>
+            </m:r>
+          </m:e>
+          <m:sub>
+            <m:r>
+              <m:t>р</m:t>
+            </m:r>
+          </m:sub>
+        </m:sSub>
+        <m:r>
+          <m:t>(n / 2) + Θ(1)</m:t>
+        </m:r>
+      </m:oMath>
+      <w:r>
+        <w:rPr>
+          <w:rFonts w:ascii="Times New Roman" w:cs="Times New Roman" w:eastAsia="Times New Roman" w:hAnsi="Times New Roman"/>
+          <w:sz w:val="28"/>
+          <w:szCs w:val="28"/>
+        </w:rPr>
+        <w:t xml:space="preserve">	(3.5)</w:t>
+      </w:r>
+    </w:p>
+    <w:p>
+      <w:pPr>
+        <w:spacing w:after="0" w:before="0" w:line="360" w:lineRule="auto"/>
         <w:ind w:firstLine="709"/>
         <w:jc w:val="both"/>
       </w:pPr>
@@ -1157,7 +1576,7 @@
     </w:p>
     <w:p>
       <w:pPr>
-        <w:spacing w:after="0" w:line="360" w:lineRule="auto"/>
+        <w:spacing w:after="0" w:before="0" w:line="360" w:lineRule="auto"/>
         <w:ind w:firstLine="709"/>
         <w:jc w:val="both"/>
       </w:pPr>
@@ -1167,12 +1586,71 @@
           <w:sz w:val="28"/>
           <w:szCs w:val="28"/>
         </w:rPr>
-        <w:t xml:space="preserve">Оскільки log_b(a) = log₂(1) = 0, маємо f(n) = Θ(n^0) = Θ(1), що відповідає випадку 2 основної теореми.</w:t>
-      </w:r>
-    </w:p>
-    <w:p>
-      <w:pPr>
-        <w:spacing w:after="0" w:line="360" w:lineRule="auto"/>
+        <w:t xml:space="preserve">Оскільки для цього випадку виконується:</w:t>
+      </w:r>
+    </w:p>
+    <w:p>
+      <w:pPr>
+        <w:tabs>
+          <w:tab w:val="center" w:pos="4513"/>
+          <w:tab w:val="right" w:pos="9026"/>
+        </w:tabs>
+        <w:spacing w:after="80" w:before="80" w:line="360" w:lineRule="auto"/>
+      </w:pPr>
+      <w:r>
+        <w:rPr>
+          <w:rFonts w:ascii="Times New Roman" w:cs="Times New Roman" w:eastAsia="Times New Roman" w:hAnsi="Times New Roman"/>
+          <w:sz w:val="28"/>
+          <w:szCs w:val="28"/>
+        </w:rPr>
+        <w:t xml:space="preserve">	</w:t>
+      </w:r>
+      <m:oMath>
+        <m:sSub>
+          <m:sSubPr/>
+          <m:e>
+            <m:r>
+              <m:t>log</m:t>
+            </m:r>
+          </m:e>
+          <m:sub>
+            <m:r>
+              <m:t>2</m:t>
+            </m:r>
+          </m:sub>
+        </m:sSub>
+        <m:r>
+          <m:t>(1) = 0, f(n) = Θ(</m:t>
+        </m:r>
+        <m:sSup>
+          <m:sSupPr/>
+          <m:e>
+            <m:r>
+              <m:t>n</m:t>
+            </m:r>
+          </m:e>
+          <m:sup>
+            <m:r>
+              <m:t>0</m:t>
+            </m:r>
+          </m:sup>
+        </m:sSup>
+        <m:r>
+          <m:t>) = Θ(1)</m:t>
+        </m:r>
+      </m:oMath>
+      <w:r>
+        <w:rPr>
+          <w:rFonts w:ascii="Times New Roman" w:cs="Times New Roman" w:eastAsia="Times New Roman" w:hAnsi="Times New Roman"/>
+          <w:sz w:val="28"/>
+          <w:szCs w:val="28"/>
+        </w:rPr>
+        <w:t xml:space="preserve">	(3.6)</w:t>
+      </w:r>
+    </w:p>
+    <w:p>
+      <w:pPr>
+        <w:spacing w:after="0" w:before="0" w:line="360" w:lineRule="auto"/>
         <w:ind w:firstLine="709"/>
         <w:jc w:val="both"/>
       </w:pPr>
@@ -1182,12 +1660,56 @@
           <w:sz w:val="28"/>
           <w:szCs w:val="28"/>
         </w:rPr>
-        <w:t xml:space="preserve">Отже: T(n) = Θ(log n).</w:t>
+        <w:t xml:space="preserve">Це відповідає випадку 2 основної теореми.</w:t>
+      </w:r>
+    </w:p>
+    <w:p>
+      <w:pPr>
+        <w:tabs>
+          <w:tab w:val="center" w:pos="4513"/>
+          <w:tab w:val="right" w:pos="9026"/>
+        </w:tabs>
+        <w:spacing w:after="80" w:before="80" w:line="360" w:lineRule="auto"/>
+      </w:pPr>
+      <w:r>
+        <w:rPr>
+          <w:rFonts w:ascii="Times New Roman" w:cs="Times New Roman" w:eastAsia="Times New Roman" w:hAnsi="Times New Roman"/>
+          <w:sz w:val="28"/>
+          <w:szCs w:val="28"/>
+        </w:rPr>
+        <w:t xml:space="preserve">	</w:t>
+      </w:r>
+      <m:oMath>
+        <m:sSub>
+          <m:sSubPr/>
+          <m:e>
+            <m:r>
+              <m:t>T</m:t>
+            </m:r>
+          </m:e>
+          <m:sub>
+            <m:r>
+              <m:t>р</m:t>
+            </m:r>
+          </m:sub>
+        </m:sSub>
+        <m:r>
+          <m:t>(n) = Θ(log n)</m:t>
+        </m:r>
+      </m:oMath>
+      <w:r>
+        <w:rPr>
+          <w:rFonts w:ascii="Times New Roman" w:cs="Times New Roman" w:eastAsia="Times New Roman" w:hAnsi="Times New Roman"/>
+          <w:sz w:val="28"/>
+          <w:szCs w:val="28"/>
+        </w:rPr>
+        <w:t xml:space="preserve">	(3.7)</w:t>
       </w:r>
     </w:p>
     <w:p>
       <w:pPr>
         <w:pStyle w:val="Heading1"/>
+        <w:pageBreakBefore/>
         <w:spacing w:after="120" w:before="240" w:line="360" w:lineRule="auto"/>
       </w:pPr>
       <w:r>
@@ -1203,7 +1725,7 @@
     </w:p>
     <w:p>
       <w:pPr>
-        <w:spacing w:after="0" w:line="360" w:lineRule="auto"/>
+        <w:spacing w:after="0" w:before="0" w:line="360" w:lineRule="auto"/>
         <w:ind w:firstLine="709"/>
         <w:jc w:val="both"/>
       </w:pPr>
@@ -1213,7 +1735,7 @@
           <w:sz w:val="28"/>
           <w:szCs w:val="28"/>
         </w:rPr>
-        <w:t xml:space="preserve">Програму було запущено для масивів різного розміру. Результати вимірювання часу виконання наведено у таблиці 4.1.</w:t>
+        <w:t xml:space="preserve">Програму було запущено для масивів різного розміру. Для зменшення похибки вимірювання кожен алгоритм виконувався багаторазово, після чого обчислювався середній час одного запуску.</w:t>
       </w:r>
     </w:p>
     <w:p>
@@ -1387,7 +1909,7 @@
                 <w:sz w:val="28"/>
                 <w:szCs w:val="28"/>
               </w:rPr>
-              <w:t xml:space="preserve">1 000</w:t>
+              <w:t xml:space="preserve">1 000</w:t>
             </w:r>
           </w:p>
         </w:tc>
@@ -1489,7 +2011,7 @@
                 <w:sz w:val="28"/>
                 <w:szCs w:val="28"/>
               </w:rPr>
-              <w:t xml:space="preserve">10 000</w:t>
+              <w:t xml:space="preserve">10 000</w:t>
             </w:r>
           </w:p>
         </w:tc>
@@ -1514,7 +2036,7 @@
                 <w:sz w:val="28"/>
                 <w:szCs w:val="28"/>
               </w:rPr>
-              <w:t xml:space="preserve">0.0058</w:t>
+              <w:t xml:space="preserve">0.0059</w:t>
             </w:r>
           </w:p>
         </w:tc>
@@ -1591,7 +2113,7 @@
                 <w:sz w:val="28"/>
                 <w:szCs w:val="28"/>
               </w:rPr>
-              <w:t xml:space="preserve">100 000</w:t>
+              <w:t xml:space="preserve">100 000</w:t>
             </w:r>
           </w:p>
         </w:tc>
@@ -1616,7 +2138,7 @@
                 <w:sz w:val="28"/>
                 <w:szCs w:val="28"/>
               </w:rPr>
-              <w:t xml:space="preserve">0.0595</w:t>
+              <w:t xml:space="preserve">0.0597</w:t>
             </w:r>
           </w:p>
         </w:tc>
@@ -1693,7 +2215,7 @@
                 <w:sz w:val="28"/>
                 <w:szCs w:val="28"/>
               </w:rPr>
-              <w:t xml:space="preserve">1 000 000</w:t>
+              <w:t xml:space="preserve">1 000 000</w:t>
             </w:r>
           </w:p>
         </w:tc>
@@ -1718,7 +2240,7 @@
                 <w:sz w:val="28"/>
                 <w:szCs w:val="28"/>
               </w:rPr>
-              <w:t xml:space="preserve">0.5814</w:t>
+              <w:t xml:space="preserve">0.6013</w:t>
             </w:r>
           </w:p>
         </w:tc>
@@ -1795,7 +2317,7 @@
                 <w:sz w:val="28"/>
                 <w:szCs w:val="28"/>
               </w:rPr>
-              <w:t xml:space="preserve">10 000 000</w:t>
+              <w:t xml:space="preserve">10 000 000</w:t>
             </w:r>
           </w:p>
         </w:tc>
@@ -1820,7 +2342,7 @@
                 <w:sz w:val="28"/>
                 <w:szCs w:val="28"/>
               </w:rPr>
-              <w:t xml:space="preserve">5.9384</w:t>
+              <w:t xml:space="preserve">6.1145</w:t>
             </w:r>
           </w:p>
         </w:tc>
@@ -1870,7 +2392,7 @@
                 <w:sz w:val="28"/>
                 <w:szCs w:val="28"/>
               </w:rPr>
-              <w:t xml:space="preserve">0.0002</w:t>
+              <w:t xml:space="preserve">0.0003</w:t>
             </w:r>
           </w:p>
         </w:tc>
@@ -1878,7 +2400,7 @@
     </w:tbl>
     <w:p>
       <w:pPr>
-        <w:spacing w:after="0" w:line="360" w:lineRule="auto"/>
+        <w:spacing w:after="0" w:before="120" w:line="360" w:lineRule="auto"/>
         <w:ind w:firstLine="709"/>
         <w:jc w:val="both"/>
       </w:pPr>
@@ -1894,6 +2416,7 @@
     <w:p>
       <w:pPr>
         <w:pStyle w:val="Heading1"/>
+        <w:pageBreakBefore/>
         <w:spacing w:after="120" w:before="240" w:line="360" w:lineRule="auto"/>
       </w:pPr>
       <w:r>
@@ -1909,7 +2432,7 @@
     </w:p>
     <w:p>
       <w:pPr>
-        <w:spacing w:after="0" w:line="360" w:lineRule="auto"/>
+        <w:spacing w:after="0" w:before="0" w:line="360" w:lineRule="auto"/>
         <w:ind w:firstLine="709"/>
         <w:jc w:val="both"/>
       </w:pPr>
@@ -1919,17 +2442,13 @@
           <w:sz w:val="28"/>
           <w:szCs w:val="28"/>
         </w:rPr>
-        <w:t xml:space="preserve">Практичні виміри підтвердили теоретичні оцінки: час лінійного пошуку зростає пропорційно n, тоді як час двійкового пошуку зростає логарифмічно. Рекурсивний та ітеративний варіанти двійкового пошуку показали близьку швидкодію, що відповідає однаковій асимптотичній оцінці Θ(log n).</w:t>
-      </w:r>
-    </w:p>
-    <w:p>
-      <w:r>
-        <w:br w:type="page"/>
+        <w:t xml:space="preserve">Практичні виміри підтвердили теоретичні оцінки. У найгіршому випадку лінійний пошук має складність Θ(n), оскільки перевіряє всі елементи масиву. Ітеративний і рекурсивний двійковий пошук мають складність Θ(log n), оскільки на кожному кроці область пошуку зменшується вдвічі. Рекурсивний варіант додатково використовує стек викликів.</w:t>
       </w:r>
     </w:p>
     <w:p>
       <w:pPr>
         <w:pStyle w:val="Heading1"/>
+        <w:pageBreakBefore/>
         <w:spacing w:after="120" w:before="240" w:line="360" w:lineRule="auto"/>
       </w:pPr>
       <w:r>
@@ -1940,7 +2459,7 @@
           <w:sz w:val="28"/>
           <w:szCs w:val="28"/>
         </w:rPr>
-        <w:t xml:space="preserve"> ДОДАТОК А</w:t>
+        <w:t xml:space="preserve">ДОДАТОК А</w:t>
       </w:r>
     </w:p>
     <w:p>

</xml_diff>

<commit_message>
style: merge code styling with content improvements
Combines two branches of improvements:
- From content review: real benchmarks, OOXML Math with subscripts/superscripts,
  better text, pageBreakBefore, table spacing
- From style standard: 9pt code font, blue left accent border, grey shading,
  keepNext on all headings and captions
</commit_message>
<xml_diff>
--- a/reports/lr1/Звіт_ЛР1_Коновалов_ПЗПІ-25-6.docx
+++ b/reports/lr1/Звіт_ЛР1_Коновалов_ПЗПІ-25-6.docx
@@ -442,6 +442,7 @@
     <w:p>
       <w:pPr>
         <w:pStyle w:val="Heading1"/>
+        <w:keepNext/>
         <w:spacing w:after="120" w:before="240" w:line="360" w:lineRule="auto"/>
       </w:pPr>
       <w:r>
@@ -473,6 +474,7 @@
     <w:p>
       <w:pPr>
         <w:pStyle w:val="Heading1"/>
+        <w:keepNext/>
         <w:spacing w:after="120" w:before="240" w:line="360" w:lineRule="auto"/>
       </w:pPr>
       <w:r>
@@ -504,6 +506,7 @@
     <w:p>
       <w:pPr>
         <w:pStyle w:val="Heading1"/>
+        <w:keepNext/>
         <w:spacing w:after="120" w:before="240" w:line="360" w:lineRule="auto"/>
       </w:pPr>
       <w:r>
@@ -520,6 +523,7 @@
     <w:p>
       <w:pPr>
         <w:pStyle w:val="Heading2"/>
+        <w:keepNext/>
         <w:spacing w:after="60" w:before="120" w:line="360" w:lineRule="auto"/>
         <w:ind w:firstLine="709"/>
       </w:pPr>
@@ -566,6 +570,7 @@
     </w:p>
     <w:p>
       <w:pPr>
+        <w:keepNext/>
         <w:spacing w:after="60" w:before="120" w:line="360" w:lineRule="auto"/>
         <w:ind w:firstLine="709"/>
       </w:pPr>
@@ -580,71 +585,102 @@
     </w:p>
     <w:p>
       <w:pPr>
-        <w:spacing w:after="0" w:line="240" w:lineRule="auto"/>
-      </w:pPr>
-      <w:r>
-        <w:rPr>
-          <w:rFonts w:ascii="Courier New" w:cs="Courier New" w:eastAsia="Courier New" w:hAnsi="Courier New"/>
-          <w:sz w:val="20"/>
-          <w:szCs w:val="20"/>
+        <w:pBdr>
+          <w:left w:val="single" w:color="4472C4" w:sz="12" w:space="4"/>
+        </w:pBdr>
+        <w:shd w:fill="F2F2F2" w:color="auto" w:val="clear"/>
+        <w:spacing w:after="0" w:line="240" w:lineRule="auto"/>
+        <w:ind w:left="283"/>
+      </w:pPr>
+      <w:r>
+        <w:rPr>
+          <w:rFonts w:ascii="Courier New" w:cs="Courier New" w:eastAsia="Courier New" w:hAnsi="Courier New"/>
+          <w:sz w:val="18"/>
+          <w:szCs w:val="18"/>
+          <w:shd w:fill="F2F2F2" w:color="auto" w:val="clear"/>
         </w:rPr>
         <w:t xml:space="preserve">function linearSearch(arr, target):</w:t>
       </w:r>
     </w:p>
     <w:p>
       <w:pPr>
-        <w:spacing w:after="0" w:line="240" w:lineRule="auto"/>
-      </w:pPr>
-      <w:r>
-        <w:rPr>
-          <w:rFonts w:ascii="Courier New" w:cs="Courier New" w:eastAsia="Courier New" w:hAnsi="Courier New"/>
-          <w:sz w:val="20"/>
-          <w:szCs w:val="20"/>
+        <w:pBdr>
+          <w:left w:val="single" w:color="4472C4" w:sz="12" w:space="4"/>
+        </w:pBdr>
+        <w:shd w:fill="F2F2F2" w:color="auto" w:val="clear"/>
+        <w:spacing w:after="0" w:line="240" w:lineRule="auto"/>
+        <w:ind w:left="283"/>
+      </w:pPr>
+      <w:r>
+        <w:rPr>
+          <w:rFonts w:ascii="Courier New" w:cs="Courier New" w:eastAsia="Courier New" w:hAnsi="Courier New"/>
+          <w:sz w:val="18"/>
+          <w:szCs w:val="18"/>
+          <w:shd w:fill="F2F2F2" w:color="auto" w:val="clear"/>
         </w:rPr>
         <w:t xml:space="preserve">    for i = 0 to n-1:</w:t>
       </w:r>
     </w:p>
     <w:p>
       <w:pPr>
-        <w:spacing w:after="0" w:line="240" w:lineRule="auto"/>
-      </w:pPr>
-      <w:r>
-        <w:rPr>
-          <w:rFonts w:ascii="Courier New" w:cs="Courier New" w:eastAsia="Courier New" w:hAnsi="Courier New"/>
-          <w:sz w:val="20"/>
-          <w:szCs w:val="20"/>
+        <w:pBdr>
+          <w:left w:val="single" w:color="4472C4" w:sz="12" w:space="4"/>
+        </w:pBdr>
+        <w:shd w:fill="F2F2F2" w:color="auto" w:val="clear"/>
+        <w:spacing w:after="0" w:line="240" w:lineRule="auto"/>
+        <w:ind w:left="283"/>
+      </w:pPr>
+      <w:r>
+        <w:rPr>
+          <w:rFonts w:ascii="Courier New" w:cs="Courier New" w:eastAsia="Courier New" w:hAnsi="Courier New"/>
+          <w:sz w:val="18"/>
+          <w:szCs w:val="18"/>
+          <w:shd w:fill="F2F2F2" w:color="auto" w:val="clear"/>
         </w:rPr>
         <w:t xml:space="preserve">        if arr[i] == target:</w:t>
       </w:r>
     </w:p>
     <w:p>
       <w:pPr>
-        <w:spacing w:after="0" w:line="240" w:lineRule="auto"/>
-      </w:pPr>
-      <w:r>
-        <w:rPr>
-          <w:rFonts w:ascii="Courier New" w:cs="Courier New" w:eastAsia="Courier New" w:hAnsi="Courier New"/>
-          <w:sz w:val="20"/>
-          <w:szCs w:val="20"/>
+        <w:pBdr>
+          <w:left w:val="single" w:color="4472C4" w:sz="12" w:space="4"/>
+        </w:pBdr>
+        <w:shd w:fill="F2F2F2" w:color="auto" w:val="clear"/>
+        <w:spacing w:after="0" w:line="240" w:lineRule="auto"/>
+        <w:ind w:left="283"/>
+      </w:pPr>
+      <w:r>
+        <w:rPr>
+          <w:rFonts w:ascii="Courier New" w:cs="Courier New" w:eastAsia="Courier New" w:hAnsi="Courier New"/>
+          <w:sz w:val="18"/>
+          <w:szCs w:val="18"/>
+          <w:shd w:fill="F2F2F2" w:color="auto" w:val="clear"/>
         </w:rPr>
         <w:t xml:space="preserve">            return i</w:t>
       </w:r>
     </w:p>
     <w:p>
       <w:pPr>
-        <w:spacing w:after="0" w:line="240" w:lineRule="auto"/>
-      </w:pPr>
-      <w:r>
-        <w:rPr>
-          <w:rFonts w:ascii="Courier New" w:cs="Courier New" w:eastAsia="Courier New" w:hAnsi="Courier New"/>
-          <w:sz w:val="20"/>
-          <w:szCs w:val="20"/>
+        <w:pBdr>
+          <w:left w:val="single" w:color="4472C4" w:sz="12" w:space="4"/>
+        </w:pBdr>
+        <w:shd w:fill="F2F2F2" w:color="auto" w:val="clear"/>
+        <w:spacing w:after="0" w:line="240" w:lineRule="auto"/>
+        <w:ind w:left="283"/>
+      </w:pPr>
+      <w:r>
+        <w:rPr>
+          <w:rFonts w:ascii="Courier New" w:cs="Courier New" w:eastAsia="Courier New" w:hAnsi="Courier New"/>
+          <w:sz w:val="18"/>
+          <w:szCs w:val="18"/>
+          <w:shd w:fill="F2F2F2" w:color="auto" w:val="clear"/>
         </w:rPr>
         <w:t xml:space="preserve">    return -1</w:t>
       </w:r>
     </w:p>
     <w:p>
       <w:pPr>
+        <w:keepNext/>
         <w:spacing w:after="60" w:before="120" w:line="360" w:lineRule="auto"/>
         <w:ind w:firstLine="709"/>
       </w:pPr>
@@ -659,110 +695,159 @@
     </w:p>
     <w:p>
       <w:pPr>
-        <w:spacing w:after="0" w:line="240" w:lineRule="auto"/>
-      </w:pPr>
-      <w:r>
-        <w:rPr>
-          <w:rFonts w:ascii="Courier New" w:cs="Courier New" w:eastAsia="Courier New" w:hAnsi="Courier New"/>
-          <w:sz w:val="20"/>
-          <w:szCs w:val="20"/>
+        <w:pBdr>
+          <w:left w:val="single" w:color="4472C4" w:sz="12" w:space="4"/>
+        </w:pBdr>
+        <w:shd w:fill="F2F2F2" w:color="auto" w:val="clear"/>
+        <w:spacing w:after="0" w:line="240" w:lineRule="auto"/>
+        <w:ind w:left="283"/>
+      </w:pPr>
+      <w:r>
+        <w:rPr>
+          <w:rFonts w:ascii="Courier New" w:cs="Courier New" w:eastAsia="Courier New" w:hAnsi="Courier New"/>
+          <w:sz w:val="18"/>
+          <w:szCs w:val="18"/>
+          <w:shd w:fill="F2F2F2" w:color="auto" w:val="clear"/>
         </w:rPr>
         <w:t xml:space="preserve">function binarySearchIterative(arr, target):</w:t>
       </w:r>
     </w:p>
     <w:p>
       <w:pPr>
-        <w:spacing w:after="0" w:line="240" w:lineRule="auto"/>
-      </w:pPr>
-      <w:r>
-        <w:rPr>
-          <w:rFonts w:ascii="Courier New" w:cs="Courier New" w:eastAsia="Courier New" w:hAnsi="Courier New"/>
-          <w:sz w:val="20"/>
-          <w:szCs w:val="20"/>
+        <w:pBdr>
+          <w:left w:val="single" w:color="4472C4" w:sz="12" w:space="4"/>
+        </w:pBdr>
+        <w:shd w:fill="F2F2F2" w:color="auto" w:val="clear"/>
+        <w:spacing w:after="0" w:line="240" w:lineRule="auto"/>
+        <w:ind w:left="283"/>
+      </w:pPr>
+      <w:r>
+        <w:rPr>
+          <w:rFonts w:ascii="Courier New" w:cs="Courier New" w:eastAsia="Courier New" w:hAnsi="Courier New"/>
+          <w:sz w:val="18"/>
+          <w:szCs w:val="18"/>
+          <w:shd w:fill="F2F2F2" w:color="auto" w:val="clear"/>
         </w:rPr>
         <w:t xml:space="preserve">    low = 0, high = n-1</w:t>
       </w:r>
     </w:p>
     <w:p>
       <w:pPr>
-        <w:spacing w:after="0" w:line="240" w:lineRule="auto"/>
-      </w:pPr>
-      <w:r>
-        <w:rPr>
-          <w:rFonts w:ascii="Courier New" w:cs="Courier New" w:eastAsia="Courier New" w:hAnsi="Courier New"/>
-          <w:sz w:val="20"/>
-          <w:szCs w:val="20"/>
+        <w:pBdr>
+          <w:left w:val="single" w:color="4472C4" w:sz="12" w:space="4"/>
+        </w:pBdr>
+        <w:shd w:fill="F2F2F2" w:color="auto" w:val="clear"/>
+        <w:spacing w:after="0" w:line="240" w:lineRule="auto"/>
+        <w:ind w:left="283"/>
+      </w:pPr>
+      <w:r>
+        <w:rPr>
+          <w:rFonts w:ascii="Courier New" w:cs="Courier New" w:eastAsia="Courier New" w:hAnsi="Courier New"/>
+          <w:sz w:val="18"/>
+          <w:szCs w:val="18"/>
+          <w:shd w:fill="F2F2F2" w:color="auto" w:val="clear"/>
         </w:rPr>
         <w:t xml:space="preserve">    while low &lt;= high:</w:t>
       </w:r>
     </w:p>
     <w:p>
       <w:pPr>
-        <w:spacing w:after="0" w:line="240" w:lineRule="auto"/>
-      </w:pPr>
-      <w:r>
-        <w:rPr>
-          <w:rFonts w:ascii="Courier New" w:cs="Courier New" w:eastAsia="Courier New" w:hAnsi="Courier New"/>
-          <w:sz w:val="20"/>
-          <w:szCs w:val="20"/>
+        <w:pBdr>
+          <w:left w:val="single" w:color="4472C4" w:sz="12" w:space="4"/>
+        </w:pBdr>
+        <w:shd w:fill="F2F2F2" w:color="auto" w:val="clear"/>
+        <w:spacing w:after="0" w:line="240" w:lineRule="auto"/>
+        <w:ind w:left="283"/>
+      </w:pPr>
+      <w:r>
+        <w:rPr>
+          <w:rFonts w:ascii="Courier New" w:cs="Courier New" w:eastAsia="Courier New" w:hAnsi="Courier New"/>
+          <w:sz w:val="18"/>
+          <w:szCs w:val="18"/>
+          <w:shd w:fill="F2F2F2" w:color="auto" w:val="clear"/>
         </w:rPr>
         <w:t xml:space="preserve">        mid = floor((low + high) / 2)</w:t>
       </w:r>
     </w:p>
     <w:p>
       <w:pPr>
-        <w:spacing w:after="0" w:line="240" w:lineRule="auto"/>
-      </w:pPr>
-      <w:r>
-        <w:rPr>
-          <w:rFonts w:ascii="Courier New" w:cs="Courier New" w:eastAsia="Courier New" w:hAnsi="Courier New"/>
-          <w:sz w:val="20"/>
-          <w:szCs w:val="20"/>
+        <w:pBdr>
+          <w:left w:val="single" w:color="4472C4" w:sz="12" w:space="4"/>
+        </w:pBdr>
+        <w:shd w:fill="F2F2F2" w:color="auto" w:val="clear"/>
+        <w:spacing w:after="0" w:line="240" w:lineRule="auto"/>
+        <w:ind w:left="283"/>
+      </w:pPr>
+      <w:r>
+        <w:rPr>
+          <w:rFonts w:ascii="Courier New" w:cs="Courier New" w:eastAsia="Courier New" w:hAnsi="Courier New"/>
+          <w:sz w:val="18"/>
+          <w:szCs w:val="18"/>
+          <w:shd w:fill="F2F2F2" w:color="auto" w:val="clear"/>
         </w:rPr>
         <w:t xml:space="preserve">        if arr[mid] == target: return mid</w:t>
       </w:r>
     </w:p>
     <w:p>
       <w:pPr>
-        <w:spacing w:after="0" w:line="240" w:lineRule="auto"/>
-      </w:pPr>
-      <w:r>
-        <w:rPr>
-          <w:rFonts w:ascii="Courier New" w:cs="Courier New" w:eastAsia="Courier New" w:hAnsi="Courier New"/>
-          <w:sz w:val="20"/>
-          <w:szCs w:val="20"/>
+        <w:pBdr>
+          <w:left w:val="single" w:color="4472C4" w:sz="12" w:space="4"/>
+        </w:pBdr>
+        <w:shd w:fill="F2F2F2" w:color="auto" w:val="clear"/>
+        <w:spacing w:after="0" w:line="240" w:lineRule="auto"/>
+        <w:ind w:left="283"/>
+      </w:pPr>
+      <w:r>
+        <w:rPr>
+          <w:rFonts w:ascii="Courier New" w:cs="Courier New" w:eastAsia="Courier New" w:hAnsi="Courier New"/>
+          <w:sz w:val="18"/>
+          <w:szCs w:val="18"/>
+          <w:shd w:fill="F2F2F2" w:color="auto" w:val="clear"/>
         </w:rPr>
         <w:t xml:space="preserve">        if arr[mid] &lt; target: low = mid + 1</w:t>
       </w:r>
     </w:p>
     <w:p>
       <w:pPr>
-        <w:spacing w:after="0" w:line="240" w:lineRule="auto"/>
-      </w:pPr>
-      <w:r>
-        <w:rPr>
-          <w:rFonts w:ascii="Courier New" w:cs="Courier New" w:eastAsia="Courier New" w:hAnsi="Courier New"/>
-          <w:sz w:val="20"/>
-          <w:szCs w:val="20"/>
+        <w:pBdr>
+          <w:left w:val="single" w:color="4472C4" w:sz="12" w:space="4"/>
+        </w:pBdr>
+        <w:shd w:fill="F2F2F2" w:color="auto" w:val="clear"/>
+        <w:spacing w:after="0" w:line="240" w:lineRule="auto"/>
+        <w:ind w:left="283"/>
+      </w:pPr>
+      <w:r>
+        <w:rPr>
+          <w:rFonts w:ascii="Courier New" w:cs="Courier New" w:eastAsia="Courier New" w:hAnsi="Courier New"/>
+          <w:sz w:val="18"/>
+          <w:szCs w:val="18"/>
+          <w:shd w:fill="F2F2F2" w:color="auto" w:val="clear"/>
         </w:rPr>
         <w:t xml:space="preserve">        else: high = mid - 1</w:t>
       </w:r>
     </w:p>
     <w:p>
       <w:pPr>
-        <w:spacing w:after="0" w:line="240" w:lineRule="auto"/>
-      </w:pPr>
-      <w:r>
-        <w:rPr>
-          <w:rFonts w:ascii="Courier New" w:cs="Courier New" w:eastAsia="Courier New" w:hAnsi="Courier New"/>
-          <w:sz w:val="20"/>
-          <w:szCs w:val="20"/>
+        <w:pBdr>
+          <w:left w:val="single" w:color="4472C4" w:sz="12" w:space="4"/>
+        </w:pBdr>
+        <w:shd w:fill="F2F2F2" w:color="auto" w:val="clear"/>
+        <w:spacing w:after="0" w:line="240" w:lineRule="auto"/>
+        <w:ind w:left="283"/>
+      </w:pPr>
+      <w:r>
+        <w:rPr>
+          <w:rFonts w:ascii="Courier New" w:cs="Courier New" w:eastAsia="Courier New" w:hAnsi="Courier New"/>
+          <w:sz w:val="18"/>
+          <w:szCs w:val="18"/>
+          <w:shd w:fill="F2F2F2" w:color="auto" w:val="clear"/>
         </w:rPr>
         <w:t xml:space="preserve">    return -1</w:t>
       </w:r>
     </w:p>
     <w:p>
       <w:pPr>
+        <w:keepNext/>
         <w:spacing w:after="60" w:before="120" w:line="360" w:lineRule="auto"/>
         <w:ind w:firstLine="709"/>
       </w:pPr>
@@ -777,91 +862,133 @@
     </w:p>
     <w:p>
       <w:pPr>
-        <w:spacing w:after="0" w:line="240" w:lineRule="auto"/>
-      </w:pPr>
-      <w:r>
-        <w:rPr>
-          <w:rFonts w:ascii="Courier New" w:cs="Courier New" w:eastAsia="Courier New" w:hAnsi="Courier New"/>
-          <w:sz w:val="20"/>
-          <w:szCs w:val="20"/>
+        <w:pBdr>
+          <w:left w:val="single" w:color="4472C4" w:sz="12" w:space="4"/>
+        </w:pBdr>
+        <w:shd w:fill="F2F2F2" w:color="auto" w:val="clear"/>
+        <w:spacing w:after="0" w:line="240" w:lineRule="auto"/>
+        <w:ind w:left="283"/>
+      </w:pPr>
+      <w:r>
+        <w:rPr>
+          <w:rFonts w:ascii="Courier New" w:cs="Courier New" w:eastAsia="Courier New" w:hAnsi="Courier New"/>
+          <w:sz w:val="18"/>
+          <w:szCs w:val="18"/>
+          <w:shd w:fill="F2F2F2" w:color="auto" w:val="clear"/>
         </w:rPr>
         <w:t xml:space="preserve">function binarySearchRecursive(arr, target, low, high):</w:t>
       </w:r>
     </w:p>
     <w:p>
       <w:pPr>
-        <w:spacing w:after="0" w:line="240" w:lineRule="auto"/>
-      </w:pPr>
-      <w:r>
-        <w:rPr>
-          <w:rFonts w:ascii="Courier New" w:cs="Courier New" w:eastAsia="Courier New" w:hAnsi="Courier New"/>
-          <w:sz w:val="20"/>
-          <w:szCs w:val="20"/>
+        <w:pBdr>
+          <w:left w:val="single" w:color="4472C4" w:sz="12" w:space="4"/>
+        </w:pBdr>
+        <w:shd w:fill="F2F2F2" w:color="auto" w:val="clear"/>
+        <w:spacing w:after="0" w:line="240" w:lineRule="auto"/>
+        <w:ind w:left="283"/>
+      </w:pPr>
+      <w:r>
+        <w:rPr>
+          <w:rFonts w:ascii="Courier New" w:cs="Courier New" w:eastAsia="Courier New" w:hAnsi="Courier New"/>
+          <w:sz w:val="18"/>
+          <w:szCs w:val="18"/>
+          <w:shd w:fill="F2F2F2" w:color="auto" w:val="clear"/>
         </w:rPr>
         <w:t xml:space="preserve">    if low &gt; high: return -1</w:t>
       </w:r>
     </w:p>
     <w:p>
       <w:pPr>
-        <w:spacing w:after="0" w:line="240" w:lineRule="auto"/>
-      </w:pPr>
-      <w:r>
-        <w:rPr>
-          <w:rFonts w:ascii="Courier New" w:cs="Courier New" w:eastAsia="Courier New" w:hAnsi="Courier New"/>
-          <w:sz w:val="20"/>
-          <w:szCs w:val="20"/>
+        <w:pBdr>
+          <w:left w:val="single" w:color="4472C4" w:sz="12" w:space="4"/>
+        </w:pBdr>
+        <w:shd w:fill="F2F2F2" w:color="auto" w:val="clear"/>
+        <w:spacing w:after="0" w:line="240" w:lineRule="auto"/>
+        <w:ind w:left="283"/>
+      </w:pPr>
+      <w:r>
+        <w:rPr>
+          <w:rFonts w:ascii="Courier New" w:cs="Courier New" w:eastAsia="Courier New" w:hAnsi="Courier New"/>
+          <w:sz w:val="18"/>
+          <w:szCs w:val="18"/>
+          <w:shd w:fill="F2F2F2" w:color="auto" w:val="clear"/>
         </w:rPr>
         <w:t xml:space="preserve">    mid = floor((low + high) / 2)</w:t>
       </w:r>
     </w:p>
     <w:p>
       <w:pPr>
-        <w:spacing w:after="0" w:line="240" w:lineRule="auto"/>
-      </w:pPr>
-      <w:r>
-        <w:rPr>
-          <w:rFonts w:ascii="Courier New" w:cs="Courier New" w:eastAsia="Courier New" w:hAnsi="Courier New"/>
-          <w:sz w:val="20"/>
-          <w:szCs w:val="20"/>
+        <w:pBdr>
+          <w:left w:val="single" w:color="4472C4" w:sz="12" w:space="4"/>
+        </w:pBdr>
+        <w:shd w:fill="F2F2F2" w:color="auto" w:val="clear"/>
+        <w:spacing w:after="0" w:line="240" w:lineRule="auto"/>
+        <w:ind w:left="283"/>
+      </w:pPr>
+      <w:r>
+        <w:rPr>
+          <w:rFonts w:ascii="Courier New" w:cs="Courier New" w:eastAsia="Courier New" w:hAnsi="Courier New"/>
+          <w:sz w:val="18"/>
+          <w:szCs w:val="18"/>
+          <w:shd w:fill="F2F2F2" w:color="auto" w:val="clear"/>
         </w:rPr>
         <w:t xml:space="preserve">    if arr[mid] == target: return mid</w:t>
       </w:r>
     </w:p>
     <w:p>
       <w:pPr>
-        <w:spacing w:after="0" w:line="240" w:lineRule="auto"/>
-      </w:pPr>
-      <w:r>
-        <w:rPr>
-          <w:rFonts w:ascii="Courier New" w:cs="Courier New" w:eastAsia="Courier New" w:hAnsi="Courier New"/>
-          <w:sz w:val="20"/>
-          <w:szCs w:val="20"/>
+        <w:pBdr>
+          <w:left w:val="single" w:color="4472C4" w:sz="12" w:space="4"/>
+        </w:pBdr>
+        <w:shd w:fill="F2F2F2" w:color="auto" w:val="clear"/>
+        <w:spacing w:after="0" w:line="240" w:lineRule="auto"/>
+        <w:ind w:left="283"/>
+      </w:pPr>
+      <w:r>
+        <w:rPr>
+          <w:rFonts w:ascii="Courier New" w:cs="Courier New" w:eastAsia="Courier New" w:hAnsi="Courier New"/>
+          <w:sz w:val="18"/>
+          <w:szCs w:val="18"/>
+          <w:shd w:fill="F2F2F2" w:color="auto" w:val="clear"/>
         </w:rPr>
         <w:t xml:space="preserve">    if arr[mid] &lt; target:</w:t>
       </w:r>
     </w:p>
     <w:p>
       <w:pPr>
-        <w:spacing w:after="0" w:line="240" w:lineRule="auto"/>
-      </w:pPr>
-      <w:r>
-        <w:rPr>
-          <w:rFonts w:ascii="Courier New" w:cs="Courier New" w:eastAsia="Courier New" w:hAnsi="Courier New"/>
-          <w:sz w:val="20"/>
-          <w:szCs w:val="20"/>
+        <w:pBdr>
+          <w:left w:val="single" w:color="4472C4" w:sz="12" w:space="4"/>
+        </w:pBdr>
+        <w:shd w:fill="F2F2F2" w:color="auto" w:val="clear"/>
+        <w:spacing w:after="0" w:line="240" w:lineRule="auto"/>
+        <w:ind w:left="283"/>
+      </w:pPr>
+      <w:r>
+        <w:rPr>
+          <w:rFonts w:ascii="Courier New" w:cs="Courier New" w:eastAsia="Courier New" w:hAnsi="Courier New"/>
+          <w:sz w:val="18"/>
+          <w:szCs w:val="18"/>
+          <w:shd w:fill="F2F2F2" w:color="auto" w:val="clear"/>
         </w:rPr>
         <w:t xml:space="preserve">        return binarySearchRecursive(arr, target, mid+1, high)</w:t>
       </w:r>
     </w:p>
     <w:p>
       <w:pPr>
-        <w:spacing w:after="0" w:line="240" w:lineRule="auto"/>
-      </w:pPr>
-      <w:r>
-        <w:rPr>
-          <w:rFonts w:ascii="Courier New" w:cs="Courier New" w:eastAsia="Courier New" w:hAnsi="Courier New"/>
-          <w:sz w:val="20"/>
-          <w:szCs w:val="20"/>
+        <w:pBdr>
+          <w:left w:val="single" w:color="4472C4" w:sz="12" w:space="4"/>
+        </w:pBdr>
+        <w:shd w:fill="F2F2F2" w:color="auto" w:val="clear"/>
+        <w:spacing w:after="0" w:line="240" w:lineRule="auto"/>
+        <w:ind w:left="283"/>
+      </w:pPr>
+      <w:r>
+        <w:rPr>
+          <w:rFonts w:ascii="Courier New" w:cs="Courier New" w:eastAsia="Courier New" w:hAnsi="Courier New"/>
+          <w:sz w:val="18"/>
+          <w:szCs w:val="18"/>
+          <w:shd w:fill="F2F2F2" w:color="auto" w:val="clear"/>
         </w:rPr>
         <w:t xml:space="preserve">    return binarySearchRecursive(arr, target, low, mid-1)</w:t>
       </w:r>
@@ -869,6 +996,7 @@
     <w:p>
       <w:pPr>
         <w:pStyle w:val="Heading2"/>
+        <w:keepNext/>
         <w:spacing w:after="60" w:before="120" w:line="360" w:lineRule="auto"/>
         <w:ind w:firstLine="709"/>
       </w:pPr>
@@ -915,39 +1043,57 @@
     </w:p>
     <w:p>
       <w:pPr>
-        <w:spacing w:after="0" w:line="240" w:lineRule="auto"/>
-      </w:pPr>
-      <w:r>
-        <w:rPr>
-          <w:rFonts w:ascii="Courier New" w:cs="Courier New" w:eastAsia="Courier New" w:hAnsi="Courier New"/>
-          <w:sz w:val="20"/>
-          <w:szCs w:val="20"/>
+        <w:pBdr>
+          <w:left w:val="single" w:color="4472C4" w:sz="12" w:space="4"/>
+        </w:pBdr>
+        <w:shd w:fill="F2F2F2" w:color="auto" w:val="clear"/>
+        <w:spacing w:after="0" w:line="240" w:lineRule="auto"/>
+        <w:ind w:left="283"/>
+      </w:pPr>
+      <w:r>
+        <w:rPr>
+          <w:rFonts w:ascii="Courier New" w:cs="Courier New" w:eastAsia="Courier New" w:hAnsi="Courier New"/>
+          <w:sz w:val="18"/>
+          <w:szCs w:val="18"/>
+          <w:shd w:fill="F2F2F2" w:color="auto" w:val="clear"/>
         </w:rPr>
         <w:t xml:space="preserve">Рядок 1: for i = 0 to n-1       — вартість c1, виконується n разів</w:t>
       </w:r>
     </w:p>
     <w:p>
       <w:pPr>
-        <w:spacing w:after="0" w:line="240" w:lineRule="auto"/>
-      </w:pPr>
-      <w:r>
-        <w:rPr>
-          <w:rFonts w:ascii="Courier New" w:cs="Courier New" w:eastAsia="Courier New" w:hAnsi="Courier New"/>
-          <w:sz w:val="20"/>
-          <w:szCs w:val="20"/>
+        <w:pBdr>
+          <w:left w:val="single" w:color="4472C4" w:sz="12" w:space="4"/>
+        </w:pBdr>
+        <w:shd w:fill="F2F2F2" w:color="auto" w:val="clear"/>
+        <w:spacing w:after="0" w:line="240" w:lineRule="auto"/>
+        <w:ind w:left="283"/>
+      </w:pPr>
+      <w:r>
+        <w:rPr>
+          <w:rFonts w:ascii="Courier New" w:cs="Courier New" w:eastAsia="Courier New" w:hAnsi="Courier New"/>
+          <w:sz w:val="18"/>
+          <w:szCs w:val="18"/>
+          <w:shd w:fill="F2F2F2" w:color="auto" w:val="clear"/>
         </w:rPr>
         <w:t xml:space="preserve">Рядок 2:     if arr[i] == target  — вартість c2, виконується n разів</w:t>
       </w:r>
     </w:p>
     <w:p>
       <w:pPr>
-        <w:spacing w:after="0" w:line="240" w:lineRule="auto"/>
-      </w:pPr>
-      <w:r>
-        <w:rPr>
-          <w:rFonts w:ascii="Courier New" w:cs="Courier New" w:eastAsia="Courier New" w:hAnsi="Courier New"/>
-          <w:sz w:val="20"/>
-          <w:szCs w:val="20"/>
+        <w:pBdr>
+          <w:left w:val="single" w:color="4472C4" w:sz="12" w:space="4"/>
+        </w:pBdr>
+        <w:shd w:fill="F2F2F2" w:color="auto" w:val="clear"/>
+        <w:spacing w:after="0" w:line="240" w:lineRule="auto"/>
+        <w:ind w:left="283"/>
+      </w:pPr>
+      <w:r>
+        <w:rPr>
+          <w:rFonts w:ascii="Courier New" w:cs="Courier New" w:eastAsia="Courier New" w:hAnsi="Courier New"/>
+          <w:sz w:val="18"/>
+          <w:szCs w:val="18"/>
+          <w:shd w:fill="F2F2F2" w:color="auto" w:val="clear"/>
         </w:rPr>
         <w:t xml:space="preserve">Рядок 3: return -1                — вартість c3, виконується 1 раз</w:t>
       </w:r>
@@ -1108,91 +1254,133 @@
     </w:p>
     <w:p>
       <w:pPr>
-        <w:spacing w:after="0" w:line="240" w:lineRule="auto"/>
-      </w:pPr>
-      <w:r>
-        <w:rPr>
-          <w:rFonts w:ascii="Courier New" w:cs="Courier New" w:eastAsia="Courier New" w:hAnsi="Courier New"/>
-          <w:sz w:val="20"/>
-          <w:szCs w:val="20"/>
+        <w:pBdr>
+          <w:left w:val="single" w:color="4472C4" w:sz="12" w:space="4"/>
+        </w:pBdr>
+        <w:shd w:fill="F2F2F2" w:color="auto" w:val="clear"/>
+        <w:spacing w:after="0" w:line="240" w:lineRule="auto"/>
+        <w:ind w:left="283"/>
+      </w:pPr>
+      <w:r>
+        <w:rPr>
+          <w:rFonts w:ascii="Courier New" w:cs="Courier New" w:eastAsia="Courier New" w:hAnsi="Courier New"/>
+          <w:sz w:val="18"/>
+          <w:szCs w:val="18"/>
+          <w:shd w:fill="F2F2F2" w:color="auto" w:val="clear"/>
         </w:rPr>
         <w:t xml:space="preserve">Рядок 1: low = 0, high = n-1             — вартість c1, виконується 1 раз</w:t>
       </w:r>
     </w:p>
     <w:p>
       <w:pPr>
-        <w:spacing w:after="0" w:line="240" w:lineRule="auto"/>
-      </w:pPr>
-      <w:r>
-        <w:rPr>
-          <w:rFonts w:ascii="Courier New" w:cs="Courier New" w:eastAsia="Courier New" w:hAnsi="Courier New"/>
-          <w:sz w:val="20"/>
-          <w:szCs w:val="20"/>
+        <w:pBdr>
+          <w:left w:val="single" w:color="4472C4" w:sz="12" w:space="4"/>
+        </w:pBdr>
+        <w:shd w:fill="F2F2F2" w:color="auto" w:val="clear"/>
+        <w:spacing w:after="0" w:line="240" w:lineRule="auto"/>
+        <w:ind w:left="283"/>
+      </w:pPr>
+      <w:r>
+        <w:rPr>
+          <w:rFonts w:ascii="Courier New" w:cs="Courier New" w:eastAsia="Courier New" w:hAnsi="Courier New"/>
+          <w:sz w:val="18"/>
+          <w:szCs w:val="18"/>
+          <w:shd w:fill="F2F2F2" w:color="auto" w:val="clear"/>
         </w:rPr>
         <w:t xml:space="preserve">Рядок 2: while low &lt;= high                — вартість c2, виконується k + 1 разів</w:t>
       </w:r>
     </w:p>
     <w:p>
       <w:pPr>
-        <w:spacing w:after="0" w:line="240" w:lineRule="auto"/>
-      </w:pPr>
-      <w:r>
-        <w:rPr>
-          <w:rFonts w:ascii="Courier New" w:cs="Courier New" w:eastAsia="Courier New" w:hAnsi="Courier New"/>
-          <w:sz w:val="20"/>
-          <w:szCs w:val="20"/>
+        <w:pBdr>
+          <w:left w:val="single" w:color="4472C4" w:sz="12" w:space="4"/>
+        </w:pBdr>
+        <w:shd w:fill="F2F2F2" w:color="auto" w:val="clear"/>
+        <w:spacing w:after="0" w:line="240" w:lineRule="auto"/>
+        <w:ind w:left="283"/>
+      </w:pPr>
+      <w:r>
+        <w:rPr>
+          <w:rFonts w:ascii="Courier New" w:cs="Courier New" w:eastAsia="Courier New" w:hAnsi="Courier New"/>
+          <w:sz w:val="18"/>
+          <w:szCs w:val="18"/>
+          <w:shd w:fill="F2F2F2" w:color="auto" w:val="clear"/>
         </w:rPr>
         <w:t xml:space="preserve">Рядок 3:     mid = floor((low+high)/2)    — вартість c3, виконується k разів</w:t>
       </w:r>
     </w:p>
     <w:p>
       <w:pPr>
-        <w:spacing w:after="0" w:line="240" w:lineRule="auto"/>
-      </w:pPr>
-      <w:r>
-        <w:rPr>
-          <w:rFonts w:ascii="Courier New" w:cs="Courier New" w:eastAsia="Courier New" w:hAnsi="Courier New"/>
-          <w:sz w:val="20"/>
-          <w:szCs w:val="20"/>
+        <w:pBdr>
+          <w:left w:val="single" w:color="4472C4" w:sz="12" w:space="4"/>
+        </w:pBdr>
+        <w:shd w:fill="F2F2F2" w:color="auto" w:val="clear"/>
+        <w:spacing w:after="0" w:line="240" w:lineRule="auto"/>
+        <w:ind w:left="283"/>
+      </w:pPr>
+      <w:r>
+        <w:rPr>
+          <w:rFonts w:ascii="Courier New" w:cs="Courier New" w:eastAsia="Courier New" w:hAnsi="Courier New"/>
+          <w:sz w:val="18"/>
+          <w:szCs w:val="18"/>
+          <w:shd w:fill="F2F2F2" w:color="auto" w:val="clear"/>
         </w:rPr>
         <w:t xml:space="preserve">Рядок 4:     if arr[mid] == target         — вартість c4, виконується k разів</w:t>
       </w:r>
     </w:p>
     <w:p>
       <w:pPr>
-        <w:spacing w:after="0" w:line="240" w:lineRule="auto"/>
-      </w:pPr>
-      <w:r>
-        <w:rPr>
-          <w:rFonts w:ascii="Courier New" w:cs="Courier New" w:eastAsia="Courier New" w:hAnsi="Courier New"/>
-          <w:sz w:val="20"/>
-          <w:szCs w:val="20"/>
+        <w:pBdr>
+          <w:left w:val="single" w:color="4472C4" w:sz="12" w:space="4"/>
+        </w:pBdr>
+        <w:shd w:fill="F2F2F2" w:color="auto" w:val="clear"/>
+        <w:spacing w:after="0" w:line="240" w:lineRule="auto"/>
+        <w:ind w:left="283"/>
+      </w:pPr>
+      <w:r>
+        <w:rPr>
+          <w:rFonts w:ascii="Courier New" w:cs="Courier New" w:eastAsia="Courier New" w:hAnsi="Courier New"/>
+          <w:sz w:val="18"/>
+          <w:szCs w:val="18"/>
+          <w:shd w:fill="F2F2F2" w:color="auto" w:val="clear"/>
         </w:rPr>
         <w:t xml:space="preserve">Рядок 5:     if arr[mid] &lt; target          — вартість c5, виконується k разів</w:t>
       </w:r>
     </w:p>
     <w:p>
       <w:pPr>
-        <w:spacing w:after="0" w:line="240" w:lineRule="auto"/>
-      </w:pPr>
-      <w:r>
-        <w:rPr>
-          <w:rFonts w:ascii="Courier New" w:cs="Courier New" w:eastAsia="Courier New" w:hAnsi="Courier New"/>
-          <w:sz w:val="20"/>
-          <w:szCs w:val="20"/>
+        <w:pBdr>
+          <w:left w:val="single" w:color="4472C4" w:sz="12" w:space="4"/>
+        </w:pBdr>
+        <w:shd w:fill="F2F2F2" w:color="auto" w:val="clear"/>
+        <w:spacing w:after="0" w:line="240" w:lineRule="auto"/>
+        <w:ind w:left="283"/>
+      </w:pPr>
+      <w:r>
+        <w:rPr>
+          <w:rFonts w:ascii="Courier New" w:cs="Courier New" w:eastAsia="Courier New" w:hAnsi="Courier New"/>
+          <w:sz w:val="18"/>
+          <w:szCs w:val="18"/>
+          <w:shd w:fill="F2F2F2" w:color="auto" w:val="clear"/>
         </w:rPr>
         <w:t xml:space="preserve">Рядок 6:         low = mid+1 / high=mid-1  — вартість c6, виконується k разів</w:t>
       </w:r>
     </w:p>
     <w:p>
       <w:pPr>
-        <w:spacing w:after="0" w:line="240" w:lineRule="auto"/>
-      </w:pPr>
-      <w:r>
-        <w:rPr>
-          <w:rFonts w:ascii="Courier New" w:cs="Courier New" w:eastAsia="Courier New" w:hAnsi="Courier New"/>
-          <w:sz w:val="20"/>
-          <w:szCs w:val="20"/>
+        <w:pBdr>
+          <w:left w:val="single" w:color="4472C4" w:sz="12" w:space="4"/>
+        </w:pBdr>
+        <w:shd w:fill="F2F2F2" w:color="auto" w:val="clear"/>
+        <w:spacing w:after="0" w:line="240" w:lineRule="auto"/>
+        <w:ind w:left="283"/>
+      </w:pPr>
+      <w:r>
+        <w:rPr>
+          <w:rFonts w:ascii="Courier New" w:cs="Courier New" w:eastAsia="Courier New" w:hAnsi="Courier New"/>
+          <w:sz w:val="18"/>
+          <w:szCs w:val="18"/>
+          <w:shd w:fill="F2F2F2" w:color="auto" w:val="clear"/>
         </w:rPr>
         <w:t xml:space="preserve">Рядок 7: return -1                         — вартість c7, виконується 1 раз</w:t>
       </w:r>
@@ -1471,6 +1659,7 @@
     <w:p>
       <w:pPr>
         <w:pStyle w:val="Heading2"/>
+        <w:keepNext/>
         <w:spacing w:after="60" w:before="120" w:line="360" w:lineRule="auto"/>
         <w:ind w:firstLine="709"/>
       </w:pPr>
@@ -1709,6 +1898,7 @@
     <w:p>
       <w:pPr>
         <w:pStyle w:val="Heading1"/>
+        <w:keepNext/>
         <w:pageBreakBefore/>
         <w:spacing w:after="120" w:before="240" w:line="360" w:lineRule="auto"/>
       </w:pPr>
@@ -1740,6 +1930,7 @@
     </w:p>
     <w:p>
       <w:pPr>
+        <w:keepNext/>
         <w:spacing w:after="60" w:before="120" w:line="360" w:lineRule="auto"/>
         <w:ind w:firstLine="709"/>
       </w:pPr>
@@ -1934,7 +2125,7 @@
                 <w:sz w:val="28"/>
                 <w:szCs w:val="28"/>
               </w:rPr>
-              <w:t xml:space="preserve">0.0006</w:t>
+              <w:t xml:space="preserve">0.0007</w:t>
             </w:r>
           </w:p>
         </w:tc>
@@ -2138,7 +2329,7 @@
                 <w:sz w:val="28"/>
                 <w:szCs w:val="28"/>
               </w:rPr>
-              <w:t xml:space="preserve">0.0597</w:t>
+              <w:t xml:space="preserve">0.0584</w:t>
             </w:r>
           </w:p>
         </w:tc>
@@ -2188,7 +2379,7 @@
                 <w:sz w:val="28"/>
                 <w:szCs w:val="28"/>
               </w:rPr>
-              <w:t xml:space="preserve">0.0002</w:t>
+              <w:t xml:space="preserve">0.0001</w:t>
             </w:r>
           </w:p>
         </w:tc>
@@ -2240,7 +2431,7 @@
                 <w:sz w:val="28"/>
                 <w:szCs w:val="28"/>
               </w:rPr>
-              <w:t xml:space="preserve">0.6013</w:t>
+              <w:t xml:space="preserve">0.5852</w:t>
             </w:r>
           </w:p>
         </w:tc>
@@ -2342,7 +2533,7 @@
                 <w:sz w:val="28"/>
                 <w:szCs w:val="28"/>
               </w:rPr>
-              <w:t xml:space="preserve">6.1145</w:t>
+              <w:t xml:space="preserve">5.8728</w:t>
             </w:r>
           </w:p>
         </w:tc>
@@ -2392,7 +2583,7 @@
                 <w:sz w:val="28"/>
                 <w:szCs w:val="28"/>
               </w:rPr>
-              <w:t xml:space="preserve">0.0003</w:t>
+              <w:t xml:space="preserve">0.0002</w:t>
             </w:r>
           </w:p>
         </w:tc>
@@ -2416,6 +2607,7 @@
     <w:p>
       <w:pPr>
         <w:pStyle w:val="Heading1"/>
+        <w:keepNext/>
         <w:pageBreakBefore/>
         <w:spacing w:after="120" w:before="240" w:line="360" w:lineRule="auto"/>
       </w:pPr>
@@ -2448,6 +2640,7 @@
     <w:p>
       <w:pPr>
         <w:pStyle w:val="Heading1"/>
+        <w:keepNext/>
         <w:pageBreakBefore/>
         <w:spacing w:after="120" w:before="240" w:line="360" w:lineRule="auto"/>
       </w:pPr>
@@ -2496,6 +2689,7 @@
     </w:p>
     <w:p>
       <w:pPr>
+        <w:keepNext/>
         <w:spacing w:after="60" w:before="120" w:line="360" w:lineRule="auto"/>
         <w:ind w:firstLine="709"/>
       </w:pPr>
@@ -2510,234 +2704,342 @@
     </w:p>
     <w:p>
       <w:pPr>
-        <w:spacing w:after="0" w:line="240" w:lineRule="auto"/>
-      </w:pPr>
-      <w:r>
-        <w:rPr>
-          <w:rFonts w:ascii="Courier New" w:cs="Courier New" w:eastAsia="Courier New" w:hAnsi="Courier New"/>
-          <w:sz w:val="20"/>
-          <w:szCs w:val="20"/>
+        <w:pBdr>
+          <w:left w:val="single" w:color="4472C4" w:sz="12" w:space="4"/>
+        </w:pBdr>
+        <w:shd w:fill="F2F2F2" w:color="auto" w:val="clear"/>
+        <w:spacing w:after="0" w:line="240" w:lineRule="auto"/>
+        <w:ind w:left="283"/>
+      </w:pPr>
+      <w:r>
+        <w:rPr>
+          <w:rFonts w:ascii="Courier New" w:cs="Courier New" w:eastAsia="Courier New" w:hAnsi="Courier New"/>
+          <w:sz w:val="18"/>
+          <w:szCs w:val="18"/>
+          <w:shd w:fill="F2F2F2" w:color="auto" w:val="clear"/>
         </w:rPr>
         <w:t xml:space="preserve">export function binarySearchIterative(arr: number[], target: number): number {</w:t>
       </w:r>
     </w:p>
     <w:p>
       <w:pPr>
-        <w:spacing w:after="0" w:line="240" w:lineRule="auto"/>
-      </w:pPr>
-      <w:r>
-        <w:rPr>
-          <w:rFonts w:ascii="Courier New" w:cs="Courier New" w:eastAsia="Courier New" w:hAnsi="Courier New"/>
-          <w:sz w:val="20"/>
-          <w:szCs w:val="20"/>
+        <w:pBdr>
+          <w:left w:val="single" w:color="4472C4" w:sz="12" w:space="4"/>
+        </w:pBdr>
+        <w:shd w:fill="F2F2F2" w:color="auto" w:val="clear"/>
+        <w:spacing w:after="0" w:line="240" w:lineRule="auto"/>
+        <w:ind w:left="283"/>
+      </w:pPr>
+      <w:r>
+        <w:rPr>
+          <w:rFonts w:ascii="Courier New" w:cs="Courier New" w:eastAsia="Courier New" w:hAnsi="Courier New"/>
+          <w:sz w:val="18"/>
+          <w:szCs w:val="18"/>
+          <w:shd w:fill="F2F2F2" w:color="auto" w:val="clear"/>
         </w:rPr>
         <w:t xml:space="preserve">  let low = 0;</w:t>
       </w:r>
     </w:p>
     <w:p>
       <w:pPr>
-        <w:spacing w:after="0" w:line="240" w:lineRule="auto"/>
-      </w:pPr>
-      <w:r>
-        <w:rPr>
-          <w:rFonts w:ascii="Courier New" w:cs="Courier New" w:eastAsia="Courier New" w:hAnsi="Courier New"/>
-          <w:sz w:val="20"/>
-          <w:szCs w:val="20"/>
+        <w:pBdr>
+          <w:left w:val="single" w:color="4472C4" w:sz="12" w:space="4"/>
+        </w:pBdr>
+        <w:shd w:fill="F2F2F2" w:color="auto" w:val="clear"/>
+        <w:spacing w:after="0" w:line="240" w:lineRule="auto"/>
+        <w:ind w:left="283"/>
+      </w:pPr>
+      <w:r>
+        <w:rPr>
+          <w:rFonts w:ascii="Courier New" w:cs="Courier New" w:eastAsia="Courier New" w:hAnsi="Courier New"/>
+          <w:sz w:val="18"/>
+          <w:szCs w:val="18"/>
+          <w:shd w:fill="F2F2F2" w:color="auto" w:val="clear"/>
         </w:rPr>
         <w:t xml:space="preserve">  let high = arr.length - 1;</w:t>
       </w:r>
     </w:p>
     <w:p>
       <w:pPr>
-        <w:spacing w:after="0" w:line="240" w:lineRule="auto"/>
-      </w:pPr>
-      <w:r>
-        <w:rPr>
-          <w:rFonts w:ascii="Courier New" w:cs="Courier New" w:eastAsia="Courier New" w:hAnsi="Courier New"/>
-          <w:sz w:val="20"/>
-          <w:szCs w:val="20"/>
-        </w:rPr>
-        <w:t xml:space="preserve"/>
-      </w:r>
-    </w:p>
-    <w:p>
-      <w:pPr>
-        <w:spacing w:after="0" w:line="240" w:lineRule="auto"/>
-      </w:pPr>
-      <w:r>
-        <w:rPr>
-          <w:rFonts w:ascii="Courier New" w:cs="Courier New" w:eastAsia="Courier New" w:hAnsi="Courier New"/>
-          <w:sz w:val="20"/>
-          <w:szCs w:val="20"/>
+        <w:pBdr>
+          <w:left w:val="single" w:color="4472C4" w:sz="12" w:space="4"/>
+        </w:pBdr>
+        <w:shd w:fill="F2F2F2" w:color="auto" w:val="clear"/>
+        <w:spacing w:after="0" w:line="240" w:lineRule="auto"/>
+        <w:ind w:left="283"/>
+      </w:pPr>
+      <w:r>
+        <w:rPr>
+          <w:rFonts w:ascii="Courier New" w:cs="Courier New" w:eastAsia="Courier New" w:hAnsi="Courier New"/>
+          <w:sz w:val="18"/>
+          <w:szCs w:val="18"/>
+          <w:shd w:fill="F2F2F2" w:color="auto" w:val="clear"/>
+        </w:rPr>
+        <w:t xml:space="preserve"> </w:t>
+      </w:r>
+    </w:p>
+    <w:p>
+      <w:pPr>
+        <w:pBdr>
+          <w:left w:val="single" w:color="4472C4" w:sz="12" w:space="4"/>
+        </w:pBdr>
+        <w:shd w:fill="F2F2F2" w:color="auto" w:val="clear"/>
+        <w:spacing w:after="0" w:line="240" w:lineRule="auto"/>
+        <w:ind w:left="283"/>
+      </w:pPr>
+      <w:r>
+        <w:rPr>
+          <w:rFonts w:ascii="Courier New" w:cs="Courier New" w:eastAsia="Courier New" w:hAnsi="Courier New"/>
+          <w:sz w:val="18"/>
+          <w:szCs w:val="18"/>
+          <w:shd w:fill="F2F2F2" w:color="auto" w:val="clear"/>
         </w:rPr>
         <w:t xml:space="preserve">  while (low &lt;= high) {</w:t>
       </w:r>
     </w:p>
     <w:p>
       <w:pPr>
-        <w:spacing w:after="0" w:line="240" w:lineRule="auto"/>
-      </w:pPr>
-      <w:r>
-        <w:rPr>
-          <w:rFonts w:ascii="Courier New" w:cs="Courier New" w:eastAsia="Courier New" w:hAnsi="Courier New"/>
-          <w:sz w:val="20"/>
-          <w:szCs w:val="20"/>
+        <w:pBdr>
+          <w:left w:val="single" w:color="4472C4" w:sz="12" w:space="4"/>
+        </w:pBdr>
+        <w:shd w:fill="F2F2F2" w:color="auto" w:val="clear"/>
+        <w:spacing w:after="0" w:line="240" w:lineRule="auto"/>
+        <w:ind w:left="283"/>
+      </w:pPr>
+      <w:r>
+        <w:rPr>
+          <w:rFonts w:ascii="Courier New" w:cs="Courier New" w:eastAsia="Courier New" w:hAnsi="Courier New"/>
+          <w:sz w:val="18"/>
+          <w:szCs w:val="18"/>
+          <w:shd w:fill="F2F2F2" w:color="auto" w:val="clear"/>
         </w:rPr>
         <w:t xml:space="preserve">    const mid = Math.floor((low + high) / 2);</w:t>
       </w:r>
     </w:p>
     <w:p>
       <w:pPr>
-        <w:spacing w:after="0" w:line="240" w:lineRule="auto"/>
-      </w:pPr>
-      <w:r>
-        <w:rPr>
-          <w:rFonts w:ascii="Courier New" w:cs="Courier New" w:eastAsia="Courier New" w:hAnsi="Courier New"/>
-          <w:sz w:val="20"/>
-          <w:szCs w:val="20"/>
+        <w:pBdr>
+          <w:left w:val="single" w:color="4472C4" w:sz="12" w:space="4"/>
+        </w:pBdr>
+        <w:shd w:fill="F2F2F2" w:color="auto" w:val="clear"/>
+        <w:spacing w:after="0" w:line="240" w:lineRule="auto"/>
+        <w:ind w:left="283"/>
+      </w:pPr>
+      <w:r>
+        <w:rPr>
+          <w:rFonts w:ascii="Courier New" w:cs="Courier New" w:eastAsia="Courier New" w:hAnsi="Courier New"/>
+          <w:sz w:val="18"/>
+          <w:szCs w:val="18"/>
+          <w:shd w:fill="F2F2F2" w:color="auto" w:val="clear"/>
         </w:rPr>
         <w:t xml:space="preserve">    if (arr[mid] === target) {</w:t>
       </w:r>
     </w:p>
     <w:p>
       <w:pPr>
-        <w:spacing w:after="0" w:line="240" w:lineRule="auto"/>
-      </w:pPr>
-      <w:r>
-        <w:rPr>
-          <w:rFonts w:ascii="Courier New" w:cs="Courier New" w:eastAsia="Courier New" w:hAnsi="Courier New"/>
-          <w:sz w:val="20"/>
-          <w:szCs w:val="20"/>
+        <w:pBdr>
+          <w:left w:val="single" w:color="4472C4" w:sz="12" w:space="4"/>
+        </w:pBdr>
+        <w:shd w:fill="F2F2F2" w:color="auto" w:val="clear"/>
+        <w:spacing w:after="0" w:line="240" w:lineRule="auto"/>
+        <w:ind w:left="283"/>
+      </w:pPr>
+      <w:r>
+        <w:rPr>
+          <w:rFonts w:ascii="Courier New" w:cs="Courier New" w:eastAsia="Courier New" w:hAnsi="Courier New"/>
+          <w:sz w:val="18"/>
+          <w:szCs w:val="18"/>
+          <w:shd w:fill="F2F2F2" w:color="auto" w:val="clear"/>
         </w:rPr>
         <w:t xml:space="preserve">      return mid;</w:t>
       </w:r>
     </w:p>
     <w:p>
       <w:pPr>
-        <w:spacing w:after="0" w:line="240" w:lineRule="auto"/>
-      </w:pPr>
-      <w:r>
-        <w:rPr>
-          <w:rFonts w:ascii="Courier New" w:cs="Courier New" w:eastAsia="Courier New" w:hAnsi="Courier New"/>
-          <w:sz w:val="20"/>
-          <w:szCs w:val="20"/>
+        <w:pBdr>
+          <w:left w:val="single" w:color="4472C4" w:sz="12" w:space="4"/>
+        </w:pBdr>
+        <w:shd w:fill="F2F2F2" w:color="auto" w:val="clear"/>
+        <w:spacing w:after="0" w:line="240" w:lineRule="auto"/>
+        <w:ind w:left="283"/>
+      </w:pPr>
+      <w:r>
+        <w:rPr>
+          <w:rFonts w:ascii="Courier New" w:cs="Courier New" w:eastAsia="Courier New" w:hAnsi="Courier New"/>
+          <w:sz w:val="18"/>
+          <w:szCs w:val="18"/>
+          <w:shd w:fill="F2F2F2" w:color="auto" w:val="clear"/>
         </w:rPr>
         <w:t xml:space="preserve">    }</w:t>
       </w:r>
     </w:p>
     <w:p>
       <w:pPr>
-        <w:spacing w:after="0" w:line="240" w:lineRule="auto"/>
-      </w:pPr>
-      <w:r>
-        <w:rPr>
-          <w:rFonts w:ascii="Courier New" w:cs="Courier New" w:eastAsia="Courier New" w:hAnsi="Courier New"/>
-          <w:sz w:val="20"/>
-          <w:szCs w:val="20"/>
+        <w:pBdr>
+          <w:left w:val="single" w:color="4472C4" w:sz="12" w:space="4"/>
+        </w:pBdr>
+        <w:shd w:fill="F2F2F2" w:color="auto" w:val="clear"/>
+        <w:spacing w:after="0" w:line="240" w:lineRule="auto"/>
+        <w:ind w:left="283"/>
+      </w:pPr>
+      <w:r>
+        <w:rPr>
+          <w:rFonts w:ascii="Courier New" w:cs="Courier New" w:eastAsia="Courier New" w:hAnsi="Courier New"/>
+          <w:sz w:val="18"/>
+          <w:szCs w:val="18"/>
+          <w:shd w:fill="F2F2F2" w:color="auto" w:val="clear"/>
         </w:rPr>
         <w:t xml:space="preserve">    if (arr[mid] &lt; target) {</w:t>
       </w:r>
     </w:p>
     <w:p>
       <w:pPr>
-        <w:spacing w:after="0" w:line="240" w:lineRule="auto"/>
-      </w:pPr>
-      <w:r>
-        <w:rPr>
-          <w:rFonts w:ascii="Courier New" w:cs="Courier New" w:eastAsia="Courier New" w:hAnsi="Courier New"/>
-          <w:sz w:val="20"/>
-          <w:szCs w:val="20"/>
+        <w:pBdr>
+          <w:left w:val="single" w:color="4472C4" w:sz="12" w:space="4"/>
+        </w:pBdr>
+        <w:shd w:fill="F2F2F2" w:color="auto" w:val="clear"/>
+        <w:spacing w:after="0" w:line="240" w:lineRule="auto"/>
+        <w:ind w:left="283"/>
+      </w:pPr>
+      <w:r>
+        <w:rPr>
+          <w:rFonts w:ascii="Courier New" w:cs="Courier New" w:eastAsia="Courier New" w:hAnsi="Courier New"/>
+          <w:sz w:val="18"/>
+          <w:szCs w:val="18"/>
+          <w:shd w:fill="F2F2F2" w:color="auto" w:val="clear"/>
         </w:rPr>
         <w:t xml:space="preserve">      low = mid + 1;</w:t>
       </w:r>
     </w:p>
     <w:p>
       <w:pPr>
-        <w:spacing w:after="0" w:line="240" w:lineRule="auto"/>
-      </w:pPr>
-      <w:r>
-        <w:rPr>
-          <w:rFonts w:ascii="Courier New" w:cs="Courier New" w:eastAsia="Courier New" w:hAnsi="Courier New"/>
-          <w:sz w:val="20"/>
-          <w:szCs w:val="20"/>
+        <w:pBdr>
+          <w:left w:val="single" w:color="4472C4" w:sz="12" w:space="4"/>
+        </w:pBdr>
+        <w:shd w:fill="F2F2F2" w:color="auto" w:val="clear"/>
+        <w:spacing w:after="0" w:line="240" w:lineRule="auto"/>
+        <w:ind w:left="283"/>
+      </w:pPr>
+      <w:r>
+        <w:rPr>
+          <w:rFonts w:ascii="Courier New" w:cs="Courier New" w:eastAsia="Courier New" w:hAnsi="Courier New"/>
+          <w:sz w:val="18"/>
+          <w:szCs w:val="18"/>
+          <w:shd w:fill="F2F2F2" w:color="auto" w:val="clear"/>
         </w:rPr>
         <w:t xml:space="preserve">    } else {</w:t>
       </w:r>
     </w:p>
     <w:p>
       <w:pPr>
-        <w:spacing w:after="0" w:line="240" w:lineRule="auto"/>
-      </w:pPr>
-      <w:r>
-        <w:rPr>
-          <w:rFonts w:ascii="Courier New" w:cs="Courier New" w:eastAsia="Courier New" w:hAnsi="Courier New"/>
-          <w:sz w:val="20"/>
-          <w:szCs w:val="20"/>
+        <w:pBdr>
+          <w:left w:val="single" w:color="4472C4" w:sz="12" w:space="4"/>
+        </w:pBdr>
+        <w:shd w:fill="F2F2F2" w:color="auto" w:val="clear"/>
+        <w:spacing w:after="0" w:line="240" w:lineRule="auto"/>
+        <w:ind w:left="283"/>
+      </w:pPr>
+      <w:r>
+        <w:rPr>
+          <w:rFonts w:ascii="Courier New" w:cs="Courier New" w:eastAsia="Courier New" w:hAnsi="Courier New"/>
+          <w:sz w:val="18"/>
+          <w:szCs w:val="18"/>
+          <w:shd w:fill="F2F2F2" w:color="auto" w:val="clear"/>
         </w:rPr>
         <w:t xml:space="preserve">      high = mid - 1;</w:t>
       </w:r>
     </w:p>
     <w:p>
       <w:pPr>
-        <w:spacing w:after="0" w:line="240" w:lineRule="auto"/>
-      </w:pPr>
-      <w:r>
-        <w:rPr>
-          <w:rFonts w:ascii="Courier New" w:cs="Courier New" w:eastAsia="Courier New" w:hAnsi="Courier New"/>
-          <w:sz w:val="20"/>
-          <w:szCs w:val="20"/>
+        <w:pBdr>
+          <w:left w:val="single" w:color="4472C4" w:sz="12" w:space="4"/>
+        </w:pBdr>
+        <w:shd w:fill="F2F2F2" w:color="auto" w:val="clear"/>
+        <w:spacing w:after="0" w:line="240" w:lineRule="auto"/>
+        <w:ind w:left="283"/>
+      </w:pPr>
+      <w:r>
+        <w:rPr>
+          <w:rFonts w:ascii="Courier New" w:cs="Courier New" w:eastAsia="Courier New" w:hAnsi="Courier New"/>
+          <w:sz w:val="18"/>
+          <w:szCs w:val="18"/>
+          <w:shd w:fill="F2F2F2" w:color="auto" w:val="clear"/>
         </w:rPr>
         <w:t xml:space="preserve">    }</w:t>
       </w:r>
     </w:p>
     <w:p>
       <w:pPr>
-        <w:spacing w:after="0" w:line="240" w:lineRule="auto"/>
-      </w:pPr>
-      <w:r>
-        <w:rPr>
-          <w:rFonts w:ascii="Courier New" w:cs="Courier New" w:eastAsia="Courier New" w:hAnsi="Courier New"/>
-          <w:sz w:val="20"/>
-          <w:szCs w:val="20"/>
+        <w:pBdr>
+          <w:left w:val="single" w:color="4472C4" w:sz="12" w:space="4"/>
+        </w:pBdr>
+        <w:shd w:fill="F2F2F2" w:color="auto" w:val="clear"/>
+        <w:spacing w:after="0" w:line="240" w:lineRule="auto"/>
+        <w:ind w:left="283"/>
+      </w:pPr>
+      <w:r>
+        <w:rPr>
+          <w:rFonts w:ascii="Courier New" w:cs="Courier New" w:eastAsia="Courier New" w:hAnsi="Courier New"/>
+          <w:sz w:val="18"/>
+          <w:szCs w:val="18"/>
+          <w:shd w:fill="F2F2F2" w:color="auto" w:val="clear"/>
         </w:rPr>
         <w:t xml:space="preserve">  }</w:t>
       </w:r>
     </w:p>
     <w:p>
       <w:pPr>
-        <w:spacing w:after="0" w:line="240" w:lineRule="auto"/>
-      </w:pPr>
-      <w:r>
-        <w:rPr>
-          <w:rFonts w:ascii="Courier New" w:cs="Courier New" w:eastAsia="Courier New" w:hAnsi="Courier New"/>
-          <w:sz w:val="20"/>
-          <w:szCs w:val="20"/>
-        </w:rPr>
-        <w:t xml:space="preserve"/>
-      </w:r>
-    </w:p>
-    <w:p>
-      <w:pPr>
-        <w:spacing w:after="0" w:line="240" w:lineRule="auto"/>
-      </w:pPr>
-      <w:r>
-        <w:rPr>
-          <w:rFonts w:ascii="Courier New" w:cs="Courier New" w:eastAsia="Courier New" w:hAnsi="Courier New"/>
-          <w:sz w:val="20"/>
-          <w:szCs w:val="20"/>
+        <w:pBdr>
+          <w:left w:val="single" w:color="4472C4" w:sz="12" w:space="4"/>
+        </w:pBdr>
+        <w:shd w:fill="F2F2F2" w:color="auto" w:val="clear"/>
+        <w:spacing w:after="0" w:line="240" w:lineRule="auto"/>
+        <w:ind w:left="283"/>
+      </w:pPr>
+      <w:r>
+        <w:rPr>
+          <w:rFonts w:ascii="Courier New" w:cs="Courier New" w:eastAsia="Courier New" w:hAnsi="Courier New"/>
+          <w:sz w:val="18"/>
+          <w:szCs w:val="18"/>
+          <w:shd w:fill="F2F2F2" w:color="auto" w:val="clear"/>
+        </w:rPr>
+        <w:t xml:space="preserve"> </w:t>
+      </w:r>
+    </w:p>
+    <w:p>
+      <w:pPr>
+        <w:pBdr>
+          <w:left w:val="single" w:color="4472C4" w:sz="12" w:space="4"/>
+        </w:pBdr>
+        <w:shd w:fill="F2F2F2" w:color="auto" w:val="clear"/>
+        <w:spacing w:after="0" w:line="240" w:lineRule="auto"/>
+        <w:ind w:left="283"/>
+      </w:pPr>
+      <w:r>
+        <w:rPr>
+          <w:rFonts w:ascii="Courier New" w:cs="Courier New" w:eastAsia="Courier New" w:hAnsi="Courier New"/>
+          <w:sz w:val="18"/>
+          <w:szCs w:val="18"/>
+          <w:shd w:fill="F2F2F2" w:color="auto" w:val="clear"/>
         </w:rPr>
         <w:t xml:space="preserve">  return -1;</w:t>
       </w:r>
     </w:p>
     <w:p>
       <w:pPr>
-        <w:spacing w:after="0" w:line="240" w:lineRule="auto"/>
-      </w:pPr>
-      <w:r>
-        <w:rPr>
-          <w:rFonts w:ascii="Courier New" w:cs="Courier New" w:eastAsia="Courier New" w:hAnsi="Courier New"/>
-          <w:sz w:val="20"/>
-          <w:szCs w:val="20"/>
+        <w:pBdr>
+          <w:left w:val="single" w:color="4472C4" w:sz="12" w:space="4"/>
+        </w:pBdr>
+        <w:shd w:fill="F2F2F2" w:color="auto" w:val="clear"/>
+        <w:spacing w:after="0" w:line="240" w:lineRule="auto"/>
+        <w:ind w:left="283"/>
+      </w:pPr>
+      <w:r>
+        <w:rPr>
+          <w:rFonts w:ascii="Courier New" w:cs="Courier New" w:eastAsia="Courier New" w:hAnsi="Courier New"/>
+          <w:sz w:val="18"/>
+          <w:szCs w:val="18"/>
+          <w:shd w:fill="F2F2F2" w:color="auto" w:val="clear"/>
         </w:rPr>
         <w:t xml:space="preserve">}</w:t>
       </w:r>
@@ -2760,6 +3062,7 @@
     </w:p>
     <w:p>
       <w:pPr>
+        <w:keepNext/>
         <w:spacing w:after="60" w:before="120" w:line="360" w:lineRule="auto"/>
         <w:ind w:firstLine="709"/>
       </w:pPr>
@@ -2774,299 +3077,437 @@
     </w:p>
     <w:p>
       <w:pPr>
-        <w:spacing w:after="0" w:line="240" w:lineRule="auto"/>
-      </w:pPr>
-      <w:r>
-        <w:rPr>
-          <w:rFonts w:ascii="Courier New" w:cs="Courier New" w:eastAsia="Courier New" w:hAnsi="Courier New"/>
-          <w:sz w:val="20"/>
-          <w:szCs w:val="20"/>
+        <w:pBdr>
+          <w:left w:val="single" w:color="4472C4" w:sz="12" w:space="4"/>
+        </w:pBdr>
+        <w:shd w:fill="F2F2F2" w:color="auto" w:val="clear"/>
+        <w:spacing w:after="0" w:line="240" w:lineRule="auto"/>
+        <w:ind w:left="283"/>
+      </w:pPr>
+      <w:r>
+        <w:rPr>
+          <w:rFonts w:ascii="Courier New" w:cs="Courier New" w:eastAsia="Courier New" w:hAnsi="Courier New"/>
+          <w:sz w:val="18"/>
+          <w:szCs w:val="18"/>
+          <w:shd w:fill="F2F2F2" w:color="auto" w:val="clear"/>
         </w:rPr>
         <w:t xml:space="preserve">function binarySearchHelper(</w:t>
       </w:r>
     </w:p>
     <w:p>
       <w:pPr>
-        <w:spacing w:after="0" w:line="240" w:lineRule="auto"/>
-      </w:pPr>
-      <w:r>
-        <w:rPr>
-          <w:rFonts w:ascii="Courier New" w:cs="Courier New" w:eastAsia="Courier New" w:hAnsi="Courier New"/>
-          <w:sz w:val="20"/>
-          <w:szCs w:val="20"/>
+        <w:pBdr>
+          <w:left w:val="single" w:color="4472C4" w:sz="12" w:space="4"/>
+        </w:pBdr>
+        <w:shd w:fill="F2F2F2" w:color="auto" w:val="clear"/>
+        <w:spacing w:after="0" w:line="240" w:lineRule="auto"/>
+        <w:ind w:left="283"/>
+      </w:pPr>
+      <w:r>
+        <w:rPr>
+          <w:rFonts w:ascii="Courier New" w:cs="Courier New" w:eastAsia="Courier New" w:hAnsi="Courier New"/>
+          <w:sz w:val="18"/>
+          <w:szCs w:val="18"/>
+          <w:shd w:fill="F2F2F2" w:color="auto" w:val="clear"/>
         </w:rPr>
         <w:t xml:space="preserve">  arr: number[],</w:t>
       </w:r>
     </w:p>
     <w:p>
       <w:pPr>
-        <w:spacing w:after="0" w:line="240" w:lineRule="auto"/>
-      </w:pPr>
-      <w:r>
-        <w:rPr>
-          <w:rFonts w:ascii="Courier New" w:cs="Courier New" w:eastAsia="Courier New" w:hAnsi="Courier New"/>
-          <w:sz w:val="20"/>
-          <w:szCs w:val="20"/>
+        <w:pBdr>
+          <w:left w:val="single" w:color="4472C4" w:sz="12" w:space="4"/>
+        </w:pBdr>
+        <w:shd w:fill="F2F2F2" w:color="auto" w:val="clear"/>
+        <w:spacing w:after="0" w:line="240" w:lineRule="auto"/>
+        <w:ind w:left="283"/>
+      </w:pPr>
+      <w:r>
+        <w:rPr>
+          <w:rFonts w:ascii="Courier New" w:cs="Courier New" w:eastAsia="Courier New" w:hAnsi="Courier New"/>
+          <w:sz w:val="18"/>
+          <w:szCs w:val="18"/>
+          <w:shd w:fill="F2F2F2" w:color="auto" w:val="clear"/>
         </w:rPr>
         <w:t xml:space="preserve">  target: number,</w:t>
       </w:r>
     </w:p>
     <w:p>
       <w:pPr>
-        <w:spacing w:after="0" w:line="240" w:lineRule="auto"/>
-      </w:pPr>
-      <w:r>
-        <w:rPr>
-          <w:rFonts w:ascii="Courier New" w:cs="Courier New" w:eastAsia="Courier New" w:hAnsi="Courier New"/>
-          <w:sz w:val="20"/>
-          <w:szCs w:val="20"/>
+        <w:pBdr>
+          <w:left w:val="single" w:color="4472C4" w:sz="12" w:space="4"/>
+        </w:pBdr>
+        <w:shd w:fill="F2F2F2" w:color="auto" w:val="clear"/>
+        <w:spacing w:after="0" w:line="240" w:lineRule="auto"/>
+        <w:ind w:left="283"/>
+      </w:pPr>
+      <w:r>
+        <w:rPr>
+          <w:rFonts w:ascii="Courier New" w:cs="Courier New" w:eastAsia="Courier New" w:hAnsi="Courier New"/>
+          <w:sz w:val="18"/>
+          <w:szCs w:val="18"/>
+          <w:shd w:fill="F2F2F2" w:color="auto" w:val="clear"/>
         </w:rPr>
         <w:t xml:space="preserve">  low: number,</w:t>
       </w:r>
     </w:p>
     <w:p>
       <w:pPr>
-        <w:spacing w:after="0" w:line="240" w:lineRule="auto"/>
-      </w:pPr>
-      <w:r>
-        <w:rPr>
-          <w:rFonts w:ascii="Courier New" w:cs="Courier New" w:eastAsia="Courier New" w:hAnsi="Courier New"/>
-          <w:sz w:val="20"/>
-          <w:szCs w:val="20"/>
+        <w:pBdr>
+          <w:left w:val="single" w:color="4472C4" w:sz="12" w:space="4"/>
+        </w:pBdr>
+        <w:shd w:fill="F2F2F2" w:color="auto" w:val="clear"/>
+        <w:spacing w:after="0" w:line="240" w:lineRule="auto"/>
+        <w:ind w:left="283"/>
+      </w:pPr>
+      <w:r>
+        <w:rPr>
+          <w:rFonts w:ascii="Courier New" w:cs="Courier New" w:eastAsia="Courier New" w:hAnsi="Courier New"/>
+          <w:sz w:val="18"/>
+          <w:szCs w:val="18"/>
+          <w:shd w:fill="F2F2F2" w:color="auto" w:val="clear"/>
         </w:rPr>
         <w:t xml:space="preserve">  high: number,</w:t>
       </w:r>
     </w:p>
     <w:p>
       <w:pPr>
-        <w:spacing w:after="0" w:line="240" w:lineRule="auto"/>
-      </w:pPr>
-      <w:r>
-        <w:rPr>
-          <w:rFonts w:ascii="Courier New" w:cs="Courier New" w:eastAsia="Courier New" w:hAnsi="Courier New"/>
-          <w:sz w:val="20"/>
-          <w:szCs w:val="20"/>
+        <w:pBdr>
+          <w:left w:val="single" w:color="4472C4" w:sz="12" w:space="4"/>
+        </w:pBdr>
+        <w:shd w:fill="F2F2F2" w:color="auto" w:val="clear"/>
+        <w:spacing w:after="0" w:line="240" w:lineRule="auto"/>
+        <w:ind w:left="283"/>
+      </w:pPr>
+      <w:r>
+        <w:rPr>
+          <w:rFonts w:ascii="Courier New" w:cs="Courier New" w:eastAsia="Courier New" w:hAnsi="Courier New"/>
+          <w:sz w:val="18"/>
+          <w:szCs w:val="18"/>
+          <w:shd w:fill="F2F2F2" w:color="auto" w:val="clear"/>
         </w:rPr>
         <w:t xml:space="preserve">): number {</w:t>
       </w:r>
     </w:p>
     <w:p>
       <w:pPr>
-        <w:spacing w:after="0" w:line="240" w:lineRule="auto"/>
-      </w:pPr>
-      <w:r>
-        <w:rPr>
-          <w:rFonts w:ascii="Courier New" w:cs="Courier New" w:eastAsia="Courier New" w:hAnsi="Courier New"/>
-          <w:sz w:val="20"/>
-          <w:szCs w:val="20"/>
+        <w:pBdr>
+          <w:left w:val="single" w:color="4472C4" w:sz="12" w:space="4"/>
+        </w:pBdr>
+        <w:shd w:fill="F2F2F2" w:color="auto" w:val="clear"/>
+        <w:spacing w:after="0" w:line="240" w:lineRule="auto"/>
+        <w:ind w:left="283"/>
+      </w:pPr>
+      <w:r>
+        <w:rPr>
+          <w:rFonts w:ascii="Courier New" w:cs="Courier New" w:eastAsia="Courier New" w:hAnsi="Courier New"/>
+          <w:sz w:val="18"/>
+          <w:szCs w:val="18"/>
+          <w:shd w:fill="F2F2F2" w:color="auto" w:val="clear"/>
         </w:rPr>
         <w:t xml:space="preserve">  if (low &gt; high) {</w:t>
       </w:r>
     </w:p>
     <w:p>
       <w:pPr>
-        <w:spacing w:after="0" w:line="240" w:lineRule="auto"/>
-      </w:pPr>
-      <w:r>
-        <w:rPr>
-          <w:rFonts w:ascii="Courier New" w:cs="Courier New" w:eastAsia="Courier New" w:hAnsi="Courier New"/>
-          <w:sz w:val="20"/>
-          <w:szCs w:val="20"/>
+        <w:pBdr>
+          <w:left w:val="single" w:color="4472C4" w:sz="12" w:space="4"/>
+        </w:pBdr>
+        <w:shd w:fill="F2F2F2" w:color="auto" w:val="clear"/>
+        <w:spacing w:after="0" w:line="240" w:lineRule="auto"/>
+        <w:ind w:left="283"/>
+      </w:pPr>
+      <w:r>
+        <w:rPr>
+          <w:rFonts w:ascii="Courier New" w:cs="Courier New" w:eastAsia="Courier New" w:hAnsi="Courier New"/>
+          <w:sz w:val="18"/>
+          <w:szCs w:val="18"/>
+          <w:shd w:fill="F2F2F2" w:color="auto" w:val="clear"/>
         </w:rPr>
         <w:t xml:space="preserve">    return -1;</w:t>
       </w:r>
     </w:p>
     <w:p>
       <w:pPr>
-        <w:spacing w:after="0" w:line="240" w:lineRule="auto"/>
-      </w:pPr>
-      <w:r>
-        <w:rPr>
-          <w:rFonts w:ascii="Courier New" w:cs="Courier New" w:eastAsia="Courier New" w:hAnsi="Courier New"/>
-          <w:sz w:val="20"/>
-          <w:szCs w:val="20"/>
+        <w:pBdr>
+          <w:left w:val="single" w:color="4472C4" w:sz="12" w:space="4"/>
+        </w:pBdr>
+        <w:shd w:fill="F2F2F2" w:color="auto" w:val="clear"/>
+        <w:spacing w:after="0" w:line="240" w:lineRule="auto"/>
+        <w:ind w:left="283"/>
+      </w:pPr>
+      <w:r>
+        <w:rPr>
+          <w:rFonts w:ascii="Courier New" w:cs="Courier New" w:eastAsia="Courier New" w:hAnsi="Courier New"/>
+          <w:sz w:val="18"/>
+          <w:szCs w:val="18"/>
+          <w:shd w:fill="F2F2F2" w:color="auto" w:val="clear"/>
         </w:rPr>
         <w:t xml:space="preserve">  }</w:t>
       </w:r>
     </w:p>
     <w:p>
       <w:pPr>
-        <w:spacing w:after="0" w:line="240" w:lineRule="auto"/>
-      </w:pPr>
-      <w:r>
-        <w:rPr>
-          <w:rFonts w:ascii="Courier New" w:cs="Courier New" w:eastAsia="Courier New" w:hAnsi="Courier New"/>
-          <w:sz w:val="20"/>
-          <w:szCs w:val="20"/>
-        </w:rPr>
-        <w:t xml:space="preserve"/>
-      </w:r>
-    </w:p>
-    <w:p>
-      <w:pPr>
-        <w:spacing w:after="0" w:line="240" w:lineRule="auto"/>
-      </w:pPr>
-      <w:r>
-        <w:rPr>
-          <w:rFonts w:ascii="Courier New" w:cs="Courier New" w:eastAsia="Courier New" w:hAnsi="Courier New"/>
-          <w:sz w:val="20"/>
-          <w:szCs w:val="20"/>
+        <w:pBdr>
+          <w:left w:val="single" w:color="4472C4" w:sz="12" w:space="4"/>
+        </w:pBdr>
+        <w:shd w:fill="F2F2F2" w:color="auto" w:val="clear"/>
+        <w:spacing w:after="0" w:line="240" w:lineRule="auto"/>
+        <w:ind w:left="283"/>
+      </w:pPr>
+      <w:r>
+        <w:rPr>
+          <w:rFonts w:ascii="Courier New" w:cs="Courier New" w:eastAsia="Courier New" w:hAnsi="Courier New"/>
+          <w:sz w:val="18"/>
+          <w:szCs w:val="18"/>
+          <w:shd w:fill="F2F2F2" w:color="auto" w:val="clear"/>
+        </w:rPr>
+        <w:t xml:space="preserve"> </w:t>
+      </w:r>
+    </w:p>
+    <w:p>
+      <w:pPr>
+        <w:pBdr>
+          <w:left w:val="single" w:color="4472C4" w:sz="12" w:space="4"/>
+        </w:pBdr>
+        <w:shd w:fill="F2F2F2" w:color="auto" w:val="clear"/>
+        <w:spacing w:after="0" w:line="240" w:lineRule="auto"/>
+        <w:ind w:left="283"/>
+      </w:pPr>
+      <w:r>
+        <w:rPr>
+          <w:rFonts w:ascii="Courier New" w:cs="Courier New" w:eastAsia="Courier New" w:hAnsi="Courier New"/>
+          <w:sz w:val="18"/>
+          <w:szCs w:val="18"/>
+          <w:shd w:fill="F2F2F2" w:color="auto" w:val="clear"/>
         </w:rPr>
         <w:t xml:space="preserve">  const mid = Math.floor((low + high) / 2);</w:t>
       </w:r>
     </w:p>
     <w:p>
       <w:pPr>
-        <w:spacing w:after="0" w:line="240" w:lineRule="auto"/>
-      </w:pPr>
-      <w:r>
-        <w:rPr>
-          <w:rFonts w:ascii="Courier New" w:cs="Courier New" w:eastAsia="Courier New" w:hAnsi="Courier New"/>
-          <w:sz w:val="20"/>
-          <w:szCs w:val="20"/>
+        <w:pBdr>
+          <w:left w:val="single" w:color="4472C4" w:sz="12" w:space="4"/>
+        </w:pBdr>
+        <w:shd w:fill="F2F2F2" w:color="auto" w:val="clear"/>
+        <w:spacing w:after="0" w:line="240" w:lineRule="auto"/>
+        <w:ind w:left="283"/>
+      </w:pPr>
+      <w:r>
+        <w:rPr>
+          <w:rFonts w:ascii="Courier New" w:cs="Courier New" w:eastAsia="Courier New" w:hAnsi="Courier New"/>
+          <w:sz w:val="18"/>
+          <w:szCs w:val="18"/>
+          <w:shd w:fill="F2F2F2" w:color="auto" w:val="clear"/>
         </w:rPr>
         <w:t xml:space="preserve">  if (arr[mid] === target) {</w:t>
       </w:r>
     </w:p>
     <w:p>
       <w:pPr>
-        <w:spacing w:after="0" w:line="240" w:lineRule="auto"/>
-      </w:pPr>
-      <w:r>
-        <w:rPr>
-          <w:rFonts w:ascii="Courier New" w:cs="Courier New" w:eastAsia="Courier New" w:hAnsi="Courier New"/>
-          <w:sz w:val="20"/>
-          <w:szCs w:val="20"/>
+        <w:pBdr>
+          <w:left w:val="single" w:color="4472C4" w:sz="12" w:space="4"/>
+        </w:pBdr>
+        <w:shd w:fill="F2F2F2" w:color="auto" w:val="clear"/>
+        <w:spacing w:after="0" w:line="240" w:lineRule="auto"/>
+        <w:ind w:left="283"/>
+      </w:pPr>
+      <w:r>
+        <w:rPr>
+          <w:rFonts w:ascii="Courier New" w:cs="Courier New" w:eastAsia="Courier New" w:hAnsi="Courier New"/>
+          <w:sz w:val="18"/>
+          <w:szCs w:val="18"/>
+          <w:shd w:fill="F2F2F2" w:color="auto" w:val="clear"/>
         </w:rPr>
         <w:t xml:space="preserve">    return mid;</w:t>
       </w:r>
     </w:p>
     <w:p>
       <w:pPr>
-        <w:spacing w:after="0" w:line="240" w:lineRule="auto"/>
-      </w:pPr>
-      <w:r>
-        <w:rPr>
-          <w:rFonts w:ascii="Courier New" w:cs="Courier New" w:eastAsia="Courier New" w:hAnsi="Courier New"/>
-          <w:sz w:val="20"/>
-          <w:szCs w:val="20"/>
+        <w:pBdr>
+          <w:left w:val="single" w:color="4472C4" w:sz="12" w:space="4"/>
+        </w:pBdr>
+        <w:shd w:fill="F2F2F2" w:color="auto" w:val="clear"/>
+        <w:spacing w:after="0" w:line="240" w:lineRule="auto"/>
+        <w:ind w:left="283"/>
+      </w:pPr>
+      <w:r>
+        <w:rPr>
+          <w:rFonts w:ascii="Courier New" w:cs="Courier New" w:eastAsia="Courier New" w:hAnsi="Courier New"/>
+          <w:sz w:val="18"/>
+          <w:szCs w:val="18"/>
+          <w:shd w:fill="F2F2F2" w:color="auto" w:val="clear"/>
         </w:rPr>
         <w:t xml:space="preserve">  }</w:t>
       </w:r>
     </w:p>
     <w:p>
       <w:pPr>
-        <w:spacing w:after="0" w:line="240" w:lineRule="auto"/>
-      </w:pPr>
-      <w:r>
-        <w:rPr>
-          <w:rFonts w:ascii="Courier New" w:cs="Courier New" w:eastAsia="Courier New" w:hAnsi="Courier New"/>
-          <w:sz w:val="20"/>
-          <w:szCs w:val="20"/>
+        <w:pBdr>
+          <w:left w:val="single" w:color="4472C4" w:sz="12" w:space="4"/>
+        </w:pBdr>
+        <w:shd w:fill="F2F2F2" w:color="auto" w:val="clear"/>
+        <w:spacing w:after="0" w:line="240" w:lineRule="auto"/>
+        <w:ind w:left="283"/>
+      </w:pPr>
+      <w:r>
+        <w:rPr>
+          <w:rFonts w:ascii="Courier New" w:cs="Courier New" w:eastAsia="Courier New" w:hAnsi="Courier New"/>
+          <w:sz w:val="18"/>
+          <w:szCs w:val="18"/>
+          <w:shd w:fill="F2F2F2" w:color="auto" w:val="clear"/>
         </w:rPr>
         <w:t xml:space="preserve">  if (arr[mid] &lt; target) {</w:t>
       </w:r>
     </w:p>
     <w:p>
       <w:pPr>
-        <w:spacing w:after="0" w:line="240" w:lineRule="auto"/>
-      </w:pPr>
-      <w:r>
-        <w:rPr>
-          <w:rFonts w:ascii="Courier New" w:cs="Courier New" w:eastAsia="Courier New" w:hAnsi="Courier New"/>
-          <w:sz w:val="20"/>
-          <w:szCs w:val="20"/>
+        <w:pBdr>
+          <w:left w:val="single" w:color="4472C4" w:sz="12" w:space="4"/>
+        </w:pBdr>
+        <w:shd w:fill="F2F2F2" w:color="auto" w:val="clear"/>
+        <w:spacing w:after="0" w:line="240" w:lineRule="auto"/>
+        <w:ind w:left="283"/>
+      </w:pPr>
+      <w:r>
+        <w:rPr>
+          <w:rFonts w:ascii="Courier New" w:cs="Courier New" w:eastAsia="Courier New" w:hAnsi="Courier New"/>
+          <w:sz w:val="18"/>
+          <w:szCs w:val="18"/>
+          <w:shd w:fill="F2F2F2" w:color="auto" w:val="clear"/>
         </w:rPr>
         <w:t xml:space="preserve">    return binarySearchHelper(arr, target, mid + 1, high);</w:t>
       </w:r>
     </w:p>
     <w:p>
       <w:pPr>
-        <w:spacing w:after="0" w:line="240" w:lineRule="auto"/>
-      </w:pPr>
-      <w:r>
-        <w:rPr>
-          <w:rFonts w:ascii="Courier New" w:cs="Courier New" w:eastAsia="Courier New" w:hAnsi="Courier New"/>
-          <w:sz w:val="20"/>
-          <w:szCs w:val="20"/>
+        <w:pBdr>
+          <w:left w:val="single" w:color="4472C4" w:sz="12" w:space="4"/>
+        </w:pBdr>
+        <w:shd w:fill="F2F2F2" w:color="auto" w:val="clear"/>
+        <w:spacing w:after="0" w:line="240" w:lineRule="auto"/>
+        <w:ind w:left="283"/>
+      </w:pPr>
+      <w:r>
+        <w:rPr>
+          <w:rFonts w:ascii="Courier New" w:cs="Courier New" w:eastAsia="Courier New" w:hAnsi="Courier New"/>
+          <w:sz w:val="18"/>
+          <w:szCs w:val="18"/>
+          <w:shd w:fill="F2F2F2" w:color="auto" w:val="clear"/>
         </w:rPr>
         <w:t xml:space="preserve">  }</w:t>
       </w:r>
     </w:p>
     <w:p>
       <w:pPr>
-        <w:spacing w:after="0" w:line="240" w:lineRule="auto"/>
-      </w:pPr>
-      <w:r>
-        <w:rPr>
-          <w:rFonts w:ascii="Courier New" w:cs="Courier New" w:eastAsia="Courier New" w:hAnsi="Courier New"/>
-          <w:sz w:val="20"/>
-          <w:szCs w:val="20"/>
+        <w:pBdr>
+          <w:left w:val="single" w:color="4472C4" w:sz="12" w:space="4"/>
+        </w:pBdr>
+        <w:shd w:fill="F2F2F2" w:color="auto" w:val="clear"/>
+        <w:spacing w:after="0" w:line="240" w:lineRule="auto"/>
+        <w:ind w:left="283"/>
+      </w:pPr>
+      <w:r>
+        <w:rPr>
+          <w:rFonts w:ascii="Courier New" w:cs="Courier New" w:eastAsia="Courier New" w:hAnsi="Courier New"/>
+          <w:sz w:val="18"/>
+          <w:szCs w:val="18"/>
+          <w:shd w:fill="F2F2F2" w:color="auto" w:val="clear"/>
         </w:rPr>
         <w:t xml:space="preserve">  return binarySearchHelper(arr, target, low, mid - 1);</w:t>
       </w:r>
     </w:p>
     <w:p>
       <w:pPr>
-        <w:spacing w:after="0" w:line="240" w:lineRule="auto"/>
-      </w:pPr>
-      <w:r>
-        <w:rPr>
-          <w:rFonts w:ascii="Courier New" w:cs="Courier New" w:eastAsia="Courier New" w:hAnsi="Courier New"/>
-          <w:sz w:val="20"/>
-          <w:szCs w:val="20"/>
+        <w:pBdr>
+          <w:left w:val="single" w:color="4472C4" w:sz="12" w:space="4"/>
+        </w:pBdr>
+        <w:shd w:fill="F2F2F2" w:color="auto" w:val="clear"/>
+        <w:spacing w:after="0" w:line="240" w:lineRule="auto"/>
+        <w:ind w:left="283"/>
+      </w:pPr>
+      <w:r>
+        <w:rPr>
+          <w:rFonts w:ascii="Courier New" w:cs="Courier New" w:eastAsia="Courier New" w:hAnsi="Courier New"/>
+          <w:sz w:val="18"/>
+          <w:szCs w:val="18"/>
+          <w:shd w:fill="F2F2F2" w:color="auto" w:val="clear"/>
         </w:rPr>
         <w:t xml:space="preserve">}</w:t>
       </w:r>
     </w:p>
     <w:p>
       <w:pPr>
-        <w:spacing w:after="0" w:line="240" w:lineRule="auto"/>
-      </w:pPr>
-      <w:r>
-        <w:rPr>
-          <w:rFonts w:ascii="Courier New" w:cs="Courier New" w:eastAsia="Courier New" w:hAnsi="Courier New"/>
-          <w:sz w:val="20"/>
-          <w:szCs w:val="20"/>
-        </w:rPr>
-        <w:t xml:space="preserve"/>
-      </w:r>
-    </w:p>
-    <w:p>
-      <w:pPr>
-        <w:spacing w:after="0" w:line="240" w:lineRule="auto"/>
-      </w:pPr>
-      <w:r>
-        <w:rPr>
-          <w:rFonts w:ascii="Courier New" w:cs="Courier New" w:eastAsia="Courier New" w:hAnsi="Courier New"/>
-          <w:sz w:val="20"/>
-          <w:szCs w:val="20"/>
+        <w:pBdr>
+          <w:left w:val="single" w:color="4472C4" w:sz="12" w:space="4"/>
+        </w:pBdr>
+        <w:shd w:fill="F2F2F2" w:color="auto" w:val="clear"/>
+        <w:spacing w:after="0" w:line="240" w:lineRule="auto"/>
+        <w:ind w:left="283"/>
+      </w:pPr>
+      <w:r>
+        <w:rPr>
+          <w:rFonts w:ascii="Courier New" w:cs="Courier New" w:eastAsia="Courier New" w:hAnsi="Courier New"/>
+          <w:sz w:val="18"/>
+          <w:szCs w:val="18"/>
+          <w:shd w:fill="F2F2F2" w:color="auto" w:val="clear"/>
+        </w:rPr>
+        <w:t xml:space="preserve"> </w:t>
+      </w:r>
+    </w:p>
+    <w:p>
+      <w:pPr>
+        <w:pBdr>
+          <w:left w:val="single" w:color="4472C4" w:sz="12" w:space="4"/>
+        </w:pBdr>
+        <w:shd w:fill="F2F2F2" w:color="auto" w:val="clear"/>
+        <w:spacing w:after="0" w:line="240" w:lineRule="auto"/>
+        <w:ind w:left="283"/>
+      </w:pPr>
+      <w:r>
+        <w:rPr>
+          <w:rFonts w:ascii="Courier New" w:cs="Courier New" w:eastAsia="Courier New" w:hAnsi="Courier New"/>
+          <w:sz w:val="18"/>
+          <w:szCs w:val="18"/>
+          <w:shd w:fill="F2F2F2" w:color="auto" w:val="clear"/>
         </w:rPr>
         <w:t xml:space="preserve">export function binarySearchRecursive(arr: number[], target: number): number {</w:t>
       </w:r>
     </w:p>
     <w:p>
       <w:pPr>
-        <w:spacing w:after="0" w:line="240" w:lineRule="auto"/>
-      </w:pPr>
-      <w:r>
-        <w:rPr>
-          <w:rFonts w:ascii="Courier New" w:cs="Courier New" w:eastAsia="Courier New" w:hAnsi="Courier New"/>
-          <w:sz w:val="20"/>
-          <w:szCs w:val="20"/>
+        <w:pBdr>
+          <w:left w:val="single" w:color="4472C4" w:sz="12" w:space="4"/>
+        </w:pBdr>
+        <w:shd w:fill="F2F2F2" w:color="auto" w:val="clear"/>
+        <w:spacing w:after="0" w:line="240" w:lineRule="auto"/>
+        <w:ind w:left="283"/>
+      </w:pPr>
+      <w:r>
+        <w:rPr>
+          <w:rFonts w:ascii="Courier New" w:cs="Courier New" w:eastAsia="Courier New" w:hAnsi="Courier New"/>
+          <w:sz w:val="18"/>
+          <w:szCs w:val="18"/>
+          <w:shd w:fill="F2F2F2" w:color="auto" w:val="clear"/>
         </w:rPr>
         <w:t xml:space="preserve">  return binarySearchHelper(arr, target, 0, arr.length - 1);</w:t>
       </w:r>
     </w:p>
     <w:p>
       <w:pPr>
-        <w:spacing w:after="0" w:line="240" w:lineRule="auto"/>
-      </w:pPr>
-      <w:r>
-        <w:rPr>
-          <w:rFonts w:ascii="Courier New" w:cs="Courier New" w:eastAsia="Courier New" w:hAnsi="Courier New"/>
-          <w:sz w:val="20"/>
-          <w:szCs w:val="20"/>
+        <w:pBdr>
+          <w:left w:val="single" w:color="4472C4" w:sz="12" w:space="4"/>
+        </w:pBdr>
+        <w:shd w:fill="F2F2F2" w:color="auto" w:val="clear"/>
+        <w:spacing w:after="0" w:line="240" w:lineRule="auto"/>
+        <w:ind w:left="283"/>
+      </w:pPr>
+      <w:r>
+        <w:rPr>
+          <w:rFonts w:ascii="Courier New" w:cs="Courier New" w:eastAsia="Courier New" w:hAnsi="Courier New"/>
+          <w:sz w:val="18"/>
+          <w:szCs w:val="18"/>
+          <w:shd w:fill="F2F2F2" w:color="auto" w:val="clear"/>
         </w:rPr>
         <w:t xml:space="preserve">}</w:t>
       </w:r>
@@ -3089,6 +3530,7 @@
     </w:p>
     <w:p>
       <w:pPr>
+        <w:keepNext/>
         <w:spacing w:after="60" w:before="120" w:line="360" w:lineRule="auto"/>
         <w:ind w:firstLine="709"/>
       </w:pPr>
@@ -3103,104 +3545,152 @@
     </w:p>
     <w:p>
       <w:pPr>
-        <w:spacing w:after="0" w:line="240" w:lineRule="auto"/>
-      </w:pPr>
-      <w:r>
-        <w:rPr>
-          <w:rFonts w:ascii="Courier New" w:cs="Courier New" w:eastAsia="Courier New" w:hAnsi="Courier New"/>
-          <w:sz w:val="20"/>
-          <w:szCs w:val="20"/>
+        <w:pBdr>
+          <w:left w:val="single" w:color="4472C4" w:sz="12" w:space="4"/>
+        </w:pBdr>
+        <w:shd w:fill="F2F2F2" w:color="auto" w:val="clear"/>
+        <w:spacing w:after="0" w:line="240" w:lineRule="auto"/>
+        <w:ind w:left="283"/>
+      </w:pPr>
+      <w:r>
+        <w:rPr>
+          <w:rFonts w:ascii="Courier New" w:cs="Courier New" w:eastAsia="Courier New" w:hAnsi="Courier New"/>
+          <w:sz w:val="18"/>
+          <w:szCs w:val="18"/>
+          <w:shd w:fill="F2F2F2" w:color="auto" w:val="clear"/>
         </w:rPr>
         <w:t xml:space="preserve">export function linearSearch(arr: number[], target: number): number {</w:t>
       </w:r>
     </w:p>
     <w:p>
       <w:pPr>
-        <w:spacing w:after="0" w:line="240" w:lineRule="auto"/>
-      </w:pPr>
-      <w:r>
-        <w:rPr>
-          <w:rFonts w:ascii="Courier New" w:cs="Courier New" w:eastAsia="Courier New" w:hAnsi="Courier New"/>
-          <w:sz w:val="20"/>
-          <w:szCs w:val="20"/>
+        <w:pBdr>
+          <w:left w:val="single" w:color="4472C4" w:sz="12" w:space="4"/>
+        </w:pBdr>
+        <w:shd w:fill="F2F2F2" w:color="auto" w:val="clear"/>
+        <w:spacing w:after="0" w:line="240" w:lineRule="auto"/>
+        <w:ind w:left="283"/>
+      </w:pPr>
+      <w:r>
+        <w:rPr>
+          <w:rFonts w:ascii="Courier New" w:cs="Courier New" w:eastAsia="Courier New" w:hAnsi="Courier New"/>
+          <w:sz w:val="18"/>
+          <w:szCs w:val="18"/>
+          <w:shd w:fill="F2F2F2" w:color="auto" w:val="clear"/>
         </w:rPr>
         <w:t xml:space="preserve">  for (let i = 0; i &lt; arr.length; i++) {</w:t>
       </w:r>
     </w:p>
     <w:p>
       <w:pPr>
-        <w:spacing w:after="0" w:line="240" w:lineRule="auto"/>
-      </w:pPr>
-      <w:r>
-        <w:rPr>
-          <w:rFonts w:ascii="Courier New" w:cs="Courier New" w:eastAsia="Courier New" w:hAnsi="Courier New"/>
-          <w:sz w:val="20"/>
-          <w:szCs w:val="20"/>
+        <w:pBdr>
+          <w:left w:val="single" w:color="4472C4" w:sz="12" w:space="4"/>
+        </w:pBdr>
+        <w:shd w:fill="F2F2F2" w:color="auto" w:val="clear"/>
+        <w:spacing w:after="0" w:line="240" w:lineRule="auto"/>
+        <w:ind w:left="283"/>
+      </w:pPr>
+      <w:r>
+        <w:rPr>
+          <w:rFonts w:ascii="Courier New" w:cs="Courier New" w:eastAsia="Courier New" w:hAnsi="Courier New"/>
+          <w:sz w:val="18"/>
+          <w:szCs w:val="18"/>
+          <w:shd w:fill="F2F2F2" w:color="auto" w:val="clear"/>
         </w:rPr>
         <w:t xml:space="preserve">    if (arr[i] === target) {</w:t>
       </w:r>
     </w:p>
     <w:p>
       <w:pPr>
-        <w:spacing w:after="0" w:line="240" w:lineRule="auto"/>
-      </w:pPr>
-      <w:r>
-        <w:rPr>
-          <w:rFonts w:ascii="Courier New" w:cs="Courier New" w:eastAsia="Courier New" w:hAnsi="Courier New"/>
-          <w:sz w:val="20"/>
-          <w:szCs w:val="20"/>
+        <w:pBdr>
+          <w:left w:val="single" w:color="4472C4" w:sz="12" w:space="4"/>
+        </w:pBdr>
+        <w:shd w:fill="F2F2F2" w:color="auto" w:val="clear"/>
+        <w:spacing w:after="0" w:line="240" w:lineRule="auto"/>
+        <w:ind w:left="283"/>
+      </w:pPr>
+      <w:r>
+        <w:rPr>
+          <w:rFonts w:ascii="Courier New" w:cs="Courier New" w:eastAsia="Courier New" w:hAnsi="Courier New"/>
+          <w:sz w:val="18"/>
+          <w:szCs w:val="18"/>
+          <w:shd w:fill="F2F2F2" w:color="auto" w:val="clear"/>
         </w:rPr>
         <w:t xml:space="preserve">      return i;</w:t>
       </w:r>
     </w:p>
     <w:p>
       <w:pPr>
-        <w:spacing w:after="0" w:line="240" w:lineRule="auto"/>
-      </w:pPr>
-      <w:r>
-        <w:rPr>
-          <w:rFonts w:ascii="Courier New" w:cs="Courier New" w:eastAsia="Courier New" w:hAnsi="Courier New"/>
-          <w:sz w:val="20"/>
-          <w:szCs w:val="20"/>
+        <w:pBdr>
+          <w:left w:val="single" w:color="4472C4" w:sz="12" w:space="4"/>
+        </w:pBdr>
+        <w:shd w:fill="F2F2F2" w:color="auto" w:val="clear"/>
+        <w:spacing w:after="0" w:line="240" w:lineRule="auto"/>
+        <w:ind w:left="283"/>
+      </w:pPr>
+      <w:r>
+        <w:rPr>
+          <w:rFonts w:ascii="Courier New" w:cs="Courier New" w:eastAsia="Courier New" w:hAnsi="Courier New"/>
+          <w:sz w:val="18"/>
+          <w:szCs w:val="18"/>
+          <w:shd w:fill="F2F2F2" w:color="auto" w:val="clear"/>
         </w:rPr>
         <w:t xml:space="preserve">    }</w:t>
       </w:r>
     </w:p>
     <w:p>
       <w:pPr>
-        <w:spacing w:after="0" w:line="240" w:lineRule="auto"/>
-      </w:pPr>
-      <w:r>
-        <w:rPr>
-          <w:rFonts w:ascii="Courier New" w:cs="Courier New" w:eastAsia="Courier New" w:hAnsi="Courier New"/>
-          <w:sz w:val="20"/>
-          <w:szCs w:val="20"/>
+        <w:pBdr>
+          <w:left w:val="single" w:color="4472C4" w:sz="12" w:space="4"/>
+        </w:pBdr>
+        <w:shd w:fill="F2F2F2" w:color="auto" w:val="clear"/>
+        <w:spacing w:after="0" w:line="240" w:lineRule="auto"/>
+        <w:ind w:left="283"/>
+      </w:pPr>
+      <w:r>
+        <w:rPr>
+          <w:rFonts w:ascii="Courier New" w:cs="Courier New" w:eastAsia="Courier New" w:hAnsi="Courier New"/>
+          <w:sz w:val="18"/>
+          <w:szCs w:val="18"/>
+          <w:shd w:fill="F2F2F2" w:color="auto" w:val="clear"/>
         </w:rPr>
         <w:t xml:space="preserve">  }</w:t>
       </w:r>
     </w:p>
     <w:p>
       <w:pPr>
-        <w:spacing w:after="0" w:line="240" w:lineRule="auto"/>
-      </w:pPr>
-      <w:r>
-        <w:rPr>
-          <w:rFonts w:ascii="Courier New" w:cs="Courier New" w:eastAsia="Courier New" w:hAnsi="Courier New"/>
-          <w:sz w:val="20"/>
-          <w:szCs w:val="20"/>
+        <w:pBdr>
+          <w:left w:val="single" w:color="4472C4" w:sz="12" w:space="4"/>
+        </w:pBdr>
+        <w:shd w:fill="F2F2F2" w:color="auto" w:val="clear"/>
+        <w:spacing w:after="0" w:line="240" w:lineRule="auto"/>
+        <w:ind w:left="283"/>
+      </w:pPr>
+      <w:r>
+        <w:rPr>
+          <w:rFonts w:ascii="Courier New" w:cs="Courier New" w:eastAsia="Courier New" w:hAnsi="Courier New"/>
+          <w:sz w:val="18"/>
+          <w:szCs w:val="18"/>
+          <w:shd w:fill="F2F2F2" w:color="auto" w:val="clear"/>
         </w:rPr>
         <w:t xml:space="preserve">  return -1;</w:t>
       </w:r>
     </w:p>
     <w:p>
       <w:pPr>
-        <w:spacing w:after="0" w:line="240" w:lineRule="auto"/>
-      </w:pPr>
-      <w:r>
-        <w:rPr>
-          <w:rFonts w:ascii="Courier New" w:cs="Courier New" w:eastAsia="Courier New" w:hAnsi="Courier New"/>
-          <w:sz w:val="20"/>
-          <w:szCs w:val="20"/>
+        <w:pBdr>
+          <w:left w:val="single" w:color="4472C4" w:sz="12" w:space="4"/>
+        </w:pBdr>
+        <w:shd w:fill="F2F2F2" w:color="auto" w:val="clear"/>
+        <w:spacing w:after="0" w:line="240" w:lineRule="auto"/>
+        <w:ind w:left="283"/>
+      </w:pPr>
+      <w:r>
+        <w:rPr>
+          <w:rFonts w:ascii="Courier New" w:cs="Courier New" w:eastAsia="Courier New" w:hAnsi="Courier New"/>
+          <w:sz w:val="18"/>
+          <w:szCs w:val="18"/>
+          <w:shd w:fill="F2F2F2" w:color="auto" w:val="clear"/>
         </w:rPr>
         <w:t xml:space="preserve">}</w:t>
       </w:r>
@@ -3223,6 +3713,7 @@
     </w:p>
     <w:p>
       <w:pPr>
+        <w:keepNext/>
         <w:spacing w:after="60" w:before="120" w:line="360" w:lineRule="auto"/>
         <w:ind w:firstLine="709"/>
       </w:pPr>
@@ -3237,962 +3728,1406 @@
     </w:p>
     <w:p>
       <w:pPr>
-        <w:spacing w:after="0" w:line="240" w:lineRule="auto"/>
-      </w:pPr>
-      <w:r>
-        <w:rPr>
-          <w:rFonts w:ascii="Courier New" w:cs="Courier New" w:eastAsia="Courier New" w:hAnsi="Courier New"/>
-          <w:sz w:val="20"/>
-          <w:szCs w:val="20"/>
+        <w:pBdr>
+          <w:left w:val="single" w:color="4472C4" w:sz="12" w:space="4"/>
+        </w:pBdr>
+        <w:shd w:fill="F2F2F2" w:color="auto" w:val="clear"/>
+        <w:spacing w:after="0" w:line="240" w:lineRule="auto"/>
+        <w:ind w:left="283"/>
+      </w:pPr>
+      <w:r>
+        <w:rPr>
+          <w:rFonts w:ascii="Courier New" w:cs="Courier New" w:eastAsia="Courier New" w:hAnsi="Courier New"/>
+          <w:sz w:val="18"/>
+          <w:szCs w:val="18"/>
+          <w:shd w:fill="F2F2F2" w:color="auto" w:val="clear"/>
         </w:rPr>
         <w:t xml:space="preserve">import { performance } from "node:perf_hooks";</w:t>
       </w:r>
     </w:p>
     <w:p>
       <w:pPr>
-        <w:spacing w:after="0" w:line="240" w:lineRule="auto"/>
-      </w:pPr>
-      <w:r>
-        <w:rPr>
-          <w:rFonts w:ascii="Courier New" w:cs="Courier New" w:eastAsia="Courier New" w:hAnsi="Courier New"/>
-          <w:sz w:val="20"/>
-          <w:szCs w:val="20"/>
+        <w:pBdr>
+          <w:left w:val="single" w:color="4472C4" w:sz="12" w:space="4"/>
+        </w:pBdr>
+        <w:shd w:fill="F2F2F2" w:color="auto" w:val="clear"/>
+        <w:spacing w:after="0" w:line="240" w:lineRule="auto"/>
+        <w:ind w:left="283"/>
+      </w:pPr>
+      <w:r>
+        <w:rPr>
+          <w:rFonts w:ascii="Courier New" w:cs="Courier New" w:eastAsia="Courier New" w:hAnsi="Courier New"/>
+          <w:sz w:val="18"/>
+          <w:szCs w:val="18"/>
+          <w:shd w:fill="F2F2F2" w:color="auto" w:val="clear"/>
         </w:rPr>
         <w:t xml:space="preserve">import { linearSearch } from "./algorithms/linear-search.ts";</w:t>
       </w:r>
     </w:p>
     <w:p>
       <w:pPr>
-        <w:spacing w:after="0" w:line="240" w:lineRule="auto"/>
-      </w:pPr>
-      <w:r>
-        <w:rPr>
-          <w:rFonts w:ascii="Courier New" w:cs="Courier New" w:eastAsia="Courier New" w:hAnsi="Courier New"/>
-          <w:sz w:val="20"/>
-          <w:szCs w:val="20"/>
+        <w:pBdr>
+          <w:left w:val="single" w:color="4472C4" w:sz="12" w:space="4"/>
+        </w:pBdr>
+        <w:shd w:fill="F2F2F2" w:color="auto" w:val="clear"/>
+        <w:spacing w:after="0" w:line="240" w:lineRule="auto"/>
+        <w:ind w:left="283"/>
+      </w:pPr>
+      <w:r>
+        <w:rPr>
+          <w:rFonts w:ascii="Courier New" w:cs="Courier New" w:eastAsia="Courier New" w:hAnsi="Courier New"/>
+          <w:sz w:val="18"/>
+          <w:szCs w:val="18"/>
+          <w:shd w:fill="F2F2F2" w:color="auto" w:val="clear"/>
         </w:rPr>
         <w:t xml:space="preserve">import { binarySearchIterative } from "./algorithms/binary-search-iterative.ts";</w:t>
       </w:r>
     </w:p>
     <w:p>
       <w:pPr>
-        <w:spacing w:after="0" w:line="240" w:lineRule="auto"/>
-      </w:pPr>
-      <w:r>
-        <w:rPr>
-          <w:rFonts w:ascii="Courier New" w:cs="Courier New" w:eastAsia="Courier New" w:hAnsi="Courier New"/>
-          <w:sz w:val="20"/>
-          <w:szCs w:val="20"/>
+        <w:pBdr>
+          <w:left w:val="single" w:color="4472C4" w:sz="12" w:space="4"/>
+        </w:pBdr>
+        <w:shd w:fill="F2F2F2" w:color="auto" w:val="clear"/>
+        <w:spacing w:after="0" w:line="240" w:lineRule="auto"/>
+        <w:ind w:left="283"/>
+      </w:pPr>
+      <w:r>
+        <w:rPr>
+          <w:rFonts w:ascii="Courier New" w:cs="Courier New" w:eastAsia="Courier New" w:hAnsi="Courier New"/>
+          <w:sz w:val="18"/>
+          <w:szCs w:val="18"/>
+          <w:shd w:fill="F2F2F2" w:color="auto" w:val="clear"/>
         </w:rPr>
         <w:t xml:space="preserve">import { binarySearchRecursive } from "./algorithms/binary-search-recursive.ts";</w:t>
       </w:r>
     </w:p>
     <w:p>
       <w:pPr>
-        <w:spacing w:after="0" w:line="240" w:lineRule="auto"/>
-      </w:pPr>
-      <w:r>
-        <w:rPr>
-          <w:rFonts w:ascii="Courier New" w:cs="Courier New" w:eastAsia="Courier New" w:hAnsi="Courier New"/>
-          <w:sz w:val="20"/>
-          <w:szCs w:val="20"/>
-        </w:rPr>
-        <w:t xml:space="preserve"/>
-      </w:r>
-    </w:p>
-    <w:p>
-      <w:pPr>
-        <w:spacing w:after="0" w:line="240" w:lineRule="auto"/>
-      </w:pPr>
-      <w:r>
-        <w:rPr>
-          <w:rFonts w:ascii="Courier New" w:cs="Courier New" w:eastAsia="Courier New" w:hAnsi="Courier New"/>
-          <w:sz w:val="20"/>
-          <w:szCs w:val="20"/>
+        <w:pBdr>
+          <w:left w:val="single" w:color="4472C4" w:sz="12" w:space="4"/>
+        </w:pBdr>
+        <w:shd w:fill="F2F2F2" w:color="auto" w:val="clear"/>
+        <w:spacing w:after="0" w:line="240" w:lineRule="auto"/>
+        <w:ind w:left="283"/>
+      </w:pPr>
+      <w:r>
+        <w:rPr>
+          <w:rFonts w:ascii="Courier New" w:cs="Courier New" w:eastAsia="Courier New" w:hAnsi="Courier New"/>
+          <w:sz w:val="18"/>
+          <w:szCs w:val="18"/>
+          <w:shd w:fill="F2F2F2" w:color="auto" w:val="clear"/>
+        </w:rPr>
+        <w:t xml:space="preserve"> </w:t>
+      </w:r>
+    </w:p>
+    <w:p>
+      <w:pPr>
+        <w:pBdr>
+          <w:left w:val="single" w:color="4472C4" w:sz="12" w:space="4"/>
+        </w:pBdr>
+        <w:shd w:fill="F2F2F2" w:color="auto" w:val="clear"/>
+        <w:spacing w:after="0" w:line="240" w:lineRule="auto"/>
+        <w:ind w:left="283"/>
+      </w:pPr>
+      <w:r>
+        <w:rPr>
+          <w:rFonts w:ascii="Courier New" w:cs="Courier New" w:eastAsia="Courier New" w:hAnsi="Courier New"/>
+          <w:sz w:val="18"/>
+          <w:szCs w:val="18"/>
+          <w:shd w:fill="F2F2F2" w:color="auto" w:val="clear"/>
         </w:rPr>
         <w:t xml:space="preserve">type SearchFn = (arr: number[], target: number) =&gt; number;</w:t>
       </w:r>
     </w:p>
     <w:p>
       <w:pPr>
-        <w:spacing w:after="0" w:line="240" w:lineRule="auto"/>
-      </w:pPr>
-      <w:r>
-        <w:rPr>
-          <w:rFonts w:ascii="Courier New" w:cs="Courier New" w:eastAsia="Courier New" w:hAnsi="Courier New"/>
-          <w:sz w:val="20"/>
-          <w:szCs w:val="20"/>
-        </w:rPr>
-        <w:t xml:space="preserve"/>
-      </w:r>
-    </w:p>
-    <w:p>
-      <w:pPr>
-        <w:spacing w:after="0" w:line="240" w:lineRule="auto"/>
-      </w:pPr>
-      <w:r>
-        <w:rPr>
-          <w:rFonts w:ascii="Courier New" w:cs="Courier New" w:eastAsia="Courier New" w:hAnsi="Courier New"/>
-          <w:sz w:val="20"/>
-          <w:szCs w:val="20"/>
+        <w:pBdr>
+          <w:left w:val="single" w:color="4472C4" w:sz="12" w:space="4"/>
+        </w:pBdr>
+        <w:shd w:fill="F2F2F2" w:color="auto" w:val="clear"/>
+        <w:spacing w:after="0" w:line="240" w:lineRule="auto"/>
+        <w:ind w:left="283"/>
+      </w:pPr>
+      <w:r>
+        <w:rPr>
+          <w:rFonts w:ascii="Courier New" w:cs="Courier New" w:eastAsia="Courier New" w:hAnsi="Courier New"/>
+          <w:sz w:val="18"/>
+          <w:szCs w:val="18"/>
+          <w:shd w:fill="F2F2F2" w:color="auto" w:val="clear"/>
+        </w:rPr>
+        <w:t xml:space="preserve"> </w:t>
+      </w:r>
+    </w:p>
+    <w:p>
+      <w:pPr>
+        <w:pBdr>
+          <w:left w:val="single" w:color="4472C4" w:sz="12" w:space="4"/>
+        </w:pBdr>
+        <w:shd w:fill="F2F2F2" w:color="auto" w:val="clear"/>
+        <w:spacing w:after="0" w:line="240" w:lineRule="auto"/>
+        <w:ind w:left="283"/>
+      </w:pPr>
+      <w:r>
+        <w:rPr>
+          <w:rFonts w:ascii="Courier New" w:cs="Courier New" w:eastAsia="Courier New" w:hAnsi="Courier New"/>
+          <w:sz w:val="18"/>
+          <w:szCs w:val="18"/>
+          <w:shd w:fill="F2F2F2" w:color="auto" w:val="clear"/>
         </w:rPr>
         <w:t xml:space="preserve">interface BenchmarkResult {</w:t>
       </w:r>
     </w:p>
     <w:p>
       <w:pPr>
-        <w:spacing w:after="0" w:line="240" w:lineRule="auto"/>
-      </w:pPr>
-      <w:r>
-        <w:rPr>
-          <w:rFonts w:ascii="Courier New" w:cs="Courier New" w:eastAsia="Courier New" w:hAnsi="Courier New"/>
-          <w:sz w:val="20"/>
-          <w:szCs w:val="20"/>
+        <w:pBdr>
+          <w:left w:val="single" w:color="4472C4" w:sz="12" w:space="4"/>
+        </w:pBdr>
+        <w:shd w:fill="F2F2F2" w:color="auto" w:val="clear"/>
+        <w:spacing w:after="0" w:line="240" w:lineRule="auto"/>
+        <w:ind w:left="283"/>
+      </w:pPr>
+      <w:r>
+        <w:rPr>
+          <w:rFonts w:ascii="Courier New" w:cs="Courier New" w:eastAsia="Courier New" w:hAnsi="Courier New"/>
+          <w:sz w:val="18"/>
+          <w:szCs w:val="18"/>
+          <w:shd w:fill="F2F2F2" w:color="auto" w:val="clear"/>
         </w:rPr>
         <w:t xml:space="preserve">  n: number;</w:t>
       </w:r>
     </w:p>
     <w:p>
       <w:pPr>
-        <w:spacing w:after="0" w:line="240" w:lineRule="auto"/>
-      </w:pPr>
-      <w:r>
-        <w:rPr>
-          <w:rFonts w:ascii="Courier New" w:cs="Courier New" w:eastAsia="Courier New" w:hAnsi="Courier New"/>
-          <w:sz w:val="20"/>
-          <w:szCs w:val="20"/>
+        <w:pBdr>
+          <w:left w:val="single" w:color="4472C4" w:sz="12" w:space="4"/>
+        </w:pBdr>
+        <w:shd w:fill="F2F2F2" w:color="auto" w:val="clear"/>
+        <w:spacing w:after="0" w:line="240" w:lineRule="auto"/>
+        <w:ind w:left="283"/>
+      </w:pPr>
+      <w:r>
+        <w:rPr>
+          <w:rFonts w:ascii="Courier New" w:cs="Courier New" w:eastAsia="Courier New" w:hAnsi="Courier New"/>
+          <w:sz w:val="18"/>
+          <w:szCs w:val="18"/>
+          <w:shd w:fill="F2F2F2" w:color="auto" w:val="clear"/>
         </w:rPr>
         <w:t xml:space="preserve">  linearMs: number;</w:t>
       </w:r>
     </w:p>
     <w:p>
       <w:pPr>
-        <w:spacing w:after="0" w:line="240" w:lineRule="auto"/>
-      </w:pPr>
-      <w:r>
-        <w:rPr>
-          <w:rFonts w:ascii="Courier New" w:cs="Courier New" w:eastAsia="Courier New" w:hAnsi="Courier New"/>
-          <w:sz w:val="20"/>
-          <w:szCs w:val="20"/>
+        <w:pBdr>
+          <w:left w:val="single" w:color="4472C4" w:sz="12" w:space="4"/>
+        </w:pBdr>
+        <w:shd w:fill="F2F2F2" w:color="auto" w:val="clear"/>
+        <w:spacing w:after="0" w:line="240" w:lineRule="auto"/>
+        <w:ind w:left="283"/>
+      </w:pPr>
+      <w:r>
+        <w:rPr>
+          <w:rFonts w:ascii="Courier New" w:cs="Courier New" w:eastAsia="Courier New" w:hAnsi="Courier New"/>
+          <w:sz w:val="18"/>
+          <w:szCs w:val="18"/>
+          <w:shd w:fill="F2F2F2" w:color="auto" w:val="clear"/>
         </w:rPr>
         <w:t xml:space="preserve">  binaryIterMs: number;</w:t>
       </w:r>
     </w:p>
     <w:p>
       <w:pPr>
-        <w:spacing w:after="0" w:line="240" w:lineRule="auto"/>
-      </w:pPr>
-      <w:r>
-        <w:rPr>
-          <w:rFonts w:ascii="Courier New" w:cs="Courier New" w:eastAsia="Courier New" w:hAnsi="Courier New"/>
-          <w:sz w:val="20"/>
-          <w:szCs w:val="20"/>
+        <w:pBdr>
+          <w:left w:val="single" w:color="4472C4" w:sz="12" w:space="4"/>
+        </w:pBdr>
+        <w:shd w:fill="F2F2F2" w:color="auto" w:val="clear"/>
+        <w:spacing w:after="0" w:line="240" w:lineRule="auto"/>
+        <w:ind w:left="283"/>
+      </w:pPr>
+      <w:r>
+        <w:rPr>
+          <w:rFonts w:ascii="Courier New" w:cs="Courier New" w:eastAsia="Courier New" w:hAnsi="Courier New"/>
+          <w:sz w:val="18"/>
+          <w:szCs w:val="18"/>
+          <w:shd w:fill="F2F2F2" w:color="auto" w:val="clear"/>
         </w:rPr>
         <w:t xml:space="preserve">  binaryRecMs: number;</w:t>
       </w:r>
     </w:p>
     <w:p>
       <w:pPr>
-        <w:spacing w:after="0" w:line="240" w:lineRule="auto"/>
-      </w:pPr>
-      <w:r>
-        <w:rPr>
-          <w:rFonts w:ascii="Courier New" w:cs="Courier New" w:eastAsia="Courier New" w:hAnsi="Courier New"/>
-          <w:sz w:val="20"/>
-          <w:szCs w:val="20"/>
+        <w:pBdr>
+          <w:left w:val="single" w:color="4472C4" w:sz="12" w:space="4"/>
+        </w:pBdr>
+        <w:shd w:fill="F2F2F2" w:color="auto" w:val="clear"/>
+        <w:spacing w:after="0" w:line="240" w:lineRule="auto"/>
+        <w:ind w:left="283"/>
+      </w:pPr>
+      <w:r>
+        <w:rPr>
+          <w:rFonts w:ascii="Courier New" w:cs="Courier New" w:eastAsia="Courier New" w:hAnsi="Courier New"/>
+          <w:sz w:val="18"/>
+          <w:szCs w:val="18"/>
+          <w:shd w:fill="F2F2F2" w:color="auto" w:val="clear"/>
         </w:rPr>
         <w:t xml:space="preserve">}</w:t>
       </w:r>
     </w:p>
     <w:p>
       <w:pPr>
-        <w:spacing w:after="0" w:line="240" w:lineRule="auto"/>
-      </w:pPr>
-      <w:r>
-        <w:rPr>
-          <w:rFonts w:ascii="Courier New" w:cs="Courier New" w:eastAsia="Courier New" w:hAnsi="Courier New"/>
-          <w:sz w:val="20"/>
-          <w:szCs w:val="20"/>
-        </w:rPr>
-        <w:t xml:space="preserve"/>
-      </w:r>
-    </w:p>
-    <w:p>
-      <w:pPr>
-        <w:spacing w:after="0" w:line="240" w:lineRule="auto"/>
-      </w:pPr>
-      <w:r>
-        <w:rPr>
-          <w:rFonts w:ascii="Courier New" w:cs="Courier New" w:eastAsia="Courier New" w:hAnsi="Courier New"/>
-          <w:sz w:val="20"/>
-          <w:szCs w:val="20"/>
+        <w:pBdr>
+          <w:left w:val="single" w:color="4472C4" w:sz="12" w:space="4"/>
+        </w:pBdr>
+        <w:shd w:fill="F2F2F2" w:color="auto" w:val="clear"/>
+        <w:spacing w:after="0" w:line="240" w:lineRule="auto"/>
+        <w:ind w:left="283"/>
+      </w:pPr>
+      <w:r>
+        <w:rPr>
+          <w:rFonts w:ascii="Courier New" w:cs="Courier New" w:eastAsia="Courier New" w:hAnsi="Courier New"/>
+          <w:sz w:val="18"/>
+          <w:szCs w:val="18"/>
+          <w:shd w:fill="F2F2F2" w:color="auto" w:val="clear"/>
+        </w:rPr>
+        <w:t xml:space="preserve"> </w:t>
+      </w:r>
+    </w:p>
+    <w:p>
+      <w:pPr>
+        <w:pBdr>
+          <w:left w:val="single" w:color="4472C4" w:sz="12" w:space="4"/>
+        </w:pBdr>
+        <w:shd w:fill="F2F2F2" w:color="auto" w:val="clear"/>
+        <w:spacing w:after="0" w:line="240" w:lineRule="auto"/>
+        <w:ind w:left="283"/>
+      </w:pPr>
+      <w:r>
+        <w:rPr>
+          <w:rFonts w:ascii="Courier New" w:cs="Courier New" w:eastAsia="Courier New" w:hAnsi="Courier New"/>
+          <w:sz w:val="18"/>
+          <w:szCs w:val="18"/>
+          <w:shd w:fill="F2F2F2" w:color="auto" w:val="clear"/>
         </w:rPr>
         <w:t xml:space="preserve">function measureAverage(fn: SearchFn, arr: number[], target: number, iterations: number): number {</w:t>
       </w:r>
     </w:p>
     <w:p>
       <w:pPr>
-        <w:spacing w:after="0" w:line="240" w:lineRule="auto"/>
-      </w:pPr>
-      <w:r>
-        <w:rPr>
-          <w:rFonts w:ascii="Courier New" w:cs="Courier New" w:eastAsia="Courier New" w:hAnsi="Courier New"/>
-          <w:sz w:val="20"/>
-          <w:szCs w:val="20"/>
+        <w:pBdr>
+          <w:left w:val="single" w:color="4472C4" w:sz="12" w:space="4"/>
+        </w:pBdr>
+        <w:shd w:fill="F2F2F2" w:color="auto" w:val="clear"/>
+        <w:spacing w:after="0" w:line="240" w:lineRule="auto"/>
+        <w:ind w:left="283"/>
+      </w:pPr>
+      <w:r>
+        <w:rPr>
+          <w:rFonts w:ascii="Courier New" w:cs="Courier New" w:eastAsia="Courier New" w:hAnsi="Courier New"/>
+          <w:sz w:val="18"/>
+          <w:szCs w:val="18"/>
+          <w:shd w:fill="F2F2F2" w:color="auto" w:val="clear"/>
         </w:rPr>
         <w:t xml:space="preserve">  for (let i = 0; i &lt; Math.min(iterations, 10); i++) {</w:t>
       </w:r>
     </w:p>
     <w:p>
       <w:pPr>
-        <w:spacing w:after="0" w:line="240" w:lineRule="auto"/>
-      </w:pPr>
-      <w:r>
-        <w:rPr>
-          <w:rFonts w:ascii="Courier New" w:cs="Courier New" w:eastAsia="Courier New" w:hAnsi="Courier New"/>
-          <w:sz w:val="20"/>
-          <w:szCs w:val="20"/>
+        <w:pBdr>
+          <w:left w:val="single" w:color="4472C4" w:sz="12" w:space="4"/>
+        </w:pBdr>
+        <w:shd w:fill="F2F2F2" w:color="auto" w:val="clear"/>
+        <w:spacing w:after="0" w:line="240" w:lineRule="auto"/>
+        <w:ind w:left="283"/>
+      </w:pPr>
+      <w:r>
+        <w:rPr>
+          <w:rFonts w:ascii="Courier New" w:cs="Courier New" w:eastAsia="Courier New" w:hAnsi="Courier New"/>
+          <w:sz w:val="18"/>
+          <w:szCs w:val="18"/>
+          <w:shd w:fill="F2F2F2" w:color="auto" w:val="clear"/>
         </w:rPr>
         <w:t xml:space="preserve">    fn(arr, target);</w:t>
       </w:r>
     </w:p>
     <w:p>
       <w:pPr>
-        <w:spacing w:after="0" w:line="240" w:lineRule="auto"/>
-      </w:pPr>
-      <w:r>
-        <w:rPr>
-          <w:rFonts w:ascii="Courier New" w:cs="Courier New" w:eastAsia="Courier New" w:hAnsi="Courier New"/>
-          <w:sz w:val="20"/>
-          <w:szCs w:val="20"/>
+        <w:pBdr>
+          <w:left w:val="single" w:color="4472C4" w:sz="12" w:space="4"/>
+        </w:pBdr>
+        <w:shd w:fill="F2F2F2" w:color="auto" w:val="clear"/>
+        <w:spacing w:after="0" w:line="240" w:lineRule="auto"/>
+        <w:ind w:left="283"/>
+      </w:pPr>
+      <w:r>
+        <w:rPr>
+          <w:rFonts w:ascii="Courier New" w:cs="Courier New" w:eastAsia="Courier New" w:hAnsi="Courier New"/>
+          <w:sz w:val="18"/>
+          <w:szCs w:val="18"/>
+          <w:shd w:fill="F2F2F2" w:color="auto" w:val="clear"/>
         </w:rPr>
         <w:t xml:space="preserve">  }</w:t>
       </w:r>
     </w:p>
     <w:p>
       <w:pPr>
-        <w:spacing w:after="0" w:line="240" w:lineRule="auto"/>
-      </w:pPr>
-      <w:r>
-        <w:rPr>
-          <w:rFonts w:ascii="Courier New" w:cs="Courier New" w:eastAsia="Courier New" w:hAnsi="Courier New"/>
-          <w:sz w:val="20"/>
-          <w:szCs w:val="20"/>
-        </w:rPr>
-        <w:t xml:space="preserve"/>
-      </w:r>
-    </w:p>
-    <w:p>
-      <w:pPr>
-        <w:spacing w:after="0" w:line="240" w:lineRule="auto"/>
-      </w:pPr>
-      <w:r>
-        <w:rPr>
-          <w:rFonts w:ascii="Courier New" w:cs="Courier New" w:eastAsia="Courier New" w:hAnsi="Courier New"/>
-          <w:sz w:val="20"/>
-          <w:szCs w:val="20"/>
+        <w:pBdr>
+          <w:left w:val="single" w:color="4472C4" w:sz="12" w:space="4"/>
+        </w:pBdr>
+        <w:shd w:fill="F2F2F2" w:color="auto" w:val="clear"/>
+        <w:spacing w:after="0" w:line="240" w:lineRule="auto"/>
+        <w:ind w:left="283"/>
+      </w:pPr>
+      <w:r>
+        <w:rPr>
+          <w:rFonts w:ascii="Courier New" w:cs="Courier New" w:eastAsia="Courier New" w:hAnsi="Courier New"/>
+          <w:sz w:val="18"/>
+          <w:szCs w:val="18"/>
+          <w:shd w:fill="F2F2F2" w:color="auto" w:val="clear"/>
+        </w:rPr>
+        <w:t xml:space="preserve"> </w:t>
+      </w:r>
+    </w:p>
+    <w:p>
+      <w:pPr>
+        <w:pBdr>
+          <w:left w:val="single" w:color="4472C4" w:sz="12" w:space="4"/>
+        </w:pBdr>
+        <w:shd w:fill="F2F2F2" w:color="auto" w:val="clear"/>
+        <w:spacing w:after="0" w:line="240" w:lineRule="auto"/>
+        <w:ind w:left="283"/>
+      </w:pPr>
+      <w:r>
+        <w:rPr>
+          <w:rFonts w:ascii="Courier New" w:cs="Courier New" w:eastAsia="Courier New" w:hAnsi="Courier New"/>
+          <w:sz w:val="18"/>
+          <w:szCs w:val="18"/>
+          <w:shd w:fill="F2F2F2" w:color="auto" w:val="clear"/>
         </w:rPr>
         <w:t xml:space="preserve">  const start = performance.now();</w:t>
       </w:r>
     </w:p>
     <w:p>
       <w:pPr>
-        <w:spacing w:after="0" w:line="240" w:lineRule="auto"/>
-      </w:pPr>
-      <w:r>
-        <w:rPr>
-          <w:rFonts w:ascii="Courier New" w:cs="Courier New" w:eastAsia="Courier New" w:hAnsi="Courier New"/>
-          <w:sz w:val="20"/>
-          <w:szCs w:val="20"/>
+        <w:pBdr>
+          <w:left w:val="single" w:color="4472C4" w:sz="12" w:space="4"/>
+        </w:pBdr>
+        <w:shd w:fill="F2F2F2" w:color="auto" w:val="clear"/>
+        <w:spacing w:after="0" w:line="240" w:lineRule="auto"/>
+        <w:ind w:left="283"/>
+      </w:pPr>
+      <w:r>
+        <w:rPr>
+          <w:rFonts w:ascii="Courier New" w:cs="Courier New" w:eastAsia="Courier New" w:hAnsi="Courier New"/>
+          <w:sz w:val="18"/>
+          <w:szCs w:val="18"/>
+          <w:shd w:fill="F2F2F2" w:color="auto" w:val="clear"/>
         </w:rPr>
         <w:t xml:space="preserve">  for (let i = 0; i &lt; iterations; i++) {</w:t>
       </w:r>
     </w:p>
     <w:p>
       <w:pPr>
-        <w:spacing w:after="0" w:line="240" w:lineRule="auto"/>
-      </w:pPr>
-      <w:r>
-        <w:rPr>
-          <w:rFonts w:ascii="Courier New" w:cs="Courier New" w:eastAsia="Courier New" w:hAnsi="Courier New"/>
-          <w:sz w:val="20"/>
-          <w:szCs w:val="20"/>
+        <w:pBdr>
+          <w:left w:val="single" w:color="4472C4" w:sz="12" w:space="4"/>
+        </w:pBdr>
+        <w:shd w:fill="F2F2F2" w:color="auto" w:val="clear"/>
+        <w:spacing w:after="0" w:line="240" w:lineRule="auto"/>
+        <w:ind w:left="283"/>
+      </w:pPr>
+      <w:r>
+        <w:rPr>
+          <w:rFonts w:ascii="Courier New" w:cs="Courier New" w:eastAsia="Courier New" w:hAnsi="Courier New"/>
+          <w:sz w:val="18"/>
+          <w:szCs w:val="18"/>
+          <w:shd w:fill="F2F2F2" w:color="auto" w:val="clear"/>
         </w:rPr>
         <w:t xml:space="preserve">    fn(arr, target);</w:t>
       </w:r>
     </w:p>
     <w:p>
       <w:pPr>
-        <w:spacing w:after="0" w:line="240" w:lineRule="auto"/>
-      </w:pPr>
-      <w:r>
-        <w:rPr>
-          <w:rFonts w:ascii="Courier New" w:cs="Courier New" w:eastAsia="Courier New" w:hAnsi="Courier New"/>
-          <w:sz w:val="20"/>
-          <w:szCs w:val="20"/>
+        <w:pBdr>
+          <w:left w:val="single" w:color="4472C4" w:sz="12" w:space="4"/>
+        </w:pBdr>
+        <w:shd w:fill="F2F2F2" w:color="auto" w:val="clear"/>
+        <w:spacing w:after="0" w:line="240" w:lineRule="auto"/>
+        <w:ind w:left="283"/>
+      </w:pPr>
+      <w:r>
+        <w:rPr>
+          <w:rFonts w:ascii="Courier New" w:cs="Courier New" w:eastAsia="Courier New" w:hAnsi="Courier New"/>
+          <w:sz w:val="18"/>
+          <w:szCs w:val="18"/>
+          <w:shd w:fill="F2F2F2" w:color="auto" w:val="clear"/>
         </w:rPr>
         <w:t xml:space="preserve">  }</w:t>
       </w:r>
     </w:p>
     <w:p>
       <w:pPr>
-        <w:spacing w:after="0" w:line="240" w:lineRule="auto"/>
-      </w:pPr>
-      <w:r>
-        <w:rPr>
-          <w:rFonts w:ascii="Courier New" w:cs="Courier New" w:eastAsia="Courier New" w:hAnsi="Courier New"/>
-          <w:sz w:val="20"/>
-          <w:szCs w:val="20"/>
+        <w:pBdr>
+          <w:left w:val="single" w:color="4472C4" w:sz="12" w:space="4"/>
+        </w:pBdr>
+        <w:shd w:fill="F2F2F2" w:color="auto" w:val="clear"/>
+        <w:spacing w:after="0" w:line="240" w:lineRule="auto"/>
+        <w:ind w:left="283"/>
+      </w:pPr>
+      <w:r>
+        <w:rPr>
+          <w:rFonts w:ascii="Courier New" w:cs="Courier New" w:eastAsia="Courier New" w:hAnsi="Courier New"/>
+          <w:sz w:val="18"/>
+          <w:szCs w:val="18"/>
+          <w:shd w:fill="F2F2F2" w:color="auto" w:val="clear"/>
         </w:rPr>
         <w:t xml:space="preserve">  const elapsed = performance.now() - start;</w:t>
       </w:r>
     </w:p>
     <w:p>
       <w:pPr>
-        <w:spacing w:after="0" w:line="240" w:lineRule="auto"/>
-      </w:pPr>
-      <w:r>
-        <w:rPr>
-          <w:rFonts w:ascii="Courier New" w:cs="Courier New" w:eastAsia="Courier New" w:hAnsi="Courier New"/>
-          <w:sz w:val="20"/>
-          <w:szCs w:val="20"/>
+        <w:pBdr>
+          <w:left w:val="single" w:color="4472C4" w:sz="12" w:space="4"/>
+        </w:pBdr>
+        <w:shd w:fill="F2F2F2" w:color="auto" w:val="clear"/>
+        <w:spacing w:after="0" w:line="240" w:lineRule="auto"/>
+        <w:ind w:left="283"/>
+      </w:pPr>
+      <w:r>
+        <w:rPr>
+          <w:rFonts w:ascii="Courier New" w:cs="Courier New" w:eastAsia="Courier New" w:hAnsi="Courier New"/>
+          <w:sz w:val="18"/>
+          <w:szCs w:val="18"/>
+          <w:shd w:fill="F2F2F2" w:color="auto" w:val="clear"/>
         </w:rPr>
         <w:t xml:space="preserve">  return elapsed / iterations;</w:t>
       </w:r>
     </w:p>
     <w:p>
       <w:pPr>
-        <w:spacing w:after="0" w:line="240" w:lineRule="auto"/>
-      </w:pPr>
-      <w:r>
-        <w:rPr>
-          <w:rFonts w:ascii="Courier New" w:cs="Courier New" w:eastAsia="Courier New" w:hAnsi="Courier New"/>
-          <w:sz w:val="20"/>
-          <w:szCs w:val="20"/>
+        <w:pBdr>
+          <w:left w:val="single" w:color="4472C4" w:sz="12" w:space="4"/>
+        </w:pBdr>
+        <w:shd w:fill="F2F2F2" w:color="auto" w:val="clear"/>
+        <w:spacing w:after="0" w:line="240" w:lineRule="auto"/>
+        <w:ind w:left="283"/>
+      </w:pPr>
+      <w:r>
+        <w:rPr>
+          <w:rFonts w:ascii="Courier New" w:cs="Courier New" w:eastAsia="Courier New" w:hAnsi="Courier New"/>
+          <w:sz w:val="18"/>
+          <w:szCs w:val="18"/>
+          <w:shd w:fill="F2F2F2" w:color="auto" w:val="clear"/>
         </w:rPr>
         <w:t xml:space="preserve">}</w:t>
       </w:r>
     </w:p>
     <w:p>
       <w:pPr>
-        <w:spacing w:after="0" w:line="240" w:lineRule="auto"/>
-      </w:pPr>
-      <w:r>
-        <w:rPr>
-          <w:rFonts w:ascii="Courier New" w:cs="Courier New" w:eastAsia="Courier New" w:hAnsi="Courier New"/>
-          <w:sz w:val="20"/>
-          <w:szCs w:val="20"/>
-        </w:rPr>
-        <w:t xml:space="preserve"/>
-      </w:r>
-    </w:p>
-    <w:p>
-      <w:pPr>
-        <w:spacing w:after="0" w:line="240" w:lineRule="auto"/>
-      </w:pPr>
-      <w:r>
-        <w:rPr>
-          <w:rFonts w:ascii="Courier New" w:cs="Courier New" w:eastAsia="Courier New" w:hAnsi="Courier New"/>
-          <w:sz w:val="20"/>
-          <w:szCs w:val="20"/>
+        <w:pBdr>
+          <w:left w:val="single" w:color="4472C4" w:sz="12" w:space="4"/>
+        </w:pBdr>
+        <w:shd w:fill="F2F2F2" w:color="auto" w:val="clear"/>
+        <w:spacing w:after="0" w:line="240" w:lineRule="auto"/>
+        <w:ind w:left="283"/>
+      </w:pPr>
+      <w:r>
+        <w:rPr>
+          <w:rFonts w:ascii="Courier New" w:cs="Courier New" w:eastAsia="Courier New" w:hAnsi="Courier New"/>
+          <w:sz w:val="18"/>
+          <w:szCs w:val="18"/>
+          <w:shd w:fill="F2F2F2" w:color="auto" w:val="clear"/>
+        </w:rPr>
+        <w:t xml:space="preserve"> </w:t>
+      </w:r>
+    </w:p>
+    <w:p>
+      <w:pPr>
+        <w:pBdr>
+          <w:left w:val="single" w:color="4472C4" w:sz="12" w:space="4"/>
+        </w:pBdr>
+        <w:shd w:fill="F2F2F2" w:color="auto" w:val="clear"/>
+        <w:spacing w:after="0" w:line="240" w:lineRule="auto"/>
+        <w:ind w:left="283"/>
+      </w:pPr>
+      <w:r>
+        <w:rPr>
+          <w:rFonts w:ascii="Courier New" w:cs="Courier New" w:eastAsia="Courier New" w:hAnsi="Courier New"/>
+          <w:sz w:val="18"/>
+          <w:szCs w:val="18"/>
+          <w:shd w:fill="F2F2F2" w:color="auto" w:val="clear"/>
         </w:rPr>
         <w:t xml:space="preserve">function chooseIterations(n: number, isFast: boolean): number {</w:t>
       </w:r>
     </w:p>
     <w:p>
       <w:pPr>
-        <w:spacing w:after="0" w:line="240" w:lineRule="auto"/>
-      </w:pPr>
-      <w:r>
-        <w:rPr>
-          <w:rFonts w:ascii="Courier New" w:cs="Courier New" w:eastAsia="Courier New" w:hAnsi="Courier New"/>
-          <w:sz w:val="20"/>
-          <w:szCs w:val="20"/>
+        <w:pBdr>
+          <w:left w:val="single" w:color="4472C4" w:sz="12" w:space="4"/>
+        </w:pBdr>
+        <w:shd w:fill="F2F2F2" w:color="auto" w:val="clear"/>
+        <w:spacing w:after="0" w:line="240" w:lineRule="auto"/>
+        <w:ind w:left="283"/>
+      </w:pPr>
+      <w:r>
+        <w:rPr>
+          <w:rFonts w:ascii="Courier New" w:cs="Courier New" w:eastAsia="Courier New" w:hAnsi="Courier New"/>
+          <w:sz w:val="18"/>
+          <w:szCs w:val="18"/>
+          <w:shd w:fill="F2F2F2" w:color="auto" w:val="clear"/>
         </w:rPr>
         <w:t xml:space="preserve">  if (isFast) {</w:t>
       </w:r>
     </w:p>
     <w:p>
       <w:pPr>
-        <w:spacing w:after="0" w:line="240" w:lineRule="auto"/>
-      </w:pPr>
-      <w:r>
-        <w:rPr>
-          <w:rFonts w:ascii="Courier New" w:cs="Courier New" w:eastAsia="Courier New" w:hAnsi="Courier New"/>
-          <w:sz w:val="20"/>
-          <w:szCs w:val="20"/>
+        <w:pBdr>
+          <w:left w:val="single" w:color="4472C4" w:sz="12" w:space="4"/>
+        </w:pBdr>
+        <w:shd w:fill="F2F2F2" w:color="auto" w:val="clear"/>
+        <w:spacing w:after="0" w:line="240" w:lineRule="auto"/>
+        <w:ind w:left="283"/>
+      </w:pPr>
+      <w:r>
+        <w:rPr>
+          <w:rFonts w:ascii="Courier New" w:cs="Courier New" w:eastAsia="Courier New" w:hAnsi="Courier New"/>
+          <w:sz w:val="18"/>
+          <w:szCs w:val="18"/>
+          <w:shd w:fill="F2F2F2" w:color="auto" w:val="clear"/>
         </w:rPr>
         <w:t xml:space="preserve">    if (n &lt;= 10_000) return 100_000;</w:t>
       </w:r>
     </w:p>
     <w:p>
       <w:pPr>
-        <w:spacing w:after="0" w:line="240" w:lineRule="auto"/>
-      </w:pPr>
-      <w:r>
-        <w:rPr>
-          <w:rFonts w:ascii="Courier New" w:cs="Courier New" w:eastAsia="Courier New" w:hAnsi="Courier New"/>
-          <w:sz w:val="20"/>
-          <w:szCs w:val="20"/>
+        <w:pBdr>
+          <w:left w:val="single" w:color="4472C4" w:sz="12" w:space="4"/>
+        </w:pBdr>
+        <w:shd w:fill="F2F2F2" w:color="auto" w:val="clear"/>
+        <w:spacing w:after="0" w:line="240" w:lineRule="auto"/>
+        <w:ind w:left="283"/>
+      </w:pPr>
+      <w:r>
+        <w:rPr>
+          <w:rFonts w:ascii="Courier New" w:cs="Courier New" w:eastAsia="Courier New" w:hAnsi="Courier New"/>
+          <w:sz w:val="18"/>
+          <w:szCs w:val="18"/>
+          <w:shd w:fill="F2F2F2" w:color="auto" w:val="clear"/>
         </w:rPr>
         <w:t xml:space="preserve">    if (n &lt;= 1_000_000) return 50_000;</w:t>
       </w:r>
     </w:p>
     <w:p>
       <w:pPr>
-        <w:spacing w:after="0" w:line="240" w:lineRule="auto"/>
-      </w:pPr>
-      <w:r>
-        <w:rPr>
-          <w:rFonts w:ascii="Courier New" w:cs="Courier New" w:eastAsia="Courier New" w:hAnsi="Courier New"/>
-          <w:sz w:val="20"/>
-          <w:szCs w:val="20"/>
+        <w:pBdr>
+          <w:left w:val="single" w:color="4472C4" w:sz="12" w:space="4"/>
+        </w:pBdr>
+        <w:shd w:fill="F2F2F2" w:color="auto" w:val="clear"/>
+        <w:spacing w:after="0" w:line="240" w:lineRule="auto"/>
+        <w:ind w:left="283"/>
+      </w:pPr>
+      <w:r>
+        <w:rPr>
+          <w:rFonts w:ascii="Courier New" w:cs="Courier New" w:eastAsia="Courier New" w:hAnsi="Courier New"/>
+          <w:sz w:val="18"/>
+          <w:szCs w:val="18"/>
+          <w:shd w:fill="F2F2F2" w:color="auto" w:val="clear"/>
         </w:rPr>
         <w:t xml:space="preserve">    return 10_000;</w:t>
       </w:r>
     </w:p>
     <w:p>
       <w:pPr>
-        <w:spacing w:after="0" w:line="240" w:lineRule="auto"/>
-      </w:pPr>
-      <w:r>
-        <w:rPr>
-          <w:rFonts w:ascii="Courier New" w:cs="Courier New" w:eastAsia="Courier New" w:hAnsi="Courier New"/>
-          <w:sz w:val="20"/>
-          <w:szCs w:val="20"/>
+        <w:pBdr>
+          <w:left w:val="single" w:color="4472C4" w:sz="12" w:space="4"/>
+        </w:pBdr>
+        <w:shd w:fill="F2F2F2" w:color="auto" w:val="clear"/>
+        <w:spacing w:after="0" w:line="240" w:lineRule="auto"/>
+        <w:ind w:left="283"/>
+      </w:pPr>
+      <w:r>
+        <w:rPr>
+          <w:rFonts w:ascii="Courier New" w:cs="Courier New" w:eastAsia="Courier New" w:hAnsi="Courier New"/>
+          <w:sz w:val="18"/>
+          <w:szCs w:val="18"/>
+          <w:shd w:fill="F2F2F2" w:color="auto" w:val="clear"/>
         </w:rPr>
         <w:t xml:space="preserve">  }</w:t>
       </w:r>
     </w:p>
     <w:p>
       <w:pPr>
-        <w:spacing w:after="0" w:line="240" w:lineRule="auto"/>
-      </w:pPr>
-      <w:r>
-        <w:rPr>
-          <w:rFonts w:ascii="Courier New" w:cs="Courier New" w:eastAsia="Courier New" w:hAnsi="Courier New"/>
-          <w:sz w:val="20"/>
-          <w:szCs w:val="20"/>
+        <w:pBdr>
+          <w:left w:val="single" w:color="4472C4" w:sz="12" w:space="4"/>
+        </w:pBdr>
+        <w:shd w:fill="F2F2F2" w:color="auto" w:val="clear"/>
+        <w:spacing w:after="0" w:line="240" w:lineRule="auto"/>
+        <w:ind w:left="283"/>
+      </w:pPr>
+      <w:r>
+        <w:rPr>
+          <w:rFonts w:ascii="Courier New" w:cs="Courier New" w:eastAsia="Courier New" w:hAnsi="Courier New"/>
+          <w:sz w:val="18"/>
+          <w:szCs w:val="18"/>
+          <w:shd w:fill="F2F2F2" w:color="auto" w:val="clear"/>
         </w:rPr>
         <w:t xml:space="preserve">  if (n &lt;= 10_000) return 10_000;</w:t>
       </w:r>
     </w:p>
     <w:p>
       <w:pPr>
-        <w:spacing w:after="0" w:line="240" w:lineRule="auto"/>
-      </w:pPr>
-      <w:r>
-        <w:rPr>
-          <w:rFonts w:ascii="Courier New" w:cs="Courier New" w:eastAsia="Courier New" w:hAnsi="Courier New"/>
-          <w:sz w:val="20"/>
-          <w:szCs w:val="20"/>
+        <w:pBdr>
+          <w:left w:val="single" w:color="4472C4" w:sz="12" w:space="4"/>
+        </w:pBdr>
+        <w:shd w:fill="F2F2F2" w:color="auto" w:val="clear"/>
+        <w:spacing w:after="0" w:line="240" w:lineRule="auto"/>
+        <w:ind w:left="283"/>
+      </w:pPr>
+      <w:r>
+        <w:rPr>
+          <w:rFonts w:ascii="Courier New" w:cs="Courier New" w:eastAsia="Courier New" w:hAnsi="Courier New"/>
+          <w:sz w:val="18"/>
+          <w:szCs w:val="18"/>
+          <w:shd w:fill="F2F2F2" w:color="auto" w:val="clear"/>
         </w:rPr>
         <w:t xml:space="preserve">  if (n &lt;= 100_000) return 1_000;</w:t>
       </w:r>
     </w:p>
     <w:p>
       <w:pPr>
-        <w:spacing w:after="0" w:line="240" w:lineRule="auto"/>
-      </w:pPr>
-      <w:r>
-        <w:rPr>
-          <w:rFonts w:ascii="Courier New" w:cs="Courier New" w:eastAsia="Courier New" w:hAnsi="Courier New"/>
-          <w:sz w:val="20"/>
-          <w:szCs w:val="20"/>
+        <w:pBdr>
+          <w:left w:val="single" w:color="4472C4" w:sz="12" w:space="4"/>
+        </w:pBdr>
+        <w:shd w:fill="F2F2F2" w:color="auto" w:val="clear"/>
+        <w:spacing w:after="0" w:line="240" w:lineRule="auto"/>
+        <w:ind w:left="283"/>
+      </w:pPr>
+      <w:r>
+        <w:rPr>
+          <w:rFonts w:ascii="Courier New" w:cs="Courier New" w:eastAsia="Courier New" w:hAnsi="Courier New"/>
+          <w:sz w:val="18"/>
+          <w:szCs w:val="18"/>
+          <w:shd w:fill="F2F2F2" w:color="auto" w:val="clear"/>
         </w:rPr>
         <w:t xml:space="preserve">  if (n &lt;= 1_000_000) return 100;</w:t>
       </w:r>
     </w:p>
     <w:p>
       <w:pPr>
-        <w:spacing w:after="0" w:line="240" w:lineRule="auto"/>
-      </w:pPr>
-      <w:r>
-        <w:rPr>
-          <w:rFonts w:ascii="Courier New" w:cs="Courier New" w:eastAsia="Courier New" w:hAnsi="Courier New"/>
-          <w:sz w:val="20"/>
-          <w:szCs w:val="20"/>
+        <w:pBdr>
+          <w:left w:val="single" w:color="4472C4" w:sz="12" w:space="4"/>
+        </w:pBdr>
+        <w:shd w:fill="F2F2F2" w:color="auto" w:val="clear"/>
+        <w:spacing w:after="0" w:line="240" w:lineRule="auto"/>
+        <w:ind w:left="283"/>
+      </w:pPr>
+      <w:r>
+        <w:rPr>
+          <w:rFonts w:ascii="Courier New" w:cs="Courier New" w:eastAsia="Courier New" w:hAnsi="Courier New"/>
+          <w:sz w:val="18"/>
+          <w:szCs w:val="18"/>
+          <w:shd w:fill="F2F2F2" w:color="auto" w:val="clear"/>
         </w:rPr>
         <w:t xml:space="preserve">  return 10;</w:t>
       </w:r>
     </w:p>
     <w:p>
       <w:pPr>
-        <w:spacing w:after="0" w:line="240" w:lineRule="auto"/>
-      </w:pPr>
-      <w:r>
-        <w:rPr>
-          <w:rFonts w:ascii="Courier New" w:cs="Courier New" w:eastAsia="Courier New" w:hAnsi="Courier New"/>
-          <w:sz w:val="20"/>
-          <w:szCs w:val="20"/>
+        <w:pBdr>
+          <w:left w:val="single" w:color="4472C4" w:sz="12" w:space="4"/>
+        </w:pBdr>
+        <w:shd w:fill="F2F2F2" w:color="auto" w:val="clear"/>
+        <w:spacing w:after="0" w:line="240" w:lineRule="auto"/>
+        <w:ind w:left="283"/>
+      </w:pPr>
+      <w:r>
+        <w:rPr>
+          <w:rFonts w:ascii="Courier New" w:cs="Courier New" w:eastAsia="Courier New" w:hAnsi="Courier New"/>
+          <w:sz w:val="18"/>
+          <w:szCs w:val="18"/>
+          <w:shd w:fill="F2F2F2" w:color="auto" w:val="clear"/>
         </w:rPr>
         <w:t xml:space="preserve">}</w:t>
       </w:r>
     </w:p>
     <w:p>
       <w:pPr>
-        <w:spacing w:after="0" w:line="240" w:lineRule="auto"/>
-      </w:pPr>
-      <w:r>
-        <w:rPr>
-          <w:rFonts w:ascii="Courier New" w:cs="Courier New" w:eastAsia="Courier New" w:hAnsi="Courier New"/>
-          <w:sz w:val="20"/>
-          <w:szCs w:val="20"/>
-        </w:rPr>
-        <w:t xml:space="preserve"/>
-      </w:r>
-    </w:p>
-    <w:p>
-      <w:pPr>
-        <w:spacing w:after="0" w:line="240" w:lineRule="auto"/>
-      </w:pPr>
-      <w:r>
-        <w:rPr>
-          <w:rFonts w:ascii="Courier New" w:cs="Courier New" w:eastAsia="Courier New" w:hAnsi="Courier New"/>
-          <w:sz w:val="20"/>
-          <w:szCs w:val="20"/>
+        <w:pBdr>
+          <w:left w:val="single" w:color="4472C4" w:sz="12" w:space="4"/>
+        </w:pBdr>
+        <w:shd w:fill="F2F2F2" w:color="auto" w:val="clear"/>
+        <w:spacing w:after="0" w:line="240" w:lineRule="auto"/>
+        <w:ind w:left="283"/>
+      </w:pPr>
+      <w:r>
+        <w:rPr>
+          <w:rFonts w:ascii="Courier New" w:cs="Courier New" w:eastAsia="Courier New" w:hAnsi="Courier New"/>
+          <w:sz w:val="18"/>
+          <w:szCs w:val="18"/>
+          <w:shd w:fill="F2F2F2" w:color="auto" w:val="clear"/>
+        </w:rPr>
+        <w:t xml:space="preserve"> </w:t>
+      </w:r>
+    </w:p>
+    <w:p>
+      <w:pPr>
+        <w:pBdr>
+          <w:left w:val="single" w:color="4472C4" w:sz="12" w:space="4"/>
+        </w:pBdr>
+        <w:shd w:fill="F2F2F2" w:color="auto" w:val="clear"/>
+        <w:spacing w:after="0" w:line="240" w:lineRule="auto"/>
+        <w:ind w:left="283"/>
+      </w:pPr>
+      <w:r>
+        <w:rPr>
+          <w:rFonts w:ascii="Courier New" w:cs="Courier New" w:eastAsia="Courier New" w:hAnsi="Courier New"/>
+          <w:sz w:val="18"/>
+          <w:szCs w:val="18"/>
+          <w:shd w:fill="F2F2F2" w:color="auto" w:val="clear"/>
         </w:rPr>
         <w:t xml:space="preserve">export function runBenchmarks(): BenchmarkResult[] {</w:t>
       </w:r>
     </w:p>
     <w:p>
       <w:pPr>
-        <w:spacing w:after="0" w:line="240" w:lineRule="auto"/>
-      </w:pPr>
-      <w:r>
-        <w:rPr>
-          <w:rFonts w:ascii="Courier New" w:cs="Courier New" w:eastAsia="Courier New" w:hAnsi="Courier New"/>
-          <w:sz w:val="20"/>
-          <w:szCs w:val="20"/>
+        <w:pBdr>
+          <w:left w:val="single" w:color="4472C4" w:sz="12" w:space="4"/>
+        </w:pBdr>
+        <w:shd w:fill="F2F2F2" w:color="auto" w:val="clear"/>
+        <w:spacing w:after="0" w:line="240" w:lineRule="auto"/>
+        <w:ind w:left="283"/>
+      </w:pPr>
+      <w:r>
+        <w:rPr>
+          <w:rFonts w:ascii="Courier New" w:cs="Courier New" w:eastAsia="Courier New" w:hAnsi="Courier New"/>
+          <w:sz w:val="18"/>
+          <w:szCs w:val="18"/>
+          <w:shd w:fill="F2F2F2" w:color="auto" w:val="clear"/>
         </w:rPr>
         <w:t xml:space="preserve">  const sizes = [1_000, 10_000, 100_000, 1_000_000, 10_000_000];</w:t>
       </w:r>
     </w:p>
     <w:p>
       <w:pPr>
-        <w:spacing w:after="0" w:line="240" w:lineRule="auto"/>
-      </w:pPr>
-      <w:r>
-        <w:rPr>
-          <w:rFonts w:ascii="Courier New" w:cs="Courier New" w:eastAsia="Courier New" w:hAnsi="Courier New"/>
-          <w:sz w:val="20"/>
-          <w:szCs w:val="20"/>
+        <w:pBdr>
+          <w:left w:val="single" w:color="4472C4" w:sz="12" w:space="4"/>
+        </w:pBdr>
+        <w:shd w:fill="F2F2F2" w:color="auto" w:val="clear"/>
+        <w:spacing w:after="0" w:line="240" w:lineRule="auto"/>
+        <w:ind w:left="283"/>
+      </w:pPr>
+      <w:r>
+        <w:rPr>
+          <w:rFonts w:ascii="Courier New" w:cs="Courier New" w:eastAsia="Courier New" w:hAnsi="Courier New"/>
+          <w:sz w:val="18"/>
+          <w:szCs w:val="18"/>
+          <w:shd w:fill="F2F2F2" w:color="auto" w:val="clear"/>
         </w:rPr>
         <w:t xml:space="preserve">  const results: BenchmarkResult[] = [];</w:t>
       </w:r>
     </w:p>
     <w:p>
       <w:pPr>
-        <w:spacing w:after="0" w:line="240" w:lineRule="auto"/>
-      </w:pPr>
-      <w:r>
-        <w:rPr>
-          <w:rFonts w:ascii="Courier New" w:cs="Courier New" w:eastAsia="Courier New" w:hAnsi="Courier New"/>
-          <w:sz w:val="20"/>
-          <w:szCs w:val="20"/>
-        </w:rPr>
-        <w:t xml:space="preserve"/>
-      </w:r>
-    </w:p>
-    <w:p>
-      <w:pPr>
-        <w:spacing w:after="0" w:line="240" w:lineRule="auto"/>
-      </w:pPr>
-      <w:r>
-        <w:rPr>
-          <w:rFonts w:ascii="Courier New" w:cs="Courier New" w:eastAsia="Courier New" w:hAnsi="Courier New"/>
-          <w:sz w:val="20"/>
-          <w:szCs w:val="20"/>
+        <w:pBdr>
+          <w:left w:val="single" w:color="4472C4" w:sz="12" w:space="4"/>
+        </w:pBdr>
+        <w:shd w:fill="F2F2F2" w:color="auto" w:val="clear"/>
+        <w:spacing w:after="0" w:line="240" w:lineRule="auto"/>
+        <w:ind w:left="283"/>
+      </w:pPr>
+      <w:r>
+        <w:rPr>
+          <w:rFonts w:ascii="Courier New" w:cs="Courier New" w:eastAsia="Courier New" w:hAnsi="Courier New"/>
+          <w:sz w:val="18"/>
+          <w:szCs w:val="18"/>
+          <w:shd w:fill="F2F2F2" w:color="auto" w:val="clear"/>
+        </w:rPr>
+        <w:t xml:space="preserve"> </w:t>
+      </w:r>
+    </w:p>
+    <w:p>
+      <w:pPr>
+        <w:pBdr>
+          <w:left w:val="single" w:color="4472C4" w:sz="12" w:space="4"/>
+        </w:pBdr>
+        <w:shd w:fill="F2F2F2" w:color="auto" w:val="clear"/>
+        <w:spacing w:after="0" w:line="240" w:lineRule="auto"/>
+        <w:ind w:left="283"/>
+      </w:pPr>
+      <w:r>
+        <w:rPr>
+          <w:rFonts w:ascii="Courier New" w:cs="Courier New" w:eastAsia="Courier New" w:hAnsi="Courier New"/>
+          <w:sz w:val="18"/>
+          <w:szCs w:val="18"/>
+          <w:shd w:fill="F2F2F2" w:color="auto" w:val="clear"/>
         </w:rPr>
         <w:t xml:space="preserve">  for (const n of sizes) {</w:t>
       </w:r>
     </w:p>
     <w:p>
       <w:pPr>
-        <w:spacing w:after="0" w:line="240" w:lineRule="auto"/>
-      </w:pPr>
-      <w:r>
-        <w:rPr>
-          <w:rFonts w:ascii="Courier New" w:cs="Courier New" w:eastAsia="Courier New" w:hAnsi="Courier New"/>
-          <w:sz w:val="20"/>
-          <w:szCs w:val="20"/>
+        <w:pBdr>
+          <w:left w:val="single" w:color="4472C4" w:sz="12" w:space="4"/>
+        </w:pBdr>
+        <w:shd w:fill="F2F2F2" w:color="auto" w:val="clear"/>
+        <w:spacing w:after="0" w:line="240" w:lineRule="auto"/>
+        <w:ind w:left="283"/>
+      </w:pPr>
+      <w:r>
+        <w:rPr>
+          <w:rFonts w:ascii="Courier New" w:cs="Courier New" w:eastAsia="Courier New" w:hAnsi="Courier New"/>
+          <w:sz w:val="18"/>
+          <w:szCs w:val="18"/>
+          <w:shd w:fill="F2F2F2" w:color="auto" w:val="clear"/>
         </w:rPr>
         <w:t xml:space="preserve">    const arr = Array.from({ length: n }, (_, i) =&gt; i);</w:t>
       </w:r>
     </w:p>
     <w:p>
       <w:pPr>
-        <w:spacing w:after="0" w:line="240" w:lineRule="auto"/>
-      </w:pPr>
-      <w:r>
-        <w:rPr>
-          <w:rFonts w:ascii="Courier New" w:cs="Courier New" w:eastAsia="Courier New" w:hAnsi="Courier New"/>
-          <w:sz w:val="20"/>
-          <w:szCs w:val="20"/>
+        <w:pBdr>
+          <w:left w:val="single" w:color="4472C4" w:sz="12" w:space="4"/>
+        </w:pBdr>
+        <w:shd w:fill="F2F2F2" w:color="auto" w:val="clear"/>
+        <w:spacing w:after="0" w:line="240" w:lineRule="auto"/>
+        <w:ind w:left="283"/>
+      </w:pPr>
+      <w:r>
+        <w:rPr>
+          <w:rFonts w:ascii="Courier New" w:cs="Courier New" w:eastAsia="Courier New" w:hAnsi="Courier New"/>
+          <w:sz w:val="18"/>
+          <w:szCs w:val="18"/>
+          <w:shd w:fill="F2F2F2" w:color="auto" w:val="clear"/>
         </w:rPr>
         <w:t xml:space="preserve">    const target = n;</w:t>
       </w:r>
     </w:p>
     <w:p>
       <w:pPr>
-        <w:spacing w:after="0" w:line="240" w:lineRule="auto"/>
-      </w:pPr>
-      <w:r>
-        <w:rPr>
-          <w:rFonts w:ascii="Courier New" w:cs="Courier New" w:eastAsia="Courier New" w:hAnsi="Courier New"/>
-          <w:sz w:val="20"/>
-          <w:szCs w:val="20"/>
-        </w:rPr>
-        <w:t xml:space="preserve"/>
-      </w:r>
-    </w:p>
-    <w:p>
-      <w:pPr>
-        <w:spacing w:after="0" w:line="240" w:lineRule="auto"/>
-      </w:pPr>
-      <w:r>
-        <w:rPr>
-          <w:rFonts w:ascii="Courier New" w:cs="Courier New" w:eastAsia="Courier New" w:hAnsi="Courier New"/>
-          <w:sz w:val="20"/>
-          <w:szCs w:val="20"/>
+        <w:pBdr>
+          <w:left w:val="single" w:color="4472C4" w:sz="12" w:space="4"/>
+        </w:pBdr>
+        <w:shd w:fill="F2F2F2" w:color="auto" w:val="clear"/>
+        <w:spacing w:after="0" w:line="240" w:lineRule="auto"/>
+        <w:ind w:left="283"/>
+      </w:pPr>
+      <w:r>
+        <w:rPr>
+          <w:rFonts w:ascii="Courier New" w:cs="Courier New" w:eastAsia="Courier New" w:hAnsi="Courier New"/>
+          <w:sz w:val="18"/>
+          <w:szCs w:val="18"/>
+          <w:shd w:fill="F2F2F2" w:color="auto" w:val="clear"/>
+        </w:rPr>
+        <w:t xml:space="preserve"> </w:t>
+      </w:r>
+    </w:p>
+    <w:p>
+      <w:pPr>
+        <w:pBdr>
+          <w:left w:val="single" w:color="4472C4" w:sz="12" w:space="4"/>
+        </w:pBdr>
+        <w:shd w:fill="F2F2F2" w:color="auto" w:val="clear"/>
+        <w:spacing w:after="0" w:line="240" w:lineRule="auto"/>
+        <w:ind w:left="283"/>
+      </w:pPr>
+      <w:r>
+        <w:rPr>
+          <w:rFonts w:ascii="Courier New" w:cs="Courier New" w:eastAsia="Courier New" w:hAnsi="Courier New"/>
+          <w:sz w:val="18"/>
+          <w:szCs w:val="18"/>
+          <w:shd w:fill="F2F2F2" w:color="auto" w:val="clear"/>
         </w:rPr>
         <w:t xml:space="preserve">    const linearIter = chooseIterations(n, false);</w:t>
       </w:r>
     </w:p>
     <w:p>
       <w:pPr>
-        <w:spacing w:after="0" w:line="240" w:lineRule="auto"/>
-      </w:pPr>
-      <w:r>
-        <w:rPr>
-          <w:rFonts w:ascii="Courier New" w:cs="Courier New" w:eastAsia="Courier New" w:hAnsi="Courier New"/>
-          <w:sz w:val="20"/>
-          <w:szCs w:val="20"/>
+        <w:pBdr>
+          <w:left w:val="single" w:color="4472C4" w:sz="12" w:space="4"/>
+        </w:pBdr>
+        <w:shd w:fill="F2F2F2" w:color="auto" w:val="clear"/>
+        <w:spacing w:after="0" w:line="240" w:lineRule="auto"/>
+        <w:ind w:left="283"/>
+      </w:pPr>
+      <w:r>
+        <w:rPr>
+          <w:rFonts w:ascii="Courier New" w:cs="Courier New" w:eastAsia="Courier New" w:hAnsi="Courier New"/>
+          <w:sz w:val="18"/>
+          <w:szCs w:val="18"/>
+          <w:shd w:fill="F2F2F2" w:color="auto" w:val="clear"/>
         </w:rPr>
         <w:t xml:space="preserve">    const binaryIter = chooseIterations(n, true);</w:t>
       </w:r>
     </w:p>
     <w:p>
       <w:pPr>
-        <w:spacing w:after="0" w:line="240" w:lineRule="auto"/>
-      </w:pPr>
-      <w:r>
-        <w:rPr>
-          <w:rFonts w:ascii="Courier New" w:cs="Courier New" w:eastAsia="Courier New" w:hAnsi="Courier New"/>
-          <w:sz w:val="20"/>
-          <w:szCs w:val="20"/>
-        </w:rPr>
-        <w:t xml:space="preserve"/>
-      </w:r>
-    </w:p>
-    <w:p>
-      <w:pPr>
-        <w:spacing w:after="0" w:line="240" w:lineRule="auto"/>
-      </w:pPr>
-      <w:r>
-        <w:rPr>
-          <w:rFonts w:ascii="Courier New" w:cs="Courier New" w:eastAsia="Courier New" w:hAnsi="Courier New"/>
-          <w:sz w:val="20"/>
-          <w:szCs w:val="20"/>
+        <w:pBdr>
+          <w:left w:val="single" w:color="4472C4" w:sz="12" w:space="4"/>
+        </w:pBdr>
+        <w:shd w:fill="F2F2F2" w:color="auto" w:val="clear"/>
+        <w:spacing w:after="0" w:line="240" w:lineRule="auto"/>
+        <w:ind w:left="283"/>
+      </w:pPr>
+      <w:r>
+        <w:rPr>
+          <w:rFonts w:ascii="Courier New" w:cs="Courier New" w:eastAsia="Courier New" w:hAnsi="Courier New"/>
+          <w:sz w:val="18"/>
+          <w:szCs w:val="18"/>
+          <w:shd w:fill="F2F2F2" w:color="auto" w:val="clear"/>
+        </w:rPr>
+        <w:t xml:space="preserve"> </w:t>
+      </w:r>
+    </w:p>
+    <w:p>
+      <w:pPr>
+        <w:pBdr>
+          <w:left w:val="single" w:color="4472C4" w:sz="12" w:space="4"/>
+        </w:pBdr>
+        <w:shd w:fill="F2F2F2" w:color="auto" w:val="clear"/>
+        <w:spacing w:after="0" w:line="240" w:lineRule="auto"/>
+        <w:ind w:left="283"/>
+      </w:pPr>
+      <w:r>
+        <w:rPr>
+          <w:rFonts w:ascii="Courier New" w:cs="Courier New" w:eastAsia="Courier New" w:hAnsi="Courier New"/>
+          <w:sz w:val="18"/>
+          <w:szCs w:val="18"/>
+          <w:shd w:fill="F2F2F2" w:color="auto" w:val="clear"/>
         </w:rPr>
         <w:t xml:space="preserve">    const linearMs = measureAverage(linearSearch, arr, target, linearIter);</w:t>
       </w:r>
     </w:p>
     <w:p>
       <w:pPr>
-        <w:spacing w:after="0" w:line="240" w:lineRule="auto"/>
-      </w:pPr>
-      <w:r>
-        <w:rPr>
-          <w:rFonts w:ascii="Courier New" w:cs="Courier New" w:eastAsia="Courier New" w:hAnsi="Courier New"/>
-          <w:sz w:val="20"/>
-          <w:szCs w:val="20"/>
+        <w:pBdr>
+          <w:left w:val="single" w:color="4472C4" w:sz="12" w:space="4"/>
+        </w:pBdr>
+        <w:shd w:fill="F2F2F2" w:color="auto" w:val="clear"/>
+        <w:spacing w:after="0" w:line="240" w:lineRule="auto"/>
+        <w:ind w:left="283"/>
+      </w:pPr>
+      <w:r>
+        <w:rPr>
+          <w:rFonts w:ascii="Courier New" w:cs="Courier New" w:eastAsia="Courier New" w:hAnsi="Courier New"/>
+          <w:sz w:val="18"/>
+          <w:szCs w:val="18"/>
+          <w:shd w:fill="F2F2F2" w:color="auto" w:val="clear"/>
         </w:rPr>
         <w:t xml:space="preserve">    const binaryIterMs = measureAverage(binarySearchIterative, arr, target, binaryIter);</w:t>
       </w:r>
     </w:p>
     <w:p>
       <w:pPr>
-        <w:spacing w:after="0" w:line="240" w:lineRule="auto"/>
-      </w:pPr>
-      <w:r>
-        <w:rPr>
-          <w:rFonts w:ascii="Courier New" w:cs="Courier New" w:eastAsia="Courier New" w:hAnsi="Courier New"/>
-          <w:sz w:val="20"/>
-          <w:szCs w:val="20"/>
+        <w:pBdr>
+          <w:left w:val="single" w:color="4472C4" w:sz="12" w:space="4"/>
+        </w:pBdr>
+        <w:shd w:fill="F2F2F2" w:color="auto" w:val="clear"/>
+        <w:spacing w:after="0" w:line="240" w:lineRule="auto"/>
+        <w:ind w:left="283"/>
+      </w:pPr>
+      <w:r>
+        <w:rPr>
+          <w:rFonts w:ascii="Courier New" w:cs="Courier New" w:eastAsia="Courier New" w:hAnsi="Courier New"/>
+          <w:sz w:val="18"/>
+          <w:szCs w:val="18"/>
+          <w:shd w:fill="F2F2F2" w:color="auto" w:val="clear"/>
         </w:rPr>
         <w:t xml:space="preserve">    const binaryRecMs = measureAverage(binarySearchRecursive, arr, target, binaryIter);</w:t>
       </w:r>
     </w:p>
     <w:p>
       <w:pPr>
-        <w:spacing w:after="0" w:line="240" w:lineRule="auto"/>
-      </w:pPr>
-      <w:r>
-        <w:rPr>
-          <w:rFonts w:ascii="Courier New" w:cs="Courier New" w:eastAsia="Courier New" w:hAnsi="Courier New"/>
-          <w:sz w:val="20"/>
-          <w:szCs w:val="20"/>
-        </w:rPr>
-        <w:t xml:space="preserve"/>
-      </w:r>
-    </w:p>
-    <w:p>
-      <w:pPr>
-        <w:spacing w:after="0" w:line="240" w:lineRule="auto"/>
-      </w:pPr>
-      <w:r>
-        <w:rPr>
-          <w:rFonts w:ascii="Courier New" w:cs="Courier New" w:eastAsia="Courier New" w:hAnsi="Courier New"/>
-          <w:sz w:val="20"/>
-          <w:szCs w:val="20"/>
+        <w:pBdr>
+          <w:left w:val="single" w:color="4472C4" w:sz="12" w:space="4"/>
+        </w:pBdr>
+        <w:shd w:fill="F2F2F2" w:color="auto" w:val="clear"/>
+        <w:spacing w:after="0" w:line="240" w:lineRule="auto"/>
+        <w:ind w:left="283"/>
+      </w:pPr>
+      <w:r>
+        <w:rPr>
+          <w:rFonts w:ascii="Courier New" w:cs="Courier New" w:eastAsia="Courier New" w:hAnsi="Courier New"/>
+          <w:sz w:val="18"/>
+          <w:szCs w:val="18"/>
+          <w:shd w:fill="F2F2F2" w:color="auto" w:val="clear"/>
+        </w:rPr>
+        <w:t xml:space="preserve"> </w:t>
+      </w:r>
+    </w:p>
+    <w:p>
+      <w:pPr>
+        <w:pBdr>
+          <w:left w:val="single" w:color="4472C4" w:sz="12" w:space="4"/>
+        </w:pBdr>
+        <w:shd w:fill="F2F2F2" w:color="auto" w:val="clear"/>
+        <w:spacing w:after="0" w:line="240" w:lineRule="auto"/>
+        <w:ind w:left="283"/>
+      </w:pPr>
+      <w:r>
+        <w:rPr>
+          <w:rFonts w:ascii="Courier New" w:cs="Courier New" w:eastAsia="Courier New" w:hAnsi="Courier New"/>
+          <w:sz w:val="18"/>
+          <w:szCs w:val="18"/>
+          <w:shd w:fill="F2F2F2" w:color="auto" w:val="clear"/>
         </w:rPr>
         <w:t xml:space="preserve">    results.push({ n, linearMs, binaryIterMs, binaryRecMs });</w:t>
       </w:r>
     </w:p>
     <w:p>
       <w:pPr>
-        <w:spacing w:after="0" w:line="240" w:lineRule="auto"/>
-      </w:pPr>
-      <w:r>
-        <w:rPr>
-          <w:rFonts w:ascii="Courier New" w:cs="Courier New" w:eastAsia="Courier New" w:hAnsi="Courier New"/>
-          <w:sz w:val="20"/>
-          <w:szCs w:val="20"/>
+        <w:pBdr>
+          <w:left w:val="single" w:color="4472C4" w:sz="12" w:space="4"/>
+        </w:pBdr>
+        <w:shd w:fill="F2F2F2" w:color="auto" w:val="clear"/>
+        <w:spacing w:after="0" w:line="240" w:lineRule="auto"/>
+        <w:ind w:left="283"/>
+      </w:pPr>
+      <w:r>
+        <w:rPr>
+          <w:rFonts w:ascii="Courier New" w:cs="Courier New" w:eastAsia="Courier New" w:hAnsi="Courier New"/>
+          <w:sz w:val="18"/>
+          <w:szCs w:val="18"/>
+          <w:shd w:fill="F2F2F2" w:color="auto" w:val="clear"/>
         </w:rPr>
         <w:t xml:space="preserve">  }</w:t>
       </w:r>
     </w:p>
     <w:p>
       <w:pPr>
-        <w:spacing w:after="0" w:line="240" w:lineRule="auto"/>
-      </w:pPr>
-      <w:r>
-        <w:rPr>
-          <w:rFonts w:ascii="Courier New" w:cs="Courier New" w:eastAsia="Courier New" w:hAnsi="Courier New"/>
-          <w:sz w:val="20"/>
-          <w:szCs w:val="20"/>
-        </w:rPr>
-        <w:t xml:space="preserve"/>
-      </w:r>
-    </w:p>
-    <w:p>
-      <w:pPr>
-        <w:spacing w:after="0" w:line="240" w:lineRule="auto"/>
-      </w:pPr>
-      <w:r>
-        <w:rPr>
-          <w:rFonts w:ascii="Courier New" w:cs="Courier New" w:eastAsia="Courier New" w:hAnsi="Courier New"/>
-          <w:sz w:val="20"/>
-          <w:szCs w:val="20"/>
+        <w:pBdr>
+          <w:left w:val="single" w:color="4472C4" w:sz="12" w:space="4"/>
+        </w:pBdr>
+        <w:shd w:fill="F2F2F2" w:color="auto" w:val="clear"/>
+        <w:spacing w:after="0" w:line="240" w:lineRule="auto"/>
+        <w:ind w:left="283"/>
+      </w:pPr>
+      <w:r>
+        <w:rPr>
+          <w:rFonts w:ascii="Courier New" w:cs="Courier New" w:eastAsia="Courier New" w:hAnsi="Courier New"/>
+          <w:sz w:val="18"/>
+          <w:szCs w:val="18"/>
+          <w:shd w:fill="F2F2F2" w:color="auto" w:val="clear"/>
+        </w:rPr>
+        <w:t xml:space="preserve"> </w:t>
+      </w:r>
+    </w:p>
+    <w:p>
+      <w:pPr>
+        <w:pBdr>
+          <w:left w:val="single" w:color="4472C4" w:sz="12" w:space="4"/>
+        </w:pBdr>
+        <w:shd w:fill="F2F2F2" w:color="auto" w:val="clear"/>
+        <w:spacing w:after="0" w:line="240" w:lineRule="auto"/>
+        <w:ind w:left="283"/>
+      </w:pPr>
+      <w:r>
+        <w:rPr>
+          <w:rFonts w:ascii="Courier New" w:cs="Courier New" w:eastAsia="Courier New" w:hAnsi="Courier New"/>
+          <w:sz w:val="18"/>
+          <w:szCs w:val="18"/>
+          <w:shd w:fill="F2F2F2" w:color="auto" w:val="clear"/>
         </w:rPr>
         <w:t xml:space="preserve">  return results;</w:t>
       </w:r>
     </w:p>
     <w:p>
       <w:pPr>
-        <w:spacing w:after="0" w:line="240" w:lineRule="auto"/>
-      </w:pPr>
-      <w:r>
-        <w:rPr>
-          <w:rFonts w:ascii="Courier New" w:cs="Courier New" w:eastAsia="Courier New" w:hAnsi="Courier New"/>
-          <w:sz w:val="20"/>
-          <w:szCs w:val="20"/>
+        <w:pBdr>
+          <w:left w:val="single" w:color="4472C4" w:sz="12" w:space="4"/>
+        </w:pBdr>
+        <w:shd w:fill="F2F2F2" w:color="auto" w:val="clear"/>
+        <w:spacing w:after="0" w:line="240" w:lineRule="auto"/>
+        <w:ind w:left="283"/>
+      </w:pPr>
+      <w:r>
+        <w:rPr>
+          <w:rFonts w:ascii="Courier New" w:cs="Courier New" w:eastAsia="Courier New" w:hAnsi="Courier New"/>
+          <w:sz w:val="18"/>
+          <w:szCs w:val="18"/>
+          <w:shd w:fill="F2F2F2" w:color="auto" w:val="clear"/>
         </w:rPr>
         <w:t xml:space="preserve">}</w:t>
       </w:r>
     </w:p>
     <w:p>
       <w:pPr>
-        <w:spacing w:after="0" w:line="240" w:lineRule="auto"/>
-      </w:pPr>
-      <w:r>
-        <w:rPr>
-          <w:rFonts w:ascii="Courier New" w:cs="Courier New" w:eastAsia="Courier New" w:hAnsi="Courier New"/>
-          <w:sz w:val="20"/>
-          <w:szCs w:val="20"/>
-        </w:rPr>
-        <w:t xml:space="preserve"/>
-      </w:r>
-    </w:p>
-    <w:p>
-      <w:pPr>
-        <w:spacing w:after="0" w:line="240" w:lineRule="auto"/>
-      </w:pPr>
-      <w:r>
-        <w:rPr>
-          <w:rFonts w:ascii="Courier New" w:cs="Courier New" w:eastAsia="Courier New" w:hAnsi="Courier New"/>
-          <w:sz w:val="20"/>
-          <w:szCs w:val="20"/>
+        <w:pBdr>
+          <w:left w:val="single" w:color="4472C4" w:sz="12" w:space="4"/>
+        </w:pBdr>
+        <w:shd w:fill="F2F2F2" w:color="auto" w:val="clear"/>
+        <w:spacing w:after="0" w:line="240" w:lineRule="auto"/>
+        <w:ind w:left="283"/>
+      </w:pPr>
+      <w:r>
+        <w:rPr>
+          <w:rFonts w:ascii="Courier New" w:cs="Courier New" w:eastAsia="Courier New" w:hAnsi="Courier New"/>
+          <w:sz w:val="18"/>
+          <w:szCs w:val="18"/>
+          <w:shd w:fill="F2F2F2" w:color="auto" w:val="clear"/>
+        </w:rPr>
+        <w:t xml:space="preserve"> </w:t>
+      </w:r>
+    </w:p>
+    <w:p>
+      <w:pPr>
+        <w:pBdr>
+          <w:left w:val="single" w:color="4472C4" w:sz="12" w:space="4"/>
+        </w:pBdr>
+        <w:shd w:fill="F2F2F2" w:color="auto" w:val="clear"/>
+        <w:spacing w:after="0" w:line="240" w:lineRule="auto"/>
+        <w:ind w:left="283"/>
+      </w:pPr>
+      <w:r>
+        <w:rPr>
+          <w:rFonts w:ascii="Courier New" w:cs="Courier New" w:eastAsia="Courier New" w:hAnsi="Courier New"/>
+          <w:sz w:val="18"/>
+          <w:szCs w:val="18"/>
+          <w:shd w:fill="F2F2F2" w:color="auto" w:val="clear"/>
         </w:rPr>
         <w:t xml:space="preserve">export function formatResults(results: BenchmarkResult[]): string {</w:t>
       </w:r>
     </w:p>
     <w:p>
       <w:pPr>
-        <w:spacing w:after="0" w:line="240" w:lineRule="auto"/>
-      </w:pPr>
-      <w:r>
-        <w:rPr>
-          <w:rFonts w:ascii="Courier New" w:cs="Courier New" w:eastAsia="Courier New" w:hAnsi="Courier New"/>
-          <w:sz w:val="20"/>
-          <w:szCs w:val="20"/>
+        <w:pBdr>
+          <w:left w:val="single" w:color="4472C4" w:sz="12" w:space="4"/>
+        </w:pBdr>
+        <w:shd w:fill="F2F2F2" w:color="auto" w:val="clear"/>
+        <w:spacing w:after="0" w:line="240" w:lineRule="auto"/>
+        <w:ind w:left="283"/>
+      </w:pPr>
+      <w:r>
+        <w:rPr>
+          <w:rFonts w:ascii="Courier New" w:cs="Courier New" w:eastAsia="Courier New" w:hAnsi="Courier New"/>
+          <w:sz w:val="18"/>
+          <w:szCs w:val="18"/>
+          <w:shd w:fill="F2F2F2" w:color="auto" w:val="clear"/>
         </w:rPr>
         <w:t xml:space="preserve">  const header = "n".padStart(12) + "Linear (ms)".padStart(16) + "Binary iter (ms)".padStart(20) + "Binary rec (ms)".padStart(20);</w:t>
       </w:r>
     </w:p>
     <w:p>
       <w:pPr>
-        <w:spacing w:after="0" w:line="240" w:lineRule="auto"/>
-      </w:pPr>
-      <w:r>
-        <w:rPr>
-          <w:rFonts w:ascii="Courier New" w:cs="Courier New" w:eastAsia="Courier New" w:hAnsi="Courier New"/>
-          <w:sz w:val="20"/>
-          <w:szCs w:val="20"/>
+        <w:pBdr>
+          <w:left w:val="single" w:color="4472C4" w:sz="12" w:space="4"/>
+        </w:pBdr>
+        <w:shd w:fill="F2F2F2" w:color="auto" w:val="clear"/>
+        <w:spacing w:after="0" w:line="240" w:lineRule="auto"/>
+        <w:ind w:left="283"/>
+      </w:pPr>
+      <w:r>
+        <w:rPr>
+          <w:rFonts w:ascii="Courier New" w:cs="Courier New" w:eastAsia="Courier New" w:hAnsi="Courier New"/>
+          <w:sz w:val="18"/>
+          <w:szCs w:val="18"/>
+          <w:shd w:fill="F2F2F2" w:color="auto" w:val="clear"/>
         </w:rPr>
         <w:t xml:space="preserve">  const separator = "─".repeat(header.length);</w:t>
       </w:r>
     </w:p>
     <w:p>
       <w:pPr>
-        <w:spacing w:after="0" w:line="240" w:lineRule="auto"/>
-      </w:pPr>
-      <w:r>
-        <w:rPr>
-          <w:rFonts w:ascii="Courier New" w:cs="Courier New" w:eastAsia="Courier New" w:hAnsi="Courier New"/>
-          <w:sz w:val="20"/>
-          <w:szCs w:val="20"/>
-        </w:rPr>
-        <w:t xml:space="preserve"/>
-      </w:r>
-    </w:p>
-    <w:p>
-      <w:pPr>
-        <w:spacing w:after="0" w:line="240" w:lineRule="auto"/>
-      </w:pPr>
-      <w:r>
-        <w:rPr>
-          <w:rFonts w:ascii="Courier New" w:cs="Courier New" w:eastAsia="Courier New" w:hAnsi="Courier New"/>
-          <w:sz w:val="20"/>
-          <w:szCs w:val="20"/>
+        <w:pBdr>
+          <w:left w:val="single" w:color="4472C4" w:sz="12" w:space="4"/>
+        </w:pBdr>
+        <w:shd w:fill="F2F2F2" w:color="auto" w:val="clear"/>
+        <w:spacing w:after="0" w:line="240" w:lineRule="auto"/>
+        <w:ind w:left="283"/>
+      </w:pPr>
+      <w:r>
+        <w:rPr>
+          <w:rFonts w:ascii="Courier New" w:cs="Courier New" w:eastAsia="Courier New" w:hAnsi="Courier New"/>
+          <w:sz w:val="18"/>
+          <w:szCs w:val="18"/>
+          <w:shd w:fill="F2F2F2" w:color="auto" w:val="clear"/>
+        </w:rPr>
+        <w:t xml:space="preserve"> </w:t>
+      </w:r>
+    </w:p>
+    <w:p>
+      <w:pPr>
+        <w:pBdr>
+          <w:left w:val="single" w:color="4472C4" w:sz="12" w:space="4"/>
+        </w:pBdr>
+        <w:shd w:fill="F2F2F2" w:color="auto" w:val="clear"/>
+        <w:spacing w:after="0" w:line="240" w:lineRule="auto"/>
+        <w:ind w:left="283"/>
+      </w:pPr>
+      <w:r>
+        <w:rPr>
+          <w:rFonts w:ascii="Courier New" w:cs="Courier New" w:eastAsia="Courier New" w:hAnsi="Courier New"/>
+          <w:sz w:val="18"/>
+          <w:szCs w:val="18"/>
+          <w:shd w:fill="F2F2F2" w:color="auto" w:val="clear"/>
         </w:rPr>
         <w:t xml:space="preserve">  const rows = results.map((r) =&gt; {</w:t>
       </w:r>
     </w:p>
     <w:p>
       <w:pPr>
-        <w:spacing w:after="0" w:line="240" w:lineRule="auto"/>
-      </w:pPr>
-      <w:r>
-        <w:rPr>
-          <w:rFonts w:ascii="Courier New" w:cs="Courier New" w:eastAsia="Courier New" w:hAnsi="Courier New"/>
-          <w:sz w:val="20"/>
-          <w:szCs w:val="20"/>
+        <w:pBdr>
+          <w:left w:val="single" w:color="4472C4" w:sz="12" w:space="4"/>
+        </w:pBdr>
+        <w:shd w:fill="F2F2F2" w:color="auto" w:val="clear"/>
+        <w:spacing w:after="0" w:line="240" w:lineRule="auto"/>
+        <w:ind w:left="283"/>
+      </w:pPr>
+      <w:r>
+        <w:rPr>
+          <w:rFonts w:ascii="Courier New" w:cs="Courier New" w:eastAsia="Courier New" w:hAnsi="Courier New"/>
+          <w:sz w:val="18"/>
+          <w:szCs w:val="18"/>
+          <w:shd w:fill="F2F2F2" w:color="auto" w:val="clear"/>
         </w:rPr>
         <w:t xml:space="preserve">    const nStr = r.n.toLocaleString("uk-UA").padStart(12);</w:t>
       </w:r>
     </w:p>
     <w:p>
       <w:pPr>
-        <w:spacing w:after="0" w:line="240" w:lineRule="auto"/>
-      </w:pPr>
-      <w:r>
-        <w:rPr>
-          <w:rFonts w:ascii="Courier New" w:cs="Courier New" w:eastAsia="Courier New" w:hAnsi="Courier New"/>
-          <w:sz w:val="20"/>
-          <w:szCs w:val="20"/>
+        <w:pBdr>
+          <w:left w:val="single" w:color="4472C4" w:sz="12" w:space="4"/>
+        </w:pBdr>
+        <w:shd w:fill="F2F2F2" w:color="auto" w:val="clear"/>
+        <w:spacing w:after="0" w:line="240" w:lineRule="auto"/>
+        <w:ind w:left="283"/>
+      </w:pPr>
+      <w:r>
+        <w:rPr>
+          <w:rFonts w:ascii="Courier New" w:cs="Courier New" w:eastAsia="Courier New" w:hAnsi="Courier New"/>
+          <w:sz w:val="18"/>
+          <w:szCs w:val="18"/>
+          <w:shd w:fill="F2F2F2" w:color="auto" w:val="clear"/>
         </w:rPr>
         <w:t xml:space="preserve">    const lin = r.linearMs.toFixed(4).padStart(16);</w:t>
       </w:r>
     </w:p>
     <w:p>
       <w:pPr>
-        <w:spacing w:after="0" w:line="240" w:lineRule="auto"/>
-      </w:pPr>
-      <w:r>
-        <w:rPr>
-          <w:rFonts w:ascii="Courier New" w:cs="Courier New" w:eastAsia="Courier New" w:hAnsi="Courier New"/>
-          <w:sz w:val="20"/>
-          <w:szCs w:val="20"/>
+        <w:pBdr>
+          <w:left w:val="single" w:color="4472C4" w:sz="12" w:space="4"/>
+        </w:pBdr>
+        <w:shd w:fill="F2F2F2" w:color="auto" w:val="clear"/>
+        <w:spacing w:after="0" w:line="240" w:lineRule="auto"/>
+        <w:ind w:left="283"/>
+      </w:pPr>
+      <w:r>
+        <w:rPr>
+          <w:rFonts w:ascii="Courier New" w:cs="Courier New" w:eastAsia="Courier New" w:hAnsi="Courier New"/>
+          <w:sz w:val="18"/>
+          <w:szCs w:val="18"/>
+          <w:shd w:fill="F2F2F2" w:color="auto" w:val="clear"/>
         </w:rPr>
         <w:t xml:space="preserve">    const binI = r.binaryIterMs.toFixed(4).padStart(20);</w:t>
       </w:r>
     </w:p>
     <w:p>
       <w:pPr>
-        <w:spacing w:after="0" w:line="240" w:lineRule="auto"/>
-      </w:pPr>
-      <w:r>
-        <w:rPr>
-          <w:rFonts w:ascii="Courier New" w:cs="Courier New" w:eastAsia="Courier New" w:hAnsi="Courier New"/>
-          <w:sz w:val="20"/>
-          <w:szCs w:val="20"/>
+        <w:pBdr>
+          <w:left w:val="single" w:color="4472C4" w:sz="12" w:space="4"/>
+        </w:pBdr>
+        <w:shd w:fill="F2F2F2" w:color="auto" w:val="clear"/>
+        <w:spacing w:after="0" w:line="240" w:lineRule="auto"/>
+        <w:ind w:left="283"/>
+      </w:pPr>
+      <w:r>
+        <w:rPr>
+          <w:rFonts w:ascii="Courier New" w:cs="Courier New" w:eastAsia="Courier New" w:hAnsi="Courier New"/>
+          <w:sz w:val="18"/>
+          <w:szCs w:val="18"/>
+          <w:shd w:fill="F2F2F2" w:color="auto" w:val="clear"/>
         </w:rPr>
         <w:t xml:space="preserve">    const binR = r.binaryRecMs.toFixed(4).padStart(20);</w:t>
       </w:r>
     </w:p>
     <w:p>
       <w:pPr>
-        <w:spacing w:after="0" w:line="240" w:lineRule="auto"/>
-      </w:pPr>
-      <w:r>
-        <w:rPr>
-          <w:rFonts w:ascii="Courier New" w:cs="Courier New" w:eastAsia="Courier New" w:hAnsi="Courier New"/>
-          <w:sz w:val="20"/>
-          <w:szCs w:val="20"/>
+        <w:pBdr>
+          <w:left w:val="single" w:color="4472C4" w:sz="12" w:space="4"/>
+        </w:pBdr>
+        <w:shd w:fill="F2F2F2" w:color="auto" w:val="clear"/>
+        <w:spacing w:after="0" w:line="240" w:lineRule="auto"/>
+        <w:ind w:left="283"/>
+      </w:pPr>
+      <w:r>
+        <w:rPr>
+          <w:rFonts w:ascii="Courier New" w:cs="Courier New" w:eastAsia="Courier New" w:hAnsi="Courier New"/>
+          <w:sz w:val="18"/>
+          <w:szCs w:val="18"/>
+          <w:shd w:fill="F2F2F2" w:color="auto" w:val="clear"/>
         </w:rPr>
         <w:t xml:space="preserve">    return `${nStr}${lin}${binI}${binR}`;</w:t>
       </w:r>
     </w:p>
     <w:p>
       <w:pPr>
-        <w:spacing w:after="0" w:line="240" w:lineRule="auto"/>
-      </w:pPr>
-      <w:r>
-        <w:rPr>
-          <w:rFonts w:ascii="Courier New" w:cs="Courier New" w:eastAsia="Courier New" w:hAnsi="Courier New"/>
-          <w:sz w:val="20"/>
-          <w:szCs w:val="20"/>
+        <w:pBdr>
+          <w:left w:val="single" w:color="4472C4" w:sz="12" w:space="4"/>
+        </w:pBdr>
+        <w:shd w:fill="F2F2F2" w:color="auto" w:val="clear"/>
+        <w:spacing w:after="0" w:line="240" w:lineRule="auto"/>
+        <w:ind w:left="283"/>
+      </w:pPr>
+      <w:r>
+        <w:rPr>
+          <w:rFonts w:ascii="Courier New" w:cs="Courier New" w:eastAsia="Courier New" w:hAnsi="Courier New"/>
+          <w:sz w:val="18"/>
+          <w:szCs w:val="18"/>
+          <w:shd w:fill="F2F2F2" w:color="auto" w:val="clear"/>
         </w:rPr>
         <w:t xml:space="preserve">  });</w:t>
       </w:r>
     </w:p>
     <w:p>
       <w:pPr>
-        <w:spacing w:after="0" w:line="240" w:lineRule="auto"/>
-      </w:pPr>
-      <w:r>
-        <w:rPr>
-          <w:rFonts w:ascii="Courier New" w:cs="Courier New" w:eastAsia="Courier New" w:hAnsi="Courier New"/>
-          <w:sz w:val="20"/>
-          <w:szCs w:val="20"/>
-        </w:rPr>
-        <w:t xml:space="preserve"/>
-      </w:r>
-    </w:p>
-    <w:p>
-      <w:pPr>
-        <w:spacing w:after="0" w:line="240" w:lineRule="auto"/>
-      </w:pPr>
-      <w:r>
-        <w:rPr>
-          <w:rFonts w:ascii="Courier New" w:cs="Courier New" w:eastAsia="Courier New" w:hAnsi="Courier New"/>
-          <w:sz w:val="20"/>
-          <w:szCs w:val="20"/>
+        <w:pBdr>
+          <w:left w:val="single" w:color="4472C4" w:sz="12" w:space="4"/>
+        </w:pBdr>
+        <w:shd w:fill="F2F2F2" w:color="auto" w:val="clear"/>
+        <w:spacing w:after="0" w:line="240" w:lineRule="auto"/>
+        <w:ind w:left="283"/>
+      </w:pPr>
+      <w:r>
+        <w:rPr>
+          <w:rFonts w:ascii="Courier New" w:cs="Courier New" w:eastAsia="Courier New" w:hAnsi="Courier New"/>
+          <w:sz w:val="18"/>
+          <w:szCs w:val="18"/>
+          <w:shd w:fill="F2F2F2" w:color="auto" w:val="clear"/>
+        </w:rPr>
+        <w:t xml:space="preserve"> </w:t>
+      </w:r>
+    </w:p>
+    <w:p>
+      <w:pPr>
+        <w:pBdr>
+          <w:left w:val="single" w:color="4472C4" w:sz="12" w:space="4"/>
+        </w:pBdr>
+        <w:shd w:fill="F2F2F2" w:color="auto" w:val="clear"/>
+        <w:spacing w:after="0" w:line="240" w:lineRule="auto"/>
+        <w:ind w:left="283"/>
+      </w:pPr>
+      <w:r>
+        <w:rPr>
+          <w:rFonts w:ascii="Courier New" w:cs="Courier New" w:eastAsia="Courier New" w:hAnsi="Courier New"/>
+          <w:sz w:val="18"/>
+          <w:szCs w:val="18"/>
+          <w:shd w:fill="F2F2F2" w:color="auto" w:val="clear"/>
         </w:rPr>
         <w:t xml:space="preserve">  return [header, separator, ...rows].join("\n");</w:t>
       </w:r>
     </w:p>
     <w:p>
       <w:pPr>
-        <w:spacing w:after="0" w:line="240" w:lineRule="auto"/>
-      </w:pPr>
-      <w:r>
-        <w:rPr>
-          <w:rFonts w:ascii="Courier New" w:cs="Courier New" w:eastAsia="Courier New" w:hAnsi="Courier New"/>
-          <w:sz w:val="20"/>
-          <w:szCs w:val="20"/>
+        <w:pBdr>
+          <w:left w:val="single" w:color="4472C4" w:sz="12" w:space="4"/>
+        </w:pBdr>
+        <w:shd w:fill="F2F2F2" w:color="auto" w:val="clear"/>
+        <w:spacing w:after="0" w:line="240" w:lineRule="auto"/>
+        <w:ind w:left="283"/>
+      </w:pPr>
+      <w:r>
+        <w:rPr>
+          <w:rFonts w:ascii="Courier New" w:cs="Courier New" w:eastAsia="Courier New" w:hAnsi="Courier New"/>
+          <w:sz w:val="18"/>
+          <w:szCs w:val="18"/>
+          <w:shd w:fill="F2F2F2" w:color="auto" w:val="clear"/>
         </w:rPr>
         <w:t xml:space="preserve">}</w:t>
       </w:r>
@@ -4215,6 +5150,7 @@
     </w:p>
     <w:p>
       <w:pPr>
+        <w:keepNext/>
         <w:spacing w:after="60" w:before="120" w:line="360" w:lineRule="auto"/>
         <w:ind w:firstLine="709"/>
       </w:pPr>
@@ -4229,182 +5165,266 @@
     </w:p>
     <w:p>
       <w:pPr>
-        <w:spacing w:after="0" w:line="240" w:lineRule="auto"/>
-      </w:pPr>
-      <w:r>
-        <w:rPr>
-          <w:rFonts w:ascii="Courier New" w:cs="Courier New" w:eastAsia="Courier New" w:hAnsi="Courier New"/>
-          <w:sz w:val="20"/>
-          <w:szCs w:val="20"/>
+        <w:pBdr>
+          <w:left w:val="single" w:color="4472C4" w:sz="12" w:space="4"/>
+        </w:pBdr>
+        <w:shd w:fill="F2F2F2" w:color="auto" w:val="clear"/>
+        <w:spacing w:after="0" w:line="240" w:lineRule="auto"/>
+        <w:ind w:left="283"/>
+      </w:pPr>
+      <w:r>
+        <w:rPr>
+          <w:rFonts w:ascii="Courier New" w:cs="Courier New" w:eastAsia="Courier New" w:hAnsi="Courier New"/>
+          <w:sz w:val="18"/>
+          <w:szCs w:val="18"/>
+          <w:shd w:fill="F2F2F2" w:color="auto" w:val="clear"/>
         </w:rPr>
         <w:t xml:space="preserve">import { runBenchmarks, formatResults } from "./benchmark.ts";</w:t>
       </w:r>
     </w:p>
     <w:p>
       <w:pPr>
-        <w:spacing w:after="0" w:line="240" w:lineRule="auto"/>
-      </w:pPr>
-      <w:r>
-        <w:rPr>
-          <w:rFonts w:ascii="Courier New" w:cs="Courier New" w:eastAsia="Courier New" w:hAnsi="Courier New"/>
-          <w:sz w:val="20"/>
-          <w:szCs w:val="20"/>
-        </w:rPr>
-        <w:t xml:space="preserve"/>
-      </w:r>
-    </w:p>
-    <w:p>
-      <w:pPr>
-        <w:spacing w:after="0" w:line="240" w:lineRule="auto"/>
-      </w:pPr>
-      <w:r>
-        <w:rPr>
-          <w:rFonts w:ascii="Courier New" w:cs="Courier New" w:eastAsia="Courier New" w:hAnsi="Courier New"/>
-          <w:sz w:val="20"/>
-          <w:szCs w:val="20"/>
+        <w:pBdr>
+          <w:left w:val="single" w:color="4472C4" w:sz="12" w:space="4"/>
+        </w:pBdr>
+        <w:shd w:fill="F2F2F2" w:color="auto" w:val="clear"/>
+        <w:spacing w:after="0" w:line="240" w:lineRule="auto"/>
+        <w:ind w:left="283"/>
+      </w:pPr>
+      <w:r>
+        <w:rPr>
+          <w:rFonts w:ascii="Courier New" w:cs="Courier New" w:eastAsia="Courier New" w:hAnsi="Courier New"/>
+          <w:sz w:val="18"/>
+          <w:szCs w:val="18"/>
+          <w:shd w:fill="F2F2F2" w:color="auto" w:val="clear"/>
+        </w:rPr>
+        <w:t xml:space="preserve"> </w:t>
+      </w:r>
+    </w:p>
+    <w:p>
+      <w:pPr>
+        <w:pBdr>
+          <w:left w:val="single" w:color="4472C4" w:sz="12" w:space="4"/>
+        </w:pBdr>
+        <w:shd w:fill="F2F2F2" w:color="auto" w:val="clear"/>
+        <w:spacing w:after="0" w:line="240" w:lineRule="auto"/>
+        <w:ind w:left="283"/>
+      </w:pPr>
+      <w:r>
+        <w:rPr>
+          <w:rFonts w:ascii="Courier New" w:cs="Courier New" w:eastAsia="Courier New" w:hAnsi="Courier New"/>
+          <w:sz w:val="18"/>
+          <w:szCs w:val="18"/>
+          <w:shd w:fill="F2F2F2" w:color="auto" w:val="clear"/>
         </w:rPr>
         <w:t xml:space="preserve">console.log("Лабораторна робота №1 — Часові характеристики алгоритмів пошуку");</w:t>
       </w:r>
     </w:p>
     <w:p>
       <w:pPr>
-        <w:spacing w:after="0" w:line="240" w:lineRule="auto"/>
-      </w:pPr>
-      <w:r>
-        <w:rPr>
-          <w:rFonts w:ascii="Courier New" w:cs="Courier New" w:eastAsia="Courier New" w:hAnsi="Courier New"/>
-          <w:sz w:val="20"/>
-          <w:szCs w:val="20"/>
+        <w:pBdr>
+          <w:left w:val="single" w:color="4472C4" w:sz="12" w:space="4"/>
+        </w:pBdr>
+        <w:shd w:fill="F2F2F2" w:color="auto" w:val="clear"/>
+        <w:spacing w:after="0" w:line="240" w:lineRule="auto"/>
+        <w:ind w:left="283"/>
+      </w:pPr>
+      <w:r>
+        <w:rPr>
+          <w:rFonts w:ascii="Courier New" w:cs="Courier New" w:eastAsia="Courier New" w:hAnsi="Courier New"/>
+          <w:sz w:val="18"/>
+          <w:szCs w:val="18"/>
+          <w:shd w:fill="F2F2F2" w:color="auto" w:val="clear"/>
         </w:rPr>
         <w:t xml:space="preserve">console.log("Варіант 1: Лінійний пошук vs Двійковий пошук (ітеративний та рекурсивний)");</w:t>
       </w:r>
     </w:p>
     <w:p>
       <w:pPr>
-        <w:spacing w:after="0" w:line="240" w:lineRule="auto"/>
-      </w:pPr>
-      <w:r>
-        <w:rPr>
-          <w:rFonts w:ascii="Courier New" w:cs="Courier New" w:eastAsia="Courier New" w:hAnsi="Courier New"/>
-          <w:sz w:val="20"/>
-          <w:szCs w:val="20"/>
+        <w:pBdr>
+          <w:left w:val="single" w:color="4472C4" w:sz="12" w:space="4"/>
+        </w:pBdr>
+        <w:shd w:fill="F2F2F2" w:color="auto" w:val="clear"/>
+        <w:spacing w:after="0" w:line="240" w:lineRule="auto"/>
+        <w:ind w:left="283"/>
+      </w:pPr>
+      <w:r>
+        <w:rPr>
+          <w:rFonts w:ascii="Courier New" w:cs="Courier New" w:eastAsia="Courier New" w:hAnsi="Courier New"/>
+          <w:sz w:val="18"/>
+          <w:szCs w:val="18"/>
+          <w:shd w:fill="F2F2F2" w:color="auto" w:val="clear"/>
         </w:rPr>
         <w:t xml:space="preserve">console.log();</w:t>
       </w:r>
     </w:p>
     <w:p>
       <w:pPr>
-        <w:spacing w:after="0" w:line="240" w:lineRule="auto"/>
-      </w:pPr>
-      <w:r>
-        <w:rPr>
-          <w:rFonts w:ascii="Courier New" w:cs="Courier New" w:eastAsia="Courier New" w:hAnsi="Courier New"/>
-          <w:sz w:val="20"/>
-          <w:szCs w:val="20"/>
-        </w:rPr>
-        <w:t xml:space="preserve"/>
-      </w:r>
-    </w:p>
-    <w:p>
-      <w:pPr>
-        <w:spacing w:after="0" w:line="240" w:lineRule="auto"/>
-      </w:pPr>
-      <w:r>
-        <w:rPr>
-          <w:rFonts w:ascii="Courier New" w:cs="Courier New" w:eastAsia="Courier New" w:hAnsi="Courier New"/>
-          <w:sz w:val="20"/>
-          <w:szCs w:val="20"/>
+        <w:pBdr>
+          <w:left w:val="single" w:color="4472C4" w:sz="12" w:space="4"/>
+        </w:pBdr>
+        <w:shd w:fill="F2F2F2" w:color="auto" w:val="clear"/>
+        <w:spacing w:after="0" w:line="240" w:lineRule="auto"/>
+        <w:ind w:left="283"/>
+      </w:pPr>
+      <w:r>
+        <w:rPr>
+          <w:rFonts w:ascii="Courier New" w:cs="Courier New" w:eastAsia="Courier New" w:hAnsi="Courier New"/>
+          <w:sz w:val="18"/>
+          <w:szCs w:val="18"/>
+          <w:shd w:fill="F2F2F2" w:color="auto" w:val="clear"/>
+        </w:rPr>
+        <w:t xml:space="preserve"> </w:t>
+      </w:r>
+    </w:p>
+    <w:p>
+      <w:pPr>
+        <w:pBdr>
+          <w:left w:val="single" w:color="4472C4" w:sz="12" w:space="4"/>
+        </w:pBdr>
+        <w:shd w:fill="F2F2F2" w:color="auto" w:val="clear"/>
+        <w:spacing w:after="0" w:line="240" w:lineRule="auto"/>
+        <w:ind w:left="283"/>
+      </w:pPr>
+      <w:r>
+        <w:rPr>
+          <w:rFonts w:ascii="Courier New" w:cs="Courier New" w:eastAsia="Courier New" w:hAnsi="Courier New"/>
+          <w:sz w:val="18"/>
+          <w:szCs w:val="18"/>
+          <w:shd w:fill="F2F2F2" w:color="auto" w:val="clear"/>
         </w:rPr>
         <w:t xml:space="preserve">console.log("Запуск бенчмарків...\n");</w:t>
       </w:r>
     </w:p>
     <w:p>
       <w:pPr>
-        <w:spacing w:after="0" w:line="240" w:lineRule="auto"/>
-      </w:pPr>
-      <w:r>
-        <w:rPr>
-          <w:rFonts w:ascii="Courier New" w:cs="Courier New" w:eastAsia="Courier New" w:hAnsi="Courier New"/>
-          <w:sz w:val="20"/>
-          <w:szCs w:val="20"/>
+        <w:pBdr>
+          <w:left w:val="single" w:color="4472C4" w:sz="12" w:space="4"/>
+        </w:pBdr>
+        <w:shd w:fill="F2F2F2" w:color="auto" w:val="clear"/>
+        <w:spacing w:after="0" w:line="240" w:lineRule="auto"/>
+        <w:ind w:left="283"/>
+      </w:pPr>
+      <w:r>
+        <w:rPr>
+          <w:rFonts w:ascii="Courier New" w:cs="Courier New" w:eastAsia="Courier New" w:hAnsi="Courier New"/>
+          <w:sz w:val="18"/>
+          <w:szCs w:val="18"/>
+          <w:shd w:fill="F2F2F2" w:color="auto" w:val="clear"/>
         </w:rPr>
         <w:t xml:space="preserve">const results = runBenchmarks();</w:t>
       </w:r>
     </w:p>
     <w:p>
       <w:pPr>
-        <w:spacing w:after="0" w:line="240" w:lineRule="auto"/>
-      </w:pPr>
-      <w:r>
-        <w:rPr>
-          <w:rFonts w:ascii="Courier New" w:cs="Courier New" w:eastAsia="Courier New" w:hAnsi="Courier New"/>
-          <w:sz w:val="20"/>
-          <w:szCs w:val="20"/>
+        <w:pBdr>
+          <w:left w:val="single" w:color="4472C4" w:sz="12" w:space="4"/>
+        </w:pBdr>
+        <w:shd w:fill="F2F2F2" w:color="auto" w:val="clear"/>
+        <w:spacing w:after="0" w:line="240" w:lineRule="auto"/>
+        <w:ind w:left="283"/>
+      </w:pPr>
+      <w:r>
+        <w:rPr>
+          <w:rFonts w:ascii="Courier New" w:cs="Courier New" w:eastAsia="Courier New" w:hAnsi="Courier New"/>
+          <w:sz w:val="18"/>
+          <w:szCs w:val="18"/>
+          <w:shd w:fill="F2F2F2" w:color="auto" w:val="clear"/>
         </w:rPr>
         <w:t xml:space="preserve">console.log(formatResults(results));</w:t>
       </w:r>
     </w:p>
     <w:p>
       <w:pPr>
-        <w:spacing w:after="0" w:line="240" w:lineRule="auto"/>
-      </w:pPr>
-      <w:r>
-        <w:rPr>
-          <w:rFonts w:ascii="Courier New" w:cs="Courier New" w:eastAsia="Courier New" w:hAnsi="Courier New"/>
-          <w:sz w:val="20"/>
-          <w:szCs w:val="20"/>
+        <w:pBdr>
+          <w:left w:val="single" w:color="4472C4" w:sz="12" w:space="4"/>
+        </w:pBdr>
+        <w:shd w:fill="F2F2F2" w:color="auto" w:val="clear"/>
+        <w:spacing w:after="0" w:line="240" w:lineRule="auto"/>
+        <w:ind w:left="283"/>
+      </w:pPr>
+      <w:r>
+        <w:rPr>
+          <w:rFonts w:ascii="Courier New" w:cs="Courier New" w:eastAsia="Courier New" w:hAnsi="Courier New"/>
+          <w:sz w:val="18"/>
+          <w:szCs w:val="18"/>
+          <w:shd w:fill="F2F2F2" w:color="auto" w:val="clear"/>
         </w:rPr>
         <w:t xml:space="preserve">console.log();</w:t>
       </w:r>
     </w:p>
     <w:p>
       <w:pPr>
-        <w:spacing w:after="0" w:line="240" w:lineRule="auto"/>
-      </w:pPr>
-      <w:r>
-        <w:rPr>
-          <w:rFonts w:ascii="Courier New" w:cs="Courier New" w:eastAsia="Courier New" w:hAnsi="Courier New"/>
-          <w:sz w:val="20"/>
-          <w:szCs w:val="20"/>
+        <w:pBdr>
+          <w:left w:val="single" w:color="4472C4" w:sz="12" w:space="4"/>
+        </w:pBdr>
+        <w:shd w:fill="F2F2F2" w:color="auto" w:val="clear"/>
+        <w:spacing w:after="0" w:line="240" w:lineRule="auto"/>
+        <w:ind w:left="283"/>
+      </w:pPr>
+      <w:r>
+        <w:rPr>
+          <w:rFonts w:ascii="Courier New" w:cs="Courier New" w:eastAsia="Courier New" w:hAnsi="Courier New"/>
+          <w:sz w:val="18"/>
+          <w:szCs w:val="18"/>
+          <w:shd w:fill="F2F2F2" w:color="auto" w:val="clear"/>
         </w:rPr>
         <w:t xml:space="preserve">console.log("Теоретичні оцінки:");</w:t>
       </w:r>
     </w:p>
     <w:p>
       <w:pPr>
-        <w:spacing w:after="0" w:line="240" w:lineRule="auto"/>
-      </w:pPr>
-      <w:r>
-        <w:rPr>
-          <w:rFonts w:ascii="Courier New" w:cs="Courier New" w:eastAsia="Courier New" w:hAnsi="Courier New"/>
-          <w:sz w:val="20"/>
-          <w:szCs w:val="20"/>
+        <w:pBdr>
+          <w:left w:val="single" w:color="4472C4" w:sz="12" w:space="4"/>
+        </w:pBdr>
+        <w:shd w:fill="F2F2F2" w:color="auto" w:val="clear"/>
+        <w:spacing w:after="0" w:line="240" w:lineRule="auto"/>
+        <w:ind w:left="283"/>
+      </w:pPr>
+      <w:r>
+        <w:rPr>
+          <w:rFonts w:ascii="Courier New" w:cs="Courier New" w:eastAsia="Courier New" w:hAnsi="Courier New"/>
+          <w:sz w:val="18"/>
+          <w:szCs w:val="18"/>
+          <w:shd w:fill="F2F2F2" w:color="auto" w:val="clear"/>
         </w:rPr>
         <w:t xml:space="preserve">console.log("  Лінійний пошук:             O(n)");</w:t>
       </w:r>
     </w:p>
     <w:p>
       <w:pPr>
-        <w:spacing w:after="0" w:line="240" w:lineRule="auto"/>
-      </w:pPr>
-      <w:r>
-        <w:rPr>
-          <w:rFonts w:ascii="Courier New" w:cs="Courier New" w:eastAsia="Courier New" w:hAnsi="Courier New"/>
-          <w:sz w:val="20"/>
-          <w:szCs w:val="20"/>
+        <w:pBdr>
+          <w:left w:val="single" w:color="4472C4" w:sz="12" w:space="4"/>
+        </w:pBdr>
+        <w:shd w:fill="F2F2F2" w:color="auto" w:val="clear"/>
+        <w:spacing w:after="0" w:line="240" w:lineRule="auto"/>
+        <w:ind w:left="283"/>
+      </w:pPr>
+      <w:r>
+        <w:rPr>
+          <w:rFonts w:ascii="Courier New" w:cs="Courier New" w:eastAsia="Courier New" w:hAnsi="Courier New"/>
+          <w:sz w:val="18"/>
+          <w:szCs w:val="18"/>
+          <w:shd w:fill="F2F2F2" w:color="auto" w:val="clear"/>
         </w:rPr>
         <w:t xml:space="preserve">console.log("  Двійковий пошук (ітератив): O(log n)");</w:t>
       </w:r>
     </w:p>
     <w:p>
       <w:pPr>
-        <w:spacing w:after="0" w:line="240" w:lineRule="auto"/>
-      </w:pPr>
-      <w:r>
-        <w:rPr>
-          <w:rFonts w:ascii="Courier New" w:cs="Courier New" w:eastAsia="Courier New" w:hAnsi="Courier New"/>
-          <w:sz w:val="20"/>
-          <w:szCs w:val="20"/>
+        <w:pBdr>
+          <w:left w:val="single" w:color="4472C4" w:sz="12" w:space="4"/>
+        </w:pBdr>
+        <w:shd w:fill="F2F2F2" w:color="auto" w:val="clear"/>
+        <w:spacing w:after="0" w:line="240" w:lineRule="auto"/>
+        <w:ind w:left="283"/>
+      </w:pPr>
+      <w:r>
+        <w:rPr>
+          <w:rFonts w:ascii="Courier New" w:cs="Courier New" w:eastAsia="Courier New" w:hAnsi="Courier New"/>
+          <w:sz w:val="18"/>
+          <w:szCs w:val="18"/>
+          <w:shd w:fill="F2F2F2" w:color="auto" w:val="clear"/>
         </w:rPr>
         <w:t xml:space="preserve">console.log("  Двійковий пошук (рекурсія): O(log n)");</w:t>
       </w:r>

</xml_diff>

<commit_message>
style: complexity analysis as tables (instructor format)
</commit_message>
<xml_diff>
--- a/reports/lr1/Звіт_ЛР1_Коновалов_ПЗПІ-25-6.docx
+++ b/reports/lr1/Звіт_ЛР1_Коновалов_ПЗПІ-25-6.docx
@@ -1041,63 +1041,550 @@
         <w:t xml:space="preserve">Лінійний пошук (найгірший випадок — елемент не знайдено):</w:t>
       </w:r>
     </w:p>
-    <w:p>
-      <w:pPr>
-        <w:pBdr>
-          <w:left w:val="single" w:color="4472C4" w:sz="12" w:space="4"/>
-        </w:pBdr>
-        <w:shd w:fill="F2F2F2" w:color="auto" w:val="clear"/>
-        <w:spacing w:after="0" w:line="240" w:lineRule="auto"/>
-        <w:ind w:left="283"/>
-      </w:pPr>
-      <w:r>
-        <w:rPr>
-          <w:rFonts w:ascii="Courier New" w:cs="Courier New" w:eastAsia="Courier New" w:hAnsi="Courier New"/>
-          <w:sz w:val="18"/>
-          <w:szCs w:val="18"/>
-          <w:shd w:fill="F2F2F2" w:color="auto" w:val="clear"/>
-        </w:rPr>
-        <w:t xml:space="preserve">Рядок 1: for i = 0 to n-1       — вартість c1, виконується n разів</w:t>
-      </w:r>
-    </w:p>
-    <w:p>
-      <w:pPr>
-        <w:pBdr>
-          <w:left w:val="single" w:color="4472C4" w:sz="12" w:space="4"/>
-        </w:pBdr>
-        <w:shd w:fill="F2F2F2" w:color="auto" w:val="clear"/>
-        <w:spacing w:after="0" w:line="240" w:lineRule="auto"/>
-        <w:ind w:left="283"/>
-      </w:pPr>
-      <w:r>
-        <w:rPr>
-          <w:rFonts w:ascii="Courier New" w:cs="Courier New" w:eastAsia="Courier New" w:hAnsi="Courier New"/>
-          <w:sz w:val="18"/>
-          <w:szCs w:val="18"/>
-          <w:shd w:fill="F2F2F2" w:color="auto" w:val="clear"/>
-        </w:rPr>
-        <w:t xml:space="preserve">Рядок 2:     if arr[i] == target  — вартість c2, виконується n разів</w:t>
-      </w:r>
-    </w:p>
-    <w:p>
-      <w:pPr>
-        <w:pBdr>
-          <w:left w:val="single" w:color="4472C4" w:sz="12" w:space="4"/>
-        </w:pBdr>
-        <w:shd w:fill="F2F2F2" w:color="auto" w:val="clear"/>
-        <w:spacing w:after="0" w:line="240" w:lineRule="auto"/>
-        <w:ind w:left="283"/>
-      </w:pPr>
-      <w:r>
-        <w:rPr>
-          <w:rFonts w:ascii="Courier New" w:cs="Courier New" w:eastAsia="Courier New" w:hAnsi="Courier New"/>
-          <w:sz w:val="18"/>
-          <w:szCs w:val="18"/>
-          <w:shd w:fill="F2F2F2" w:color="auto" w:val="clear"/>
-        </w:rPr>
-        <w:t xml:space="preserve">Рядок 3: return -1                — вартість c3, виконується 1 раз</w:t>
-      </w:r>
-    </w:p>
+    <w:tbl>
+      <w:tblPr>
+        <w:tblW w:type="pct" w:w="100%"/>
+        <w:tblBorders>
+          <w:top w:val="single" w:color="000000" w:sz="1"/>
+          <w:left w:val="single" w:color="000000" w:sz="1"/>
+          <w:bottom w:val="single" w:color="000000" w:sz="1"/>
+          <w:right w:val="single" w:color="000000" w:sz="1"/>
+          <w:insideH w:val="single" w:color="000000" w:sz="1"/>
+          <w:insideV w:val="single" w:color="000000" w:sz="1"/>
+        </w:tblBorders>
+      </w:tblPr>
+      <w:tblGrid>
+        <w:gridCol w:w="100"/>
+        <w:gridCol w:w="100"/>
+        <w:gridCol w:w="100"/>
+        <w:gridCol w:w="100"/>
+      </w:tblGrid>
+      <w:tr>
+        <w:trPr>
+          <w:tblHeader/>
+        </w:trPr>
+        <w:tc>
+          <w:tcPr>
+            <w:shd w:fill="D9D9D9" w:val="clear"/>
+            <w:tcMar>
+              <w:top w:type="dxa" w:w="40"/>
+              <w:left w:type="dxa" w:w="80"/>
+              <w:bottom w:type="dxa" w:w="40"/>
+              <w:right w:type="dxa" w:w="80"/>
+            </w:tcMar>
+            <w:vAlign w:val="center"/>
+          </w:tcPr>
+          <w:p>
+            <w:pPr>
+              <w:spacing w:after="0" w:line="360" w:lineRule="auto"/>
+              <w:jc w:val="center"/>
+            </w:pPr>
+            <w:r>
+              <w:rPr>
+                <w:rFonts w:ascii="Times New Roman" w:cs="Times New Roman" w:eastAsia="Times New Roman" w:hAnsi="Times New Roman"/>
+                <w:b/>
+                <w:bCs/>
+                <w:sz w:val="28"/>
+                <w:szCs w:val="28"/>
+              </w:rPr>
+              <w:t xml:space="preserve">№</w:t>
+            </w:r>
+          </w:p>
+        </w:tc>
+        <w:tc>
+          <w:tcPr>
+            <w:shd w:fill="D9D9D9" w:val="clear"/>
+            <w:tcMar>
+              <w:top w:type="dxa" w:w="40"/>
+              <w:left w:type="dxa" w:w="80"/>
+              <w:bottom w:type="dxa" w:w="40"/>
+              <w:right w:type="dxa" w:w="80"/>
+            </w:tcMar>
+            <w:vAlign w:val="center"/>
+          </w:tcPr>
+          <w:p>
+            <w:pPr>
+              <w:spacing w:after="0" w:line="360" w:lineRule="auto"/>
+              <w:jc w:val="center"/>
+            </w:pPr>
+            <w:r>
+              <w:rPr>
+                <w:rFonts w:ascii="Times New Roman" w:cs="Times New Roman" w:eastAsia="Times New Roman" w:hAnsi="Times New Roman"/>
+                <w:b/>
+                <w:bCs/>
+                <w:sz w:val="28"/>
+                <w:szCs w:val="28"/>
+              </w:rPr>
+              <w:t xml:space="preserve">Код</w:t>
+            </w:r>
+          </w:p>
+        </w:tc>
+        <w:tc>
+          <w:tcPr>
+            <w:shd w:fill="D9D9D9" w:val="clear"/>
+            <w:tcMar>
+              <w:top w:type="dxa" w:w="40"/>
+              <w:left w:type="dxa" w:w="80"/>
+              <w:bottom w:type="dxa" w:w="40"/>
+              <w:right w:type="dxa" w:w="80"/>
+            </w:tcMar>
+            <w:vAlign w:val="center"/>
+          </w:tcPr>
+          <w:p>
+            <w:pPr>
+              <w:spacing w:after="0" w:line="360" w:lineRule="auto"/>
+              <w:jc w:val="center"/>
+            </w:pPr>
+            <w:r>
+              <w:rPr>
+                <w:rFonts w:ascii="Times New Roman" w:cs="Times New Roman" w:eastAsia="Times New Roman" w:hAnsi="Times New Roman"/>
+                <w:b/>
+                <w:bCs/>
+                <w:sz w:val="28"/>
+                <w:szCs w:val="28"/>
+              </w:rPr>
+              <w:t xml:space="preserve">Вартість</w:t>
+            </w:r>
+          </w:p>
+        </w:tc>
+        <w:tc>
+          <w:tcPr>
+            <w:shd w:fill="D9D9D9" w:val="clear"/>
+            <w:tcMar>
+              <w:top w:type="dxa" w:w="40"/>
+              <w:left w:type="dxa" w:w="80"/>
+              <w:bottom w:type="dxa" w:w="40"/>
+              <w:right w:type="dxa" w:w="80"/>
+            </w:tcMar>
+            <w:vAlign w:val="center"/>
+          </w:tcPr>
+          <w:p>
+            <w:pPr>
+              <w:spacing w:after="0" w:line="360" w:lineRule="auto"/>
+              <w:jc w:val="center"/>
+            </w:pPr>
+            <w:r>
+              <w:rPr>
+                <w:rFonts w:ascii="Times New Roman" w:cs="Times New Roman" w:eastAsia="Times New Roman" w:hAnsi="Times New Roman"/>
+                <w:b/>
+                <w:bCs/>
+                <w:sz w:val="28"/>
+                <w:szCs w:val="28"/>
+              </w:rPr>
+              <w:t xml:space="preserve">Кількість виконань</w:t>
+            </w:r>
+          </w:p>
+        </w:tc>
+      </w:tr>
+      <w:tr>
+        <w:tc>
+          <w:tcPr>
+            <w:tcMar>
+              <w:top w:type="dxa" w:w="40"/>
+              <w:left w:type="dxa" w:w="80"/>
+              <w:bottom w:type="dxa" w:w="40"/>
+              <w:right w:type="dxa" w:w="80"/>
+            </w:tcMar>
+            <w:vAlign w:val="center"/>
+          </w:tcPr>
+          <w:p>
+            <w:pPr>
+              <w:spacing w:after="0" w:line="360" w:lineRule="auto"/>
+              <w:jc w:val="center"/>
+            </w:pPr>
+            <w:r>
+              <w:rPr>
+                <w:rFonts w:ascii="Times New Roman" w:cs="Times New Roman" w:eastAsia="Times New Roman" w:hAnsi="Times New Roman"/>
+                <w:sz w:val="28"/>
+                <w:szCs w:val="28"/>
+              </w:rPr>
+              <w:t xml:space="preserve">1</w:t>
+            </w:r>
+          </w:p>
+        </w:tc>
+        <w:tc>
+          <w:tcPr>
+            <w:tcMar>
+              <w:top w:type="dxa" w:w="40"/>
+              <w:left w:type="dxa" w:w="80"/>
+              <w:bottom w:type="dxa" w:w="40"/>
+              <w:right w:type="dxa" w:w="80"/>
+            </w:tcMar>
+            <w:vAlign w:val="center"/>
+          </w:tcPr>
+          <w:p>
+            <w:pPr>
+              <w:spacing w:after="0" w:line="360" w:lineRule="auto"/>
+              <w:jc w:val="left"/>
+            </w:pPr>
+            <w:r>
+              <w:rPr>
+                <w:rFonts w:ascii="Times New Roman" w:cs="Times New Roman" w:eastAsia="Times New Roman" w:hAnsi="Times New Roman"/>
+                <w:sz w:val="28"/>
+                <w:szCs w:val="28"/>
+              </w:rPr>
+              <w:t xml:space="preserve">for i = 0 to n-1</w:t>
+            </w:r>
+          </w:p>
+        </w:tc>
+        <w:tc>
+          <w:tcPr>
+            <w:tcMar>
+              <w:top w:type="dxa" w:w="40"/>
+              <w:left w:type="dxa" w:w="80"/>
+              <w:bottom w:type="dxa" w:w="40"/>
+              <w:right w:type="dxa" w:w="80"/>
+            </w:tcMar>
+            <w:vAlign w:val="center"/>
+          </w:tcPr>
+          <w:p>
+            <w:pPr>
+              <w:spacing w:after="0" w:line="360" w:lineRule="auto"/>
+              <w:jc w:val="center"/>
+            </w:pPr>
+            <w:r>
+              <w:rPr>
+                <w:rFonts w:ascii="Times New Roman" w:cs="Times New Roman" w:eastAsia="Times New Roman" w:hAnsi="Times New Roman"/>
+                <w:sz w:val="28"/>
+                <w:szCs w:val="28"/>
+              </w:rPr>
+              <w:t xml:space="preserve">C1</w:t>
+            </w:r>
+          </w:p>
+        </w:tc>
+        <w:tc>
+          <w:tcPr>
+            <w:tcMar>
+              <w:top w:type="dxa" w:w="40"/>
+              <w:left w:type="dxa" w:w="80"/>
+              <w:bottom w:type="dxa" w:w="40"/>
+              <w:right w:type="dxa" w:w="80"/>
+            </w:tcMar>
+            <w:vAlign w:val="center"/>
+          </w:tcPr>
+          <w:p>
+            <w:pPr>
+              <w:spacing w:after="0" w:line="360" w:lineRule="auto"/>
+              <w:jc w:val="center"/>
+            </w:pPr>
+            <w:r>
+              <w:rPr>
+                <w:rFonts w:ascii="Times New Roman" w:cs="Times New Roman" w:eastAsia="Times New Roman" w:hAnsi="Times New Roman"/>
+                <w:sz w:val="28"/>
+                <w:szCs w:val="28"/>
+              </w:rPr>
+              <w:t xml:space="preserve">n</w:t>
+            </w:r>
+          </w:p>
+        </w:tc>
+      </w:tr>
+      <w:tr>
+        <w:tc>
+          <w:tcPr>
+            <w:tcMar>
+              <w:top w:type="dxa" w:w="40"/>
+              <w:left w:type="dxa" w:w="80"/>
+              <w:bottom w:type="dxa" w:w="40"/>
+              <w:right w:type="dxa" w:w="80"/>
+            </w:tcMar>
+            <w:vAlign w:val="center"/>
+          </w:tcPr>
+          <w:p>
+            <w:pPr>
+              <w:spacing w:after="0" w:line="360" w:lineRule="auto"/>
+              <w:jc w:val="center"/>
+            </w:pPr>
+            <w:r>
+              <w:rPr>
+                <w:rFonts w:ascii="Times New Roman" w:cs="Times New Roman" w:eastAsia="Times New Roman" w:hAnsi="Times New Roman"/>
+                <w:sz w:val="28"/>
+                <w:szCs w:val="28"/>
+              </w:rPr>
+              <w:t xml:space="preserve">2</w:t>
+            </w:r>
+          </w:p>
+        </w:tc>
+        <w:tc>
+          <w:tcPr>
+            <w:tcMar>
+              <w:top w:type="dxa" w:w="40"/>
+              <w:left w:type="dxa" w:w="80"/>
+              <w:bottom w:type="dxa" w:w="40"/>
+              <w:right w:type="dxa" w:w="80"/>
+            </w:tcMar>
+            <w:vAlign w:val="center"/>
+          </w:tcPr>
+          <w:p>
+            <w:pPr>
+              <w:spacing w:after="0" w:line="360" w:lineRule="auto"/>
+              <w:jc w:val="left"/>
+            </w:pPr>
+            <w:r>
+              <w:rPr>
+                <w:rFonts w:ascii="Times New Roman" w:cs="Times New Roman" w:eastAsia="Times New Roman" w:hAnsi="Times New Roman"/>
+                <w:sz w:val="28"/>
+                <w:szCs w:val="28"/>
+              </w:rPr>
+              <w:t xml:space="preserve">if arr[i] == target</w:t>
+            </w:r>
+          </w:p>
+        </w:tc>
+        <w:tc>
+          <w:tcPr>
+            <w:tcMar>
+              <w:top w:type="dxa" w:w="40"/>
+              <w:left w:type="dxa" w:w="80"/>
+              <w:bottom w:type="dxa" w:w="40"/>
+              <w:right w:type="dxa" w:w="80"/>
+            </w:tcMar>
+            <w:vAlign w:val="center"/>
+          </w:tcPr>
+          <w:p>
+            <w:pPr>
+              <w:spacing w:after="0" w:line="360" w:lineRule="auto"/>
+              <w:jc w:val="center"/>
+            </w:pPr>
+            <w:r>
+              <w:rPr>
+                <w:rFonts w:ascii="Times New Roman" w:cs="Times New Roman" w:eastAsia="Times New Roman" w:hAnsi="Times New Roman"/>
+                <w:sz w:val="28"/>
+                <w:szCs w:val="28"/>
+              </w:rPr>
+              <w:t xml:space="preserve">C2</w:t>
+            </w:r>
+          </w:p>
+        </w:tc>
+        <w:tc>
+          <w:tcPr>
+            <w:tcMar>
+              <w:top w:type="dxa" w:w="40"/>
+              <w:left w:type="dxa" w:w="80"/>
+              <w:bottom w:type="dxa" w:w="40"/>
+              <w:right w:type="dxa" w:w="80"/>
+            </w:tcMar>
+            <w:vAlign w:val="center"/>
+          </w:tcPr>
+          <w:p>
+            <w:pPr>
+              <w:spacing w:after="0" w:line="360" w:lineRule="auto"/>
+              <w:jc w:val="center"/>
+            </w:pPr>
+            <w:r>
+              <w:rPr>
+                <w:rFonts w:ascii="Times New Roman" w:cs="Times New Roman" w:eastAsia="Times New Roman" w:hAnsi="Times New Roman"/>
+                <w:sz w:val="28"/>
+                <w:szCs w:val="28"/>
+              </w:rPr>
+              <w:t xml:space="preserve">n</w:t>
+            </w:r>
+          </w:p>
+        </w:tc>
+      </w:tr>
+      <w:tr>
+        <w:tc>
+          <w:tcPr>
+            <w:tcMar>
+              <w:top w:type="dxa" w:w="40"/>
+              <w:left w:type="dxa" w:w="80"/>
+              <w:bottom w:type="dxa" w:w="40"/>
+              <w:right w:type="dxa" w:w="80"/>
+            </w:tcMar>
+            <w:vAlign w:val="center"/>
+          </w:tcPr>
+          <w:p>
+            <w:pPr>
+              <w:spacing w:after="0" w:line="360" w:lineRule="auto"/>
+              <w:jc w:val="center"/>
+            </w:pPr>
+            <w:r>
+              <w:rPr>
+                <w:rFonts w:ascii="Times New Roman" w:cs="Times New Roman" w:eastAsia="Times New Roman" w:hAnsi="Times New Roman"/>
+                <w:sz w:val="28"/>
+                <w:szCs w:val="28"/>
+              </w:rPr>
+              <w:t xml:space="preserve">3</w:t>
+            </w:r>
+          </w:p>
+        </w:tc>
+        <w:tc>
+          <w:tcPr>
+            <w:tcMar>
+              <w:top w:type="dxa" w:w="40"/>
+              <w:left w:type="dxa" w:w="80"/>
+              <w:bottom w:type="dxa" w:w="40"/>
+              <w:right w:type="dxa" w:w="80"/>
+            </w:tcMar>
+            <w:vAlign w:val="center"/>
+          </w:tcPr>
+          <w:p>
+            <w:pPr>
+              <w:spacing w:after="0" w:line="360" w:lineRule="auto"/>
+              <w:jc w:val="left"/>
+            </w:pPr>
+            <w:r>
+              <w:rPr>
+                <w:rFonts w:ascii="Times New Roman" w:cs="Times New Roman" w:eastAsia="Times New Roman" w:hAnsi="Times New Roman"/>
+                <w:sz w:val="28"/>
+                <w:szCs w:val="28"/>
+              </w:rPr>
+              <w:t xml:space="preserve">return i</w:t>
+            </w:r>
+          </w:p>
+        </w:tc>
+        <w:tc>
+          <w:tcPr>
+            <w:tcMar>
+              <w:top w:type="dxa" w:w="40"/>
+              <w:left w:type="dxa" w:w="80"/>
+              <w:bottom w:type="dxa" w:w="40"/>
+              <w:right w:type="dxa" w:w="80"/>
+            </w:tcMar>
+            <w:vAlign w:val="center"/>
+          </w:tcPr>
+          <w:p>
+            <w:pPr>
+              <w:spacing w:after="0" w:line="360" w:lineRule="auto"/>
+              <w:jc w:val="center"/>
+            </w:pPr>
+            <w:r>
+              <w:rPr>
+                <w:rFonts w:ascii="Times New Roman" w:cs="Times New Roman" w:eastAsia="Times New Roman" w:hAnsi="Times New Roman"/>
+                <w:sz w:val="28"/>
+                <w:szCs w:val="28"/>
+              </w:rPr>
+              <w:t xml:space="preserve">C3</w:t>
+            </w:r>
+          </w:p>
+        </w:tc>
+        <w:tc>
+          <w:tcPr>
+            <w:tcMar>
+              <w:top w:type="dxa" w:w="40"/>
+              <w:left w:type="dxa" w:w="80"/>
+              <w:bottom w:type="dxa" w:w="40"/>
+              <w:right w:type="dxa" w:w="80"/>
+            </w:tcMar>
+            <w:vAlign w:val="center"/>
+          </w:tcPr>
+          <w:p>
+            <w:pPr>
+              <w:spacing w:after="0" w:line="360" w:lineRule="auto"/>
+              <w:jc w:val="center"/>
+            </w:pPr>
+            <w:r>
+              <w:rPr>
+                <w:rFonts w:ascii="Times New Roman" w:cs="Times New Roman" w:eastAsia="Times New Roman" w:hAnsi="Times New Roman"/>
+                <w:sz w:val="28"/>
+                <w:szCs w:val="28"/>
+              </w:rPr>
+              <w:t xml:space="preserve">0</w:t>
+            </w:r>
+          </w:p>
+        </w:tc>
+      </w:tr>
+      <w:tr>
+        <w:tc>
+          <w:tcPr>
+            <w:tcMar>
+              <w:top w:type="dxa" w:w="40"/>
+              <w:left w:type="dxa" w:w="80"/>
+              <w:bottom w:type="dxa" w:w="40"/>
+              <w:right w:type="dxa" w:w="80"/>
+            </w:tcMar>
+            <w:vAlign w:val="center"/>
+          </w:tcPr>
+          <w:p>
+            <w:pPr>
+              <w:spacing w:after="0" w:line="360" w:lineRule="auto"/>
+              <w:jc w:val="center"/>
+            </w:pPr>
+            <w:r>
+              <w:rPr>
+                <w:rFonts w:ascii="Times New Roman" w:cs="Times New Roman" w:eastAsia="Times New Roman" w:hAnsi="Times New Roman"/>
+                <w:sz w:val="28"/>
+                <w:szCs w:val="28"/>
+              </w:rPr>
+              <w:t xml:space="preserve">4</w:t>
+            </w:r>
+          </w:p>
+        </w:tc>
+        <w:tc>
+          <w:tcPr>
+            <w:tcMar>
+              <w:top w:type="dxa" w:w="40"/>
+              <w:left w:type="dxa" w:w="80"/>
+              <w:bottom w:type="dxa" w:w="40"/>
+              <w:right w:type="dxa" w:w="80"/>
+            </w:tcMar>
+            <w:vAlign w:val="center"/>
+          </w:tcPr>
+          <w:p>
+            <w:pPr>
+              <w:spacing w:after="0" w:line="360" w:lineRule="auto"/>
+              <w:jc w:val="left"/>
+            </w:pPr>
+            <w:r>
+              <w:rPr>
+                <w:rFonts w:ascii="Times New Roman" w:cs="Times New Roman" w:eastAsia="Times New Roman" w:hAnsi="Times New Roman"/>
+                <w:sz w:val="28"/>
+                <w:szCs w:val="28"/>
+              </w:rPr>
+              <w:t xml:space="preserve">return -1</w:t>
+            </w:r>
+          </w:p>
+        </w:tc>
+        <w:tc>
+          <w:tcPr>
+            <w:tcMar>
+              <w:top w:type="dxa" w:w="40"/>
+              <w:left w:type="dxa" w:w="80"/>
+              <w:bottom w:type="dxa" w:w="40"/>
+              <w:right w:type="dxa" w:w="80"/>
+            </w:tcMar>
+            <w:vAlign w:val="center"/>
+          </w:tcPr>
+          <w:p>
+            <w:pPr>
+              <w:spacing w:after="0" w:line="360" w:lineRule="auto"/>
+              <w:jc w:val="center"/>
+            </w:pPr>
+            <w:r>
+              <w:rPr>
+                <w:rFonts w:ascii="Times New Roman" w:cs="Times New Roman" w:eastAsia="Times New Roman" w:hAnsi="Times New Roman"/>
+                <w:sz w:val="28"/>
+                <w:szCs w:val="28"/>
+              </w:rPr>
+              <w:t xml:space="preserve">C4</w:t>
+            </w:r>
+          </w:p>
+        </w:tc>
+        <w:tc>
+          <w:tcPr>
+            <w:tcMar>
+              <w:top w:type="dxa" w:w="40"/>
+              <w:left w:type="dxa" w:w="80"/>
+              <w:bottom w:type="dxa" w:w="40"/>
+              <w:right w:type="dxa" w:w="80"/>
+            </w:tcMar>
+            <w:vAlign w:val="center"/>
+          </w:tcPr>
+          <w:p>
+            <w:pPr>
+              <w:spacing w:after="0" w:line="360" w:lineRule="auto"/>
+              <w:jc w:val="center"/>
+            </w:pPr>
+            <w:r>
+              <w:rPr>
+                <w:rFonts w:ascii="Times New Roman" w:cs="Times New Roman" w:eastAsia="Times New Roman" w:hAnsi="Times New Roman"/>
+                <w:sz w:val="28"/>
+                <w:szCs w:val="28"/>
+              </w:rPr>
+              <w:t xml:space="preserve">1</w:t>
+            </w:r>
+          </w:p>
+        </w:tc>
+      </w:tr>
+    </w:tbl>
     <w:p>
       <w:pPr>
         <w:tabs>
@@ -1249,142 +1736,874 @@
           <w:sz w:val="28"/>
           <w:szCs w:val="28"/>
         </w:rPr>
+        <w:t xml:space="preserve">За правилами асимптотичного аналізу відкидаємо константи та доданки менших порядків. Домінуючий член — n.</w:t>
+      </w:r>
+    </w:p>
+    <w:p>
+      <w:pPr>
+        <w:spacing w:after="0" w:before="0" w:line="360" w:lineRule="auto"/>
+        <w:ind w:firstLine="709"/>
+        <w:jc w:val="both"/>
+      </w:pPr>
+      <w:r>
+        <w:rPr>
+          <w:rFonts w:ascii="Times New Roman" w:cs="Times New Roman" w:eastAsia="Times New Roman" w:hAnsi="Times New Roman"/>
+          <w:sz w:val="28"/>
+          <w:szCs w:val="28"/>
+        </w:rPr>
         <w:t xml:space="preserve">Двійковий пошук ітеративний (найгірший випадок):</w:t>
       </w:r>
     </w:p>
-    <w:p>
-      <w:pPr>
-        <w:pBdr>
-          <w:left w:val="single" w:color="4472C4" w:sz="12" w:space="4"/>
-        </w:pBdr>
-        <w:shd w:fill="F2F2F2" w:color="auto" w:val="clear"/>
-        <w:spacing w:after="0" w:line="240" w:lineRule="auto"/>
-        <w:ind w:left="283"/>
-      </w:pPr>
-      <w:r>
-        <w:rPr>
-          <w:rFonts w:ascii="Courier New" w:cs="Courier New" w:eastAsia="Courier New" w:hAnsi="Courier New"/>
-          <w:sz w:val="18"/>
-          <w:szCs w:val="18"/>
-          <w:shd w:fill="F2F2F2" w:color="auto" w:val="clear"/>
-        </w:rPr>
-        <w:t xml:space="preserve">Рядок 1: low = 0, high = n-1             — вартість c1, виконується 1 раз</w:t>
-      </w:r>
-    </w:p>
-    <w:p>
-      <w:pPr>
-        <w:pBdr>
-          <w:left w:val="single" w:color="4472C4" w:sz="12" w:space="4"/>
-        </w:pBdr>
-        <w:shd w:fill="F2F2F2" w:color="auto" w:val="clear"/>
-        <w:spacing w:after="0" w:line="240" w:lineRule="auto"/>
-        <w:ind w:left="283"/>
-      </w:pPr>
-      <w:r>
-        <w:rPr>
-          <w:rFonts w:ascii="Courier New" w:cs="Courier New" w:eastAsia="Courier New" w:hAnsi="Courier New"/>
-          <w:sz w:val="18"/>
-          <w:szCs w:val="18"/>
-          <w:shd w:fill="F2F2F2" w:color="auto" w:val="clear"/>
-        </w:rPr>
-        <w:t xml:space="preserve">Рядок 2: while low &lt;= high                — вартість c2, виконується k + 1 разів</w:t>
-      </w:r>
-    </w:p>
-    <w:p>
-      <w:pPr>
-        <w:pBdr>
-          <w:left w:val="single" w:color="4472C4" w:sz="12" w:space="4"/>
-        </w:pBdr>
-        <w:shd w:fill="F2F2F2" w:color="auto" w:val="clear"/>
-        <w:spacing w:after="0" w:line="240" w:lineRule="auto"/>
-        <w:ind w:left="283"/>
-      </w:pPr>
-      <w:r>
-        <w:rPr>
-          <w:rFonts w:ascii="Courier New" w:cs="Courier New" w:eastAsia="Courier New" w:hAnsi="Courier New"/>
-          <w:sz w:val="18"/>
-          <w:szCs w:val="18"/>
-          <w:shd w:fill="F2F2F2" w:color="auto" w:val="clear"/>
-        </w:rPr>
-        <w:t xml:space="preserve">Рядок 3:     mid = floor((low+high)/2)    — вартість c3, виконується k разів</w:t>
-      </w:r>
-    </w:p>
-    <w:p>
-      <w:pPr>
-        <w:pBdr>
-          <w:left w:val="single" w:color="4472C4" w:sz="12" w:space="4"/>
-        </w:pBdr>
-        <w:shd w:fill="F2F2F2" w:color="auto" w:val="clear"/>
-        <w:spacing w:after="0" w:line="240" w:lineRule="auto"/>
-        <w:ind w:left="283"/>
-      </w:pPr>
-      <w:r>
-        <w:rPr>
-          <w:rFonts w:ascii="Courier New" w:cs="Courier New" w:eastAsia="Courier New" w:hAnsi="Courier New"/>
-          <w:sz w:val="18"/>
-          <w:szCs w:val="18"/>
-          <w:shd w:fill="F2F2F2" w:color="auto" w:val="clear"/>
-        </w:rPr>
-        <w:t xml:space="preserve">Рядок 4:     if arr[mid] == target         — вартість c4, виконується k разів</w:t>
-      </w:r>
-    </w:p>
-    <w:p>
-      <w:pPr>
-        <w:pBdr>
-          <w:left w:val="single" w:color="4472C4" w:sz="12" w:space="4"/>
-        </w:pBdr>
-        <w:shd w:fill="F2F2F2" w:color="auto" w:val="clear"/>
-        <w:spacing w:after="0" w:line="240" w:lineRule="auto"/>
-        <w:ind w:left="283"/>
-      </w:pPr>
-      <w:r>
-        <w:rPr>
-          <w:rFonts w:ascii="Courier New" w:cs="Courier New" w:eastAsia="Courier New" w:hAnsi="Courier New"/>
-          <w:sz w:val="18"/>
-          <w:szCs w:val="18"/>
-          <w:shd w:fill="F2F2F2" w:color="auto" w:val="clear"/>
-        </w:rPr>
-        <w:t xml:space="preserve">Рядок 5:     if arr[mid] &lt; target          — вартість c5, виконується k разів</w:t>
-      </w:r>
-    </w:p>
-    <w:p>
-      <w:pPr>
-        <w:pBdr>
-          <w:left w:val="single" w:color="4472C4" w:sz="12" w:space="4"/>
-        </w:pBdr>
-        <w:shd w:fill="F2F2F2" w:color="auto" w:val="clear"/>
-        <w:spacing w:after="0" w:line="240" w:lineRule="auto"/>
-        <w:ind w:left="283"/>
-      </w:pPr>
-      <w:r>
-        <w:rPr>
-          <w:rFonts w:ascii="Courier New" w:cs="Courier New" w:eastAsia="Courier New" w:hAnsi="Courier New"/>
-          <w:sz w:val="18"/>
-          <w:szCs w:val="18"/>
-          <w:shd w:fill="F2F2F2" w:color="auto" w:val="clear"/>
-        </w:rPr>
-        <w:t xml:space="preserve">Рядок 6:         low = mid+1 / high=mid-1  — вартість c6, виконується k разів</w:t>
-      </w:r>
-    </w:p>
-    <w:p>
-      <w:pPr>
-        <w:pBdr>
-          <w:left w:val="single" w:color="4472C4" w:sz="12" w:space="4"/>
-        </w:pBdr>
-        <w:shd w:fill="F2F2F2" w:color="auto" w:val="clear"/>
-        <w:spacing w:after="0" w:line="240" w:lineRule="auto"/>
-        <w:ind w:left="283"/>
-      </w:pPr>
-      <w:r>
-        <w:rPr>
-          <w:rFonts w:ascii="Courier New" w:cs="Courier New" w:eastAsia="Courier New" w:hAnsi="Courier New"/>
-          <w:sz w:val="18"/>
-          <w:szCs w:val="18"/>
-          <w:shd w:fill="F2F2F2" w:color="auto" w:val="clear"/>
-        </w:rPr>
-        <w:t xml:space="preserve">Рядок 7: return -1                         — вартість c7, виконується 1 раз</w:t>
-      </w:r>
-    </w:p>
+    <w:tbl>
+      <w:tblPr>
+        <w:tblW w:type="pct" w:w="100%"/>
+        <w:tblBorders>
+          <w:top w:val="single" w:color="000000" w:sz="1"/>
+          <w:left w:val="single" w:color="000000" w:sz="1"/>
+          <w:bottom w:val="single" w:color="000000" w:sz="1"/>
+          <w:right w:val="single" w:color="000000" w:sz="1"/>
+          <w:insideH w:val="single" w:color="000000" w:sz="1"/>
+          <w:insideV w:val="single" w:color="000000" w:sz="1"/>
+        </w:tblBorders>
+      </w:tblPr>
+      <w:tblGrid>
+        <w:gridCol w:w="100"/>
+        <w:gridCol w:w="100"/>
+        <w:gridCol w:w="100"/>
+        <w:gridCol w:w="100"/>
+      </w:tblGrid>
+      <w:tr>
+        <w:trPr>
+          <w:tblHeader/>
+        </w:trPr>
+        <w:tc>
+          <w:tcPr>
+            <w:shd w:fill="D9D9D9" w:val="clear"/>
+            <w:tcMar>
+              <w:top w:type="dxa" w:w="40"/>
+              <w:left w:type="dxa" w:w="80"/>
+              <w:bottom w:type="dxa" w:w="40"/>
+              <w:right w:type="dxa" w:w="80"/>
+            </w:tcMar>
+            <w:vAlign w:val="center"/>
+          </w:tcPr>
+          <w:p>
+            <w:pPr>
+              <w:spacing w:after="0" w:line="360" w:lineRule="auto"/>
+              <w:jc w:val="center"/>
+            </w:pPr>
+            <w:r>
+              <w:rPr>
+                <w:rFonts w:ascii="Times New Roman" w:cs="Times New Roman" w:eastAsia="Times New Roman" w:hAnsi="Times New Roman"/>
+                <w:b/>
+                <w:bCs/>
+                <w:sz w:val="28"/>
+                <w:szCs w:val="28"/>
+              </w:rPr>
+              <w:t xml:space="preserve">№</w:t>
+            </w:r>
+          </w:p>
+        </w:tc>
+        <w:tc>
+          <w:tcPr>
+            <w:shd w:fill="D9D9D9" w:val="clear"/>
+            <w:tcMar>
+              <w:top w:type="dxa" w:w="40"/>
+              <w:left w:type="dxa" w:w="80"/>
+              <w:bottom w:type="dxa" w:w="40"/>
+              <w:right w:type="dxa" w:w="80"/>
+            </w:tcMar>
+            <w:vAlign w:val="center"/>
+          </w:tcPr>
+          <w:p>
+            <w:pPr>
+              <w:spacing w:after="0" w:line="360" w:lineRule="auto"/>
+              <w:jc w:val="center"/>
+            </w:pPr>
+            <w:r>
+              <w:rPr>
+                <w:rFonts w:ascii="Times New Roman" w:cs="Times New Roman" w:eastAsia="Times New Roman" w:hAnsi="Times New Roman"/>
+                <w:b/>
+                <w:bCs/>
+                <w:sz w:val="28"/>
+                <w:szCs w:val="28"/>
+              </w:rPr>
+              <w:t xml:space="preserve">Код</w:t>
+            </w:r>
+          </w:p>
+        </w:tc>
+        <w:tc>
+          <w:tcPr>
+            <w:shd w:fill="D9D9D9" w:val="clear"/>
+            <w:tcMar>
+              <w:top w:type="dxa" w:w="40"/>
+              <w:left w:type="dxa" w:w="80"/>
+              <w:bottom w:type="dxa" w:w="40"/>
+              <w:right w:type="dxa" w:w="80"/>
+            </w:tcMar>
+            <w:vAlign w:val="center"/>
+          </w:tcPr>
+          <w:p>
+            <w:pPr>
+              <w:spacing w:after="0" w:line="360" w:lineRule="auto"/>
+              <w:jc w:val="center"/>
+            </w:pPr>
+            <w:r>
+              <w:rPr>
+                <w:rFonts w:ascii="Times New Roman" w:cs="Times New Roman" w:eastAsia="Times New Roman" w:hAnsi="Times New Roman"/>
+                <w:b/>
+                <w:bCs/>
+                <w:sz w:val="28"/>
+                <w:szCs w:val="28"/>
+              </w:rPr>
+              <w:t xml:space="preserve">Вартість</w:t>
+            </w:r>
+          </w:p>
+        </w:tc>
+        <w:tc>
+          <w:tcPr>
+            <w:shd w:fill="D9D9D9" w:val="clear"/>
+            <w:tcMar>
+              <w:top w:type="dxa" w:w="40"/>
+              <w:left w:type="dxa" w:w="80"/>
+              <w:bottom w:type="dxa" w:w="40"/>
+              <w:right w:type="dxa" w:w="80"/>
+            </w:tcMar>
+            <w:vAlign w:val="center"/>
+          </w:tcPr>
+          <w:p>
+            <w:pPr>
+              <w:spacing w:after="0" w:line="360" w:lineRule="auto"/>
+              <w:jc w:val="center"/>
+            </w:pPr>
+            <w:r>
+              <w:rPr>
+                <w:rFonts w:ascii="Times New Roman" w:cs="Times New Roman" w:eastAsia="Times New Roman" w:hAnsi="Times New Roman"/>
+                <w:b/>
+                <w:bCs/>
+                <w:sz w:val="28"/>
+                <w:szCs w:val="28"/>
+              </w:rPr>
+              <w:t xml:space="preserve">Кількість виконань</w:t>
+            </w:r>
+          </w:p>
+        </w:tc>
+      </w:tr>
+      <w:tr>
+        <w:tc>
+          <w:tcPr>
+            <w:tcMar>
+              <w:top w:type="dxa" w:w="40"/>
+              <w:left w:type="dxa" w:w="80"/>
+              <w:bottom w:type="dxa" w:w="40"/>
+              <w:right w:type="dxa" w:w="80"/>
+            </w:tcMar>
+            <w:vAlign w:val="center"/>
+          </w:tcPr>
+          <w:p>
+            <w:pPr>
+              <w:spacing w:after="0" w:line="360" w:lineRule="auto"/>
+              <w:jc w:val="center"/>
+            </w:pPr>
+            <w:r>
+              <w:rPr>
+                <w:rFonts w:ascii="Times New Roman" w:cs="Times New Roman" w:eastAsia="Times New Roman" w:hAnsi="Times New Roman"/>
+                <w:sz w:val="28"/>
+                <w:szCs w:val="28"/>
+              </w:rPr>
+              <w:t xml:space="preserve">1</w:t>
+            </w:r>
+          </w:p>
+        </w:tc>
+        <w:tc>
+          <w:tcPr>
+            <w:tcMar>
+              <w:top w:type="dxa" w:w="40"/>
+              <w:left w:type="dxa" w:w="80"/>
+              <w:bottom w:type="dxa" w:w="40"/>
+              <w:right w:type="dxa" w:w="80"/>
+            </w:tcMar>
+            <w:vAlign w:val="center"/>
+          </w:tcPr>
+          <w:p>
+            <w:pPr>
+              <w:spacing w:after="0" w:line="360" w:lineRule="auto"/>
+              <w:jc w:val="left"/>
+            </w:pPr>
+            <w:r>
+              <w:rPr>
+                <w:rFonts w:ascii="Times New Roman" w:cs="Times New Roman" w:eastAsia="Times New Roman" w:hAnsi="Times New Roman"/>
+                <w:sz w:val="28"/>
+                <w:szCs w:val="28"/>
+              </w:rPr>
+              <w:t xml:space="preserve">low = 0, high = n-1</w:t>
+            </w:r>
+          </w:p>
+        </w:tc>
+        <w:tc>
+          <w:tcPr>
+            <w:tcMar>
+              <w:top w:type="dxa" w:w="40"/>
+              <w:left w:type="dxa" w:w="80"/>
+              <w:bottom w:type="dxa" w:w="40"/>
+              <w:right w:type="dxa" w:w="80"/>
+            </w:tcMar>
+            <w:vAlign w:val="center"/>
+          </w:tcPr>
+          <w:p>
+            <w:pPr>
+              <w:spacing w:after="0" w:line="360" w:lineRule="auto"/>
+              <w:jc w:val="center"/>
+            </w:pPr>
+            <w:r>
+              <w:rPr>
+                <w:rFonts w:ascii="Times New Roman" w:cs="Times New Roman" w:eastAsia="Times New Roman" w:hAnsi="Times New Roman"/>
+                <w:sz w:val="28"/>
+                <w:szCs w:val="28"/>
+              </w:rPr>
+              <w:t xml:space="preserve">C1</w:t>
+            </w:r>
+          </w:p>
+        </w:tc>
+        <w:tc>
+          <w:tcPr>
+            <w:tcMar>
+              <w:top w:type="dxa" w:w="40"/>
+              <w:left w:type="dxa" w:w="80"/>
+              <w:bottom w:type="dxa" w:w="40"/>
+              <w:right w:type="dxa" w:w="80"/>
+            </w:tcMar>
+            <w:vAlign w:val="center"/>
+          </w:tcPr>
+          <w:p>
+            <w:pPr>
+              <w:spacing w:after="0" w:line="360" w:lineRule="auto"/>
+              <w:jc w:val="center"/>
+            </w:pPr>
+            <w:r>
+              <w:rPr>
+                <w:rFonts w:ascii="Times New Roman" w:cs="Times New Roman" w:eastAsia="Times New Roman" w:hAnsi="Times New Roman"/>
+                <w:sz w:val="28"/>
+                <w:szCs w:val="28"/>
+              </w:rPr>
+              <w:t xml:space="preserve">1</w:t>
+            </w:r>
+          </w:p>
+        </w:tc>
+      </w:tr>
+      <w:tr>
+        <w:tc>
+          <w:tcPr>
+            <w:tcMar>
+              <w:top w:type="dxa" w:w="40"/>
+              <w:left w:type="dxa" w:w="80"/>
+              <w:bottom w:type="dxa" w:w="40"/>
+              <w:right w:type="dxa" w:w="80"/>
+            </w:tcMar>
+            <w:vAlign w:val="center"/>
+          </w:tcPr>
+          <w:p>
+            <w:pPr>
+              <w:spacing w:after="0" w:line="360" w:lineRule="auto"/>
+              <w:jc w:val="center"/>
+            </w:pPr>
+            <w:r>
+              <w:rPr>
+                <w:rFonts w:ascii="Times New Roman" w:cs="Times New Roman" w:eastAsia="Times New Roman" w:hAnsi="Times New Roman"/>
+                <w:sz w:val="28"/>
+                <w:szCs w:val="28"/>
+              </w:rPr>
+              <w:t xml:space="preserve">2</w:t>
+            </w:r>
+          </w:p>
+        </w:tc>
+        <w:tc>
+          <w:tcPr>
+            <w:tcMar>
+              <w:top w:type="dxa" w:w="40"/>
+              <w:left w:type="dxa" w:w="80"/>
+              <w:bottom w:type="dxa" w:w="40"/>
+              <w:right w:type="dxa" w:w="80"/>
+            </w:tcMar>
+            <w:vAlign w:val="center"/>
+          </w:tcPr>
+          <w:p>
+            <w:pPr>
+              <w:spacing w:after="0" w:line="360" w:lineRule="auto"/>
+              <w:jc w:val="left"/>
+            </w:pPr>
+            <w:r>
+              <w:rPr>
+                <w:rFonts w:ascii="Times New Roman" w:cs="Times New Roman" w:eastAsia="Times New Roman" w:hAnsi="Times New Roman"/>
+                <w:sz w:val="28"/>
+                <w:szCs w:val="28"/>
+              </w:rPr>
+              <w:t xml:space="preserve">while low &lt;= high</w:t>
+            </w:r>
+          </w:p>
+        </w:tc>
+        <w:tc>
+          <w:tcPr>
+            <w:tcMar>
+              <w:top w:type="dxa" w:w="40"/>
+              <w:left w:type="dxa" w:w="80"/>
+              <w:bottom w:type="dxa" w:w="40"/>
+              <w:right w:type="dxa" w:w="80"/>
+            </w:tcMar>
+            <w:vAlign w:val="center"/>
+          </w:tcPr>
+          <w:p>
+            <w:pPr>
+              <w:spacing w:after="0" w:line="360" w:lineRule="auto"/>
+              <w:jc w:val="center"/>
+            </w:pPr>
+            <w:r>
+              <w:rPr>
+                <w:rFonts w:ascii="Times New Roman" w:cs="Times New Roman" w:eastAsia="Times New Roman" w:hAnsi="Times New Roman"/>
+                <w:sz w:val="28"/>
+                <w:szCs w:val="28"/>
+              </w:rPr>
+              <w:t xml:space="preserve">C2</w:t>
+            </w:r>
+          </w:p>
+        </w:tc>
+        <w:tc>
+          <w:tcPr>
+            <w:tcMar>
+              <w:top w:type="dxa" w:w="40"/>
+              <w:left w:type="dxa" w:w="80"/>
+              <w:bottom w:type="dxa" w:w="40"/>
+              <w:right w:type="dxa" w:w="80"/>
+            </w:tcMar>
+            <w:vAlign w:val="center"/>
+          </w:tcPr>
+          <w:p>
+            <w:pPr>
+              <w:spacing w:after="0" w:line="360" w:lineRule="auto"/>
+              <w:jc w:val="center"/>
+            </w:pPr>
+            <w:r>
+              <w:rPr>
+                <w:rFonts w:ascii="Times New Roman" w:cs="Times New Roman" w:eastAsia="Times New Roman" w:hAnsi="Times New Roman"/>
+                <w:sz w:val="28"/>
+                <w:szCs w:val="28"/>
+              </w:rPr>
+              <w:t xml:space="preserve">⌊log₂n⌋ + 1</w:t>
+            </w:r>
+          </w:p>
+        </w:tc>
+      </w:tr>
+      <w:tr>
+        <w:tc>
+          <w:tcPr>
+            <w:tcMar>
+              <w:top w:type="dxa" w:w="40"/>
+              <w:left w:type="dxa" w:w="80"/>
+              <w:bottom w:type="dxa" w:w="40"/>
+              <w:right w:type="dxa" w:w="80"/>
+            </w:tcMar>
+            <w:vAlign w:val="center"/>
+          </w:tcPr>
+          <w:p>
+            <w:pPr>
+              <w:spacing w:after="0" w:line="360" w:lineRule="auto"/>
+              <w:jc w:val="center"/>
+            </w:pPr>
+            <w:r>
+              <w:rPr>
+                <w:rFonts w:ascii="Times New Roman" w:cs="Times New Roman" w:eastAsia="Times New Roman" w:hAnsi="Times New Roman"/>
+                <w:sz w:val="28"/>
+                <w:szCs w:val="28"/>
+              </w:rPr>
+              <w:t xml:space="preserve">3</w:t>
+            </w:r>
+          </w:p>
+        </w:tc>
+        <w:tc>
+          <w:tcPr>
+            <w:tcMar>
+              <w:top w:type="dxa" w:w="40"/>
+              <w:left w:type="dxa" w:w="80"/>
+              <w:bottom w:type="dxa" w:w="40"/>
+              <w:right w:type="dxa" w:w="80"/>
+            </w:tcMar>
+            <w:vAlign w:val="center"/>
+          </w:tcPr>
+          <w:p>
+            <w:pPr>
+              <w:spacing w:after="0" w:line="360" w:lineRule="auto"/>
+              <w:jc w:val="left"/>
+            </w:pPr>
+            <w:r>
+              <w:rPr>
+                <w:rFonts w:ascii="Times New Roman" w:cs="Times New Roman" w:eastAsia="Times New Roman" w:hAnsi="Times New Roman"/>
+                <w:sz w:val="28"/>
+                <w:szCs w:val="28"/>
+              </w:rPr>
+              <w:t xml:space="preserve">mid = floor((low+high)/2)</w:t>
+            </w:r>
+          </w:p>
+        </w:tc>
+        <w:tc>
+          <w:tcPr>
+            <w:tcMar>
+              <w:top w:type="dxa" w:w="40"/>
+              <w:left w:type="dxa" w:w="80"/>
+              <w:bottom w:type="dxa" w:w="40"/>
+              <w:right w:type="dxa" w:w="80"/>
+            </w:tcMar>
+            <w:vAlign w:val="center"/>
+          </w:tcPr>
+          <w:p>
+            <w:pPr>
+              <w:spacing w:after="0" w:line="360" w:lineRule="auto"/>
+              <w:jc w:val="center"/>
+            </w:pPr>
+            <w:r>
+              <w:rPr>
+                <w:rFonts w:ascii="Times New Roman" w:cs="Times New Roman" w:eastAsia="Times New Roman" w:hAnsi="Times New Roman"/>
+                <w:sz w:val="28"/>
+                <w:szCs w:val="28"/>
+              </w:rPr>
+              <w:t xml:space="preserve">C3</w:t>
+            </w:r>
+          </w:p>
+        </w:tc>
+        <w:tc>
+          <w:tcPr>
+            <w:tcMar>
+              <w:top w:type="dxa" w:w="40"/>
+              <w:left w:type="dxa" w:w="80"/>
+              <w:bottom w:type="dxa" w:w="40"/>
+              <w:right w:type="dxa" w:w="80"/>
+            </w:tcMar>
+            <w:vAlign w:val="center"/>
+          </w:tcPr>
+          <w:p>
+            <w:pPr>
+              <w:spacing w:after="0" w:line="360" w:lineRule="auto"/>
+              <w:jc w:val="center"/>
+            </w:pPr>
+            <w:r>
+              <w:rPr>
+                <w:rFonts w:ascii="Times New Roman" w:cs="Times New Roman" w:eastAsia="Times New Roman" w:hAnsi="Times New Roman"/>
+                <w:sz w:val="28"/>
+                <w:szCs w:val="28"/>
+              </w:rPr>
+              <w:t xml:space="preserve">⌊log₂n⌋</w:t>
+            </w:r>
+          </w:p>
+        </w:tc>
+      </w:tr>
+      <w:tr>
+        <w:tc>
+          <w:tcPr>
+            <w:tcMar>
+              <w:top w:type="dxa" w:w="40"/>
+              <w:left w:type="dxa" w:w="80"/>
+              <w:bottom w:type="dxa" w:w="40"/>
+              <w:right w:type="dxa" w:w="80"/>
+            </w:tcMar>
+            <w:vAlign w:val="center"/>
+          </w:tcPr>
+          <w:p>
+            <w:pPr>
+              <w:spacing w:after="0" w:line="360" w:lineRule="auto"/>
+              <w:jc w:val="center"/>
+            </w:pPr>
+            <w:r>
+              <w:rPr>
+                <w:rFonts w:ascii="Times New Roman" w:cs="Times New Roman" w:eastAsia="Times New Roman" w:hAnsi="Times New Roman"/>
+                <w:sz w:val="28"/>
+                <w:szCs w:val="28"/>
+              </w:rPr>
+              <w:t xml:space="preserve">4</w:t>
+            </w:r>
+          </w:p>
+        </w:tc>
+        <w:tc>
+          <w:tcPr>
+            <w:tcMar>
+              <w:top w:type="dxa" w:w="40"/>
+              <w:left w:type="dxa" w:w="80"/>
+              <w:bottom w:type="dxa" w:w="40"/>
+              <w:right w:type="dxa" w:w="80"/>
+            </w:tcMar>
+            <w:vAlign w:val="center"/>
+          </w:tcPr>
+          <w:p>
+            <w:pPr>
+              <w:spacing w:after="0" w:line="360" w:lineRule="auto"/>
+              <w:jc w:val="left"/>
+            </w:pPr>
+            <w:r>
+              <w:rPr>
+                <w:rFonts w:ascii="Times New Roman" w:cs="Times New Roman" w:eastAsia="Times New Roman" w:hAnsi="Times New Roman"/>
+                <w:sz w:val="28"/>
+                <w:szCs w:val="28"/>
+              </w:rPr>
+              <w:t xml:space="preserve">if arr[mid] == target</w:t>
+            </w:r>
+          </w:p>
+        </w:tc>
+        <w:tc>
+          <w:tcPr>
+            <w:tcMar>
+              <w:top w:type="dxa" w:w="40"/>
+              <w:left w:type="dxa" w:w="80"/>
+              <w:bottom w:type="dxa" w:w="40"/>
+              <w:right w:type="dxa" w:w="80"/>
+            </w:tcMar>
+            <w:vAlign w:val="center"/>
+          </w:tcPr>
+          <w:p>
+            <w:pPr>
+              <w:spacing w:after="0" w:line="360" w:lineRule="auto"/>
+              <w:jc w:val="center"/>
+            </w:pPr>
+            <w:r>
+              <w:rPr>
+                <w:rFonts w:ascii="Times New Roman" w:cs="Times New Roman" w:eastAsia="Times New Roman" w:hAnsi="Times New Roman"/>
+                <w:sz w:val="28"/>
+                <w:szCs w:val="28"/>
+              </w:rPr>
+              <w:t xml:space="preserve">C4</w:t>
+            </w:r>
+          </w:p>
+        </w:tc>
+        <w:tc>
+          <w:tcPr>
+            <w:tcMar>
+              <w:top w:type="dxa" w:w="40"/>
+              <w:left w:type="dxa" w:w="80"/>
+              <w:bottom w:type="dxa" w:w="40"/>
+              <w:right w:type="dxa" w:w="80"/>
+            </w:tcMar>
+            <w:vAlign w:val="center"/>
+          </w:tcPr>
+          <w:p>
+            <w:pPr>
+              <w:spacing w:after="0" w:line="360" w:lineRule="auto"/>
+              <w:jc w:val="center"/>
+            </w:pPr>
+            <w:r>
+              <w:rPr>
+                <w:rFonts w:ascii="Times New Roman" w:cs="Times New Roman" w:eastAsia="Times New Roman" w:hAnsi="Times New Roman"/>
+                <w:sz w:val="28"/>
+                <w:szCs w:val="28"/>
+              </w:rPr>
+              <w:t xml:space="preserve">⌊log₂n⌋</w:t>
+            </w:r>
+          </w:p>
+        </w:tc>
+      </w:tr>
+      <w:tr>
+        <w:tc>
+          <w:tcPr>
+            <w:tcMar>
+              <w:top w:type="dxa" w:w="40"/>
+              <w:left w:type="dxa" w:w="80"/>
+              <w:bottom w:type="dxa" w:w="40"/>
+              <w:right w:type="dxa" w:w="80"/>
+            </w:tcMar>
+            <w:vAlign w:val="center"/>
+          </w:tcPr>
+          <w:p>
+            <w:pPr>
+              <w:spacing w:after="0" w:line="360" w:lineRule="auto"/>
+              <w:jc w:val="center"/>
+            </w:pPr>
+            <w:r>
+              <w:rPr>
+                <w:rFonts w:ascii="Times New Roman" w:cs="Times New Roman" w:eastAsia="Times New Roman" w:hAnsi="Times New Roman"/>
+                <w:sz w:val="28"/>
+                <w:szCs w:val="28"/>
+              </w:rPr>
+              <w:t xml:space="preserve">5</w:t>
+            </w:r>
+          </w:p>
+        </w:tc>
+        <w:tc>
+          <w:tcPr>
+            <w:tcMar>
+              <w:top w:type="dxa" w:w="40"/>
+              <w:left w:type="dxa" w:w="80"/>
+              <w:bottom w:type="dxa" w:w="40"/>
+              <w:right w:type="dxa" w:w="80"/>
+            </w:tcMar>
+            <w:vAlign w:val="center"/>
+          </w:tcPr>
+          <w:p>
+            <w:pPr>
+              <w:spacing w:after="0" w:line="360" w:lineRule="auto"/>
+              <w:jc w:val="left"/>
+            </w:pPr>
+            <w:r>
+              <w:rPr>
+                <w:rFonts w:ascii="Times New Roman" w:cs="Times New Roman" w:eastAsia="Times New Roman" w:hAnsi="Times New Roman"/>
+                <w:sz w:val="28"/>
+                <w:szCs w:val="28"/>
+              </w:rPr>
+              <w:t xml:space="preserve">if arr[mid] &lt; target</w:t>
+            </w:r>
+          </w:p>
+        </w:tc>
+        <w:tc>
+          <w:tcPr>
+            <w:tcMar>
+              <w:top w:type="dxa" w:w="40"/>
+              <w:left w:type="dxa" w:w="80"/>
+              <w:bottom w:type="dxa" w:w="40"/>
+              <w:right w:type="dxa" w:w="80"/>
+            </w:tcMar>
+            <w:vAlign w:val="center"/>
+          </w:tcPr>
+          <w:p>
+            <w:pPr>
+              <w:spacing w:after="0" w:line="360" w:lineRule="auto"/>
+              <w:jc w:val="center"/>
+            </w:pPr>
+            <w:r>
+              <w:rPr>
+                <w:rFonts w:ascii="Times New Roman" w:cs="Times New Roman" w:eastAsia="Times New Roman" w:hAnsi="Times New Roman"/>
+                <w:sz w:val="28"/>
+                <w:szCs w:val="28"/>
+              </w:rPr>
+              <w:t xml:space="preserve">C5</w:t>
+            </w:r>
+          </w:p>
+        </w:tc>
+        <w:tc>
+          <w:tcPr>
+            <w:tcMar>
+              <w:top w:type="dxa" w:w="40"/>
+              <w:left w:type="dxa" w:w="80"/>
+              <w:bottom w:type="dxa" w:w="40"/>
+              <w:right w:type="dxa" w:w="80"/>
+            </w:tcMar>
+            <w:vAlign w:val="center"/>
+          </w:tcPr>
+          <w:p>
+            <w:pPr>
+              <w:spacing w:after="0" w:line="360" w:lineRule="auto"/>
+              <w:jc w:val="center"/>
+            </w:pPr>
+            <w:r>
+              <w:rPr>
+                <w:rFonts w:ascii="Times New Roman" w:cs="Times New Roman" w:eastAsia="Times New Roman" w:hAnsi="Times New Roman"/>
+                <w:sz w:val="28"/>
+                <w:szCs w:val="28"/>
+              </w:rPr>
+              <w:t xml:space="preserve">⌊log₂n⌋</w:t>
+            </w:r>
+          </w:p>
+        </w:tc>
+      </w:tr>
+      <w:tr>
+        <w:tc>
+          <w:tcPr>
+            <w:tcMar>
+              <w:top w:type="dxa" w:w="40"/>
+              <w:left w:type="dxa" w:w="80"/>
+              <w:bottom w:type="dxa" w:w="40"/>
+              <w:right w:type="dxa" w:w="80"/>
+            </w:tcMar>
+            <w:vAlign w:val="center"/>
+          </w:tcPr>
+          <w:p>
+            <w:pPr>
+              <w:spacing w:after="0" w:line="360" w:lineRule="auto"/>
+              <w:jc w:val="center"/>
+            </w:pPr>
+            <w:r>
+              <w:rPr>
+                <w:rFonts w:ascii="Times New Roman" w:cs="Times New Roman" w:eastAsia="Times New Roman" w:hAnsi="Times New Roman"/>
+                <w:sz w:val="28"/>
+                <w:szCs w:val="28"/>
+              </w:rPr>
+              <w:t xml:space="preserve">6</w:t>
+            </w:r>
+          </w:p>
+        </w:tc>
+        <w:tc>
+          <w:tcPr>
+            <w:tcMar>
+              <w:top w:type="dxa" w:w="40"/>
+              <w:left w:type="dxa" w:w="80"/>
+              <w:bottom w:type="dxa" w:w="40"/>
+              <w:right w:type="dxa" w:w="80"/>
+            </w:tcMar>
+            <w:vAlign w:val="center"/>
+          </w:tcPr>
+          <w:p>
+            <w:pPr>
+              <w:spacing w:after="0" w:line="360" w:lineRule="auto"/>
+              <w:jc w:val="left"/>
+            </w:pPr>
+            <w:r>
+              <w:rPr>
+                <w:rFonts w:ascii="Times New Roman" w:cs="Times New Roman" w:eastAsia="Times New Roman" w:hAnsi="Times New Roman"/>
+                <w:sz w:val="28"/>
+                <w:szCs w:val="28"/>
+              </w:rPr>
+              <w:t xml:space="preserve">low = mid+1 / high = mid-1</w:t>
+            </w:r>
+          </w:p>
+        </w:tc>
+        <w:tc>
+          <w:tcPr>
+            <w:tcMar>
+              <w:top w:type="dxa" w:w="40"/>
+              <w:left w:type="dxa" w:w="80"/>
+              <w:bottom w:type="dxa" w:w="40"/>
+              <w:right w:type="dxa" w:w="80"/>
+            </w:tcMar>
+            <w:vAlign w:val="center"/>
+          </w:tcPr>
+          <w:p>
+            <w:pPr>
+              <w:spacing w:after="0" w:line="360" w:lineRule="auto"/>
+              <w:jc w:val="center"/>
+            </w:pPr>
+            <w:r>
+              <w:rPr>
+                <w:rFonts w:ascii="Times New Roman" w:cs="Times New Roman" w:eastAsia="Times New Roman" w:hAnsi="Times New Roman"/>
+                <w:sz w:val="28"/>
+                <w:szCs w:val="28"/>
+              </w:rPr>
+              <w:t xml:space="preserve">C6</w:t>
+            </w:r>
+          </w:p>
+        </w:tc>
+        <w:tc>
+          <w:tcPr>
+            <w:tcMar>
+              <w:top w:type="dxa" w:w="40"/>
+              <w:left w:type="dxa" w:w="80"/>
+              <w:bottom w:type="dxa" w:w="40"/>
+              <w:right w:type="dxa" w:w="80"/>
+            </w:tcMar>
+            <w:vAlign w:val="center"/>
+          </w:tcPr>
+          <w:p>
+            <w:pPr>
+              <w:spacing w:after="0" w:line="360" w:lineRule="auto"/>
+              <w:jc w:val="center"/>
+            </w:pPr>
+            <w:r>
+              <w:rPr>
+                <w:rFonts w:ascii="Times New Roman" w:cs="Times New Roman" w:eastAsia="Times New Roman" w:hAnsi="Times New Roman"/>
+                <w:sz w:val="28"/>
+                <w:szCs w:val="28"/>
+              </w:rPr>
+              <w:t xml:space="preserve">⌊log₂n⌋</w:t>
+            </w:r>
+          </w:p>
+        </w:tc>
+      </w:tr>
+      <w:tr>
+        <w:tc>
+          <w:tcPr>
+            <w:tcMar>
+              <w:top w:type="dxa" w:w="40"/>
+              <w:left w:type="dxa" w:w="80"/>
+              <w:bottom w:type="dxa" w:w="40"/>
+              <w:right w:type="dxa" w:w="80"/>
+            </w:tcMar>
+            <w:vAlign w:val="center"/>
+          </w:tcPr>
+          <w:p>
+            <w:pPr>
+              <w:spacing w:after="0" w:line="360" w:lineRule="auto"/>
+              <w:jc w:val="center"/>
+            </w:pPr>
+            <w:r>
+              <w:rPr>
+                <w:rFonts w:ascii="Times New Roman" w:cs="Times New Roman" w:eastAsia="Times New Roman" w:hAnsi="Times New Roman"/>
+                <w:sz w:val="28"/>
+                <w:szCs w:val="28"/>
+              </w:rPr>
+              <w:t xml:space="preserve">7</w:t>
+            </w:r>
+          </w:p>
+        </w:tc>
+        <w:tc>
+          <w:tcPr>
+            <w:tcMar>
+              <w:top w:type="dxa" w:w="40"/>
+              <w:left w:type="dxa" w:w="80"/>
+              <w:bottom w:type="dxa" w:w="40"/>
+              <w:right w:type="dxa" w:w="80"/>
+            </w:tcMar>
+            <w:vAlign w:val="center"/>
+          </w:tcPr>
+          <w:p>
+            <w:pPr>
+              <w:spacing w:after="0" w:line="360" w:lineRule="auto"/>
+              <w:jc w:val="left"/>
+            </w:pPr>
+            <w:r>
+              <w:rPr>
+                <w:rFonts w:ascii="Times New Roman" w:cs="Times New Roman" w:eastAsia="Times New Roman" w:hAnsi="Times New Roman"/>
+                <w:sz w:val="28"/>
+                <w:szCs w:val="28"/>
+              </w:rPr>
+              <w:t xml:space="preserve">return -1</w:t>
+            </w:r>
+          </w:p>
+        </w:tc>
+        <w:tc>
+          <w:tcPr>
+            <w:tcMar>
+              <w:top w:type="dxa" w:w="40"/>
+              <w:left w:type="dxa" w:w="80"/>
+              <w:bottom w:type="dxa" w:w="40"/>
+              <w:right w:type="dxa" w:w="80"/>
+            </w:tcMar>
+            <w:vAlign w:val="center"/>
+          </w:tcPr>
+          <w:p>
+            <w:pPr>
+              <w:spacing w:after="0" w:line="360" w:lineRule="auto"/>
+              <w:jc w:val="center"/>
+            </w:pPr>
+            <w:r>
+              <w:rPr>
+                <w:rFonts w:ascii="Times New Roman" w:cs="Times New Roman" w:eastAsia="Times New Roman" w:hAnsi="Times New Roman"/>
+                <w:sz w:val="28"/>
+                <w:szCs w:val="28"/>
+              </w:rPr>
+              <w:t xml:space="preserve">C7</w:t>
+            </w:r>
+          </w:p>
+        </w:tc>
+        <w:tc>
+          <w:tcPr>
+            <w:tcMar>
+              <w:top w:type="dxa" w:w="40"/>
+              <w:left w:type="dxa" w:w="80"/>
+              <w:bottom w:type="dxa" w:w="40"/>
+              <w:right w:type="dxa" w:w="80"/>
+            </w:tcMar>
+            <w:vAlign w:val="center"/>
+          </w:tcPr>
+          <w:p>
+            <w:pPr>
+              <w:spacing w:after="0" w:line="360" w:lineRule="auto"/>
+              <w:jc w:val="center"/>
+            </w:pPr>
+            <w:r>
+              <w:rPr>
+                <w:rFonts w:ascii="Times New Roman" w:cs="Times New Roman" w:eastAsia="Times New Roman" w:hAnsi="Times New Roman"/>
+                <w:sz w:val="28"/>
+                <w:szCs w:val="28"/>
+              </w:rPr>
+              <w:t xml:space="preserve">1</w:t>
+            </w:r>
+          </w:p>
+        </w:tc>
+      </w:tr>
+    </w:tbl>
     <w:p>
       <w:pPr>
         <w:spacing w:after="0" w:before="0" w:line="360" w:lineRule="auto"/>
@@ -1658,6 +2877,21 @@
     </w:p>
     <w:p>
       <w:pPr>
+        <w:spacing w:after="0" w:before="0" w:line="360" w:lineRule="auto"/>
+        <w:ind w:firstLine="709"/>
+        <w:jc w:val="both"/>
+      </w:pPr>
+      <w:r>
+        <w:rPr>
+          <w:rFonts w:ascii="Times New Roman" w:cs="Times New Roman" w:eastAsia="Times New Roman" w:hAnsi="Times New Roman"/>
+          <w:sz w:val="28"/>
+          <w:szCs w:val="28"/>
+        </w:rPr>
+        <w:t xml:space="preserve">Домінуючий член — log₂n. Відкидаємо константи та менші порядки.</w:t>
+      </w:r>
+    </w:p>
+    <w:p>
+      <w:pPr>
         <w:pStyle w:val="Heading2"/>
         <w:keepNext/>
         <w:spacing w:after="60" w:before="120" w:line="360" w:lineRule="auto"/>
@@ -2125,7 +3359,7 @@
                 <w:sz w:val="28"/>
                 <w:szCs w:val="28"/>
               </w:rPr>
-              <w:t xml:space="preserve">0.0007</w:t>
+              <w:t xml:space="preserve">0.0008</w:t>
             </w:r>
           </w:p>
         </w:tc>
@@ -2150,7 +3384,7 @@
                 <w:sz w:val="28"/>
                 <w:szCs w:val="28"/>
               </w:rPr>
-              <w:t xml:space="preserve">0.0000</w:t>
+              <w:t xml:space="preserve">0.0001</w:t>
             </w:r>
           </w:p>
         </w:tc>
@@ -2227,7 +3461,7 @@
                 <w:sz w:val="28"/>
                 <w:szCs w:val="28"/>
               </w:rPr>
-              <w:t xml:space="preserve">0.0059</w:t>
+              <w:t xml:space="preserve">0.0062</w:t>
             </w:r>
           </w:p>
         </w:tc>
@@ -2329,7 +3563,7 @@
                 <w:sz w:val="28"/>
                 <w:szCs w:val="28"/>
               </w:rPr>
-              <w:t xml:space="preserve">0.0584</w:t>
+              <w:t xml:space="preserve">0.0593</w:t>
             </w:r>
           </w:p>
         </w:tc>
@@ -2379,7 +3613,7 @@
                 <w:sz w:val="28"/>
                 <w:szCs w:val="28"/>
               </w:rPr>
-              <w:t xml:space="preserve">0.0001</w:t>
+              <w:t xml:space="preserve">0.0002</w:t>
             </w:r>
           </w:p>
         </w:tc>
@@ -2431,7 +3665,7 @@
                 <w:sz w:val="28"/>
                 <w:szCs w:val="28"/>
               </w:rPr>
-              <w:t xml:space="preserve">0.5852</w:t>
+              <w:t xml:space="preserve">0.5866</w:t>
             </w:r>
           </w:p>
         </w:tc>
@@ -2533,7 +3767,7 @@
                 <w:sz w:val="28"/>
                 <w:szCs w:val="28"/>
               </w:rPr>
-              <w:t xml:space="preserve">5.8728</w:t>
+              <w:t xml:space="preserve">5.9819</w:t>
             </w:r>
           </w:p>
         </w:tc>

</xml_diff>

<commit_message>
style: complexity analysis as tables matching instructor format
</commit_message>
<xml_diff>
--- a/reports/lr1/Звіт_ЛР1_Коновалов_ПЗПІ-25-6.docx
+++ b/reports/lr1/Звіт_ЛР1_Коновалов_ПЗПІ-25-6.docx
@@ -3359,7 +3359,7 @@
                 <w:sz w:val="28"/>
                 <w:szCs w:val="28"/>
               </w:rPr>
-              <w:t xml:space="preserve">0.0008</w:t>
+              <w:t xml:space="preserve">0.0006</w:t>
             </w:r>
           </w:p>
         </w:tc>
@@ -3384,7 +3384,7 @@
                 <w:sz w:val="28"/>
                 <w:szCs w:val="28"/>
               </w:rPr>
-              <w:t xml:space="preserve">0.0001</w:t>
+              <w:t xml:space="preserve">0.0000</w:t>
             </w:r>
           </w:p>
         </w:tc>
@@ -3461,7 +3461,7 @@
                 <w:sz w:val="28"/>
                 <w:szCs w:val="28"/>
               </w:rPr>
-              <w:t xml:space="preserve">0.0062</w:t>
+              <w:t xml:space="preserve">0.0063</w:t>
             </w:r>
           </w:p>
         </w:tc>
@@ -3563,7 +3563,7 @@
                 <w:sz w:val="28"/>
                 <w:szCs w:val="28"/>
               </w:rPr>
-              <w:t xml:space="preserve">0.0593</w:t>
+              <w:t xml:space="preserve">0.0594</w:t>
             </w:r>
           </w:p>
         </w:tc>
@@ -3613,7 +3613,7 @@
                 <w:sz w:val="28"/>
                 <w:szCs w:val="28"/>
               </w:rPr>
-              <w:t xml:space="preserve">0.0002</w:t>
+              <w:t xml:space="preserve">0.0001</w:t>
             </w:r>
           </w:p>
         </w:tc>
@@ -3665,7 +3665,7 @@
                 <w:sz w:val="28"/>
                 <w:szCs w:val="28"/>
               </w:rPr>
-              <w:t xml:space="preserve">0.5866</w:t>
+              <w:t xml:space="preserve">0.6412</w:t>
             </w:r>
           </w:p>
         </w:tc>
@@ -3767,7 +3767,7 @@
                 <w:sz w:val="28"/>
                 <w:szCs w:val="28"/>
               </w:rPr>
-              <w:t xml:space="preserve">5.9819</w:t>
+              <w:t xml:space="preserve">6.0001</w:t>
             </w:r>
           </w:p>
         </w:tc>

</xml_diff>